<commit_message>
Document the SWI-Prolog check in the report, README and viva notes
</commit_message>
<xml_diff>
--- a/docs/report/Smart_Parking_KRR_CCP_Report.docx
+++ b/docs/report/Smart_Parking_KRR_CCP_Report.docx
@@ -1198,7 +1198,7 @@
       <w:pPr>
         <w:pStyle w:val="Heading1"/>
       </w:pPr>
-      <w:bookmarkStart w:id="0" w:name="_Toc242027315"/>
+      <w:bookmarkStart w:id="0" w:name="_Toc242028211"/>
       <w:r>
         <w:lastRenderedPageBreak/>
         <w:t>Acknowledgements</w:t>
@@ -1214,7 +1214,7 @@
       <w:pPr>
         <w:pStyle w:val="Heading1"/>
       </w:pPr>
-      <w:bookmarkStart w:id="1" w:name="_Toc242027316"/>
+      <w:bookmarkStart w:id="1" w:name="_Toc242028212"/>
       <w:r>
         <w:t>Executive summary</w:t>
       </w:r>
@@ -1240,14 +1240,14 @@
     </w:p>
     <w:p>
       <w:r>
-        <w:t>Twelve test cases cover valid and expired permits, visitors without passes, occupied and reserved bays, wrong zones, vehicles that do not fit, accessible bays, conflicting requests, double bookings, closing hours and bad data. Both engines give the expected answer in all 49 goal checks, and they derive exactly the same facts in every scenario. The 68 unit tests pass. The system has a command-line interface, a Streamlit web interface and a generated SWI-Prolog version of the same knowledge base.</w:t>
+        <w:t>Twelve test cases cover valid and expired permits, visitors without passes, occupied and reserved bays, wrong zones, vehicles that do not fit, accessible bays, conflicting requests, double bookings, closing hours and bad data. Both engines give the expected answer in all 49 goal checks, and they derive exactly the same facts in every scenario. The 70 unit tests pass. The system has a command-line interface, a Streamlit web interface and a generated SWI-Prolog version of the same knowledge base.</w:t>
       </w:r>
     </w:p>
     <w:p>
       <w:pPr>
         <w:pStyle w:val="Heading1"/>
       </w:pPr>
-      <w:bookmarkStart w:id="2" w:name="_Toc242027317"/>
+      <w:bookmarkStart w:id="2" w:name="_Toc242028213"/>
       <w:r>
         <w:t>Table of contents</w:t>
       </w:r>
@@ -1291,7 +1291,7 @@
       <w:r>
         <w:fldChar w:fldCharType="separate"/>
       </w:r>
-      <w:hyperlink w:anchor="_Toc242027315" w:history="1">
+      <w:hyperlink w:anchor="_Toc242028211" w:history="1">
         <w:r>
           <w:rPr>
             <w:rStyle w:val="Hyperlink"/>
@@ -1318,7 +1318,7 @@
             <w:noProof/>
             <w:webHidden/>
           </w:rPr>
-          <w:instrText xml:space="preserve"> PAGEREF _Toc242027315 \h </w:instrText>
+          <w:instrText xml:space="preserve"> PAGEREF _Toc242028211 \h </w:instrText>
         </w:r>
         <w:r>
           <w:rPr>
@@ -1365,7 +1365,7 @@
           <w14:ligatures w14:val="standardContextual"/>
         </w:rPr>
       </w:pPr>
-      <w:hyperlink w:anchor="_Toc242027316" w:history="1">
+      <w:hyperlink w:anchor="_Toc242028212" w:history="1">
         <w:r>
           <w:rPr>
             <w:rStyle w:val="Hyperlink"/>
@@ -1392,7 +1392,7 @@
             <w:noProof/>
             <w:webHidden/>
           </w:rPr>
-          <w:instrText xml:space="preserve"> PAGEREF _Toc242027316 \h </w:instrText>
+          <w:instrText xml:space="preserve"> PAGEREF _Toc242028212 \h </w:instrText>
         </w:r>
         <w:r>
           <w:rPr>
@@ -1439,7 +1439,7 @@
           <w14:ligatures w14:val="standardContextual"/>
         </w:rPr>
       </w:pPr>
-      <w:hyperlink w:anchor="_Toc242027317" w:history="1">
+      <w:hyperlink w:anchor="_Toc242028213" w:history="1">
         <w:r>
           <w:rPr>
             <w:rStyle w:val="Hyperlink"/>
@@ -1466,7 +1466,7 @@
             <w:noProof/>
             <w:webHidden/>
           </w:rPr>
-          <w:instrText xml:space="preserve"> PAGEREF _Toc242027317 \h </w:instrText>
+          <w:instrText xml:space="preserve"> PAGEREF _Toc242028213 \h </w:instrText>
         </w:r>
         <w:r>
           <w:rPr>
@@ -1513,7 +1513,7 @@
           <w14:ligatures w14:val="standardContextual"/>
         </w:rPr>
       </w:pPr>
-      <w:hyperlink w:anchor="_Toc242027318" w:history="1">
+      <w:hyperlink w:anchor="_Toc242028214" w:history="1">
         <w:r>
           <w:rPr>
             <w:rStyle w:val="Hyperlink"/>
@@ -1540,7 +1540,7 @@
             <w:noProof/>
             <w:webHidden/>
           </w:rPr>
-          <w:instrText xml:space="preserve"> PAGEREF _Toc242027318 \h </w:instrText>
+          <w:instrText xml:space="preserve"> PAGEREF _Toc242028214 \h </w:instrText>
         </w:r>
         <w:r>
           <w:rPr>
@@ -1587,7 +1587,7 @@
           <w14:ligatures w14:val="standardContextual"/>
         </w:rPr>
       </w:pPr>
-      <w:hyperlink w:anchor="_Toc242027319" w:history="1">
+      <w:hyperlink w:anchor="_Toc242028215" w:history="1">
         <w:r>
           <w:rPr>
             <w:rStyle w:val="Hyperlink"/>
@@ -1614,7 +1614,7 @@
             <w:noProof/>
             <w:webHidden/>
           </w:rPr>
-          <w:instrText xml:space="preserve"> PAGEREF _Toc242027319 \h </w:instrText>
+          <w:instrText xml:space="preserve"> PAGEREF _Toc242028215 \h </w:instrText>
         </w:r>
         <w:r>
           <w:rPr>
@@ -1661,7 +1661,7 @@
           <w14:ligatures w14:val="standardContextual"/>
         </w:rPr>
       </w:pPr>
-      <w:hyperlink w:anchor="_Toc242027320" w:history="1">
+      <w:hyperlink w:anchor="_Toc242028216" w:history="1">
         <w:r>
           <w:rPr>
             <w:rStyle w:val="Hyperlink"/>
@@ -1688,7 +1688,7 @@
             <w:noProof/>
             <w:webHidden/>
           </w:rPr>
-          <w:instrText xml:space="preserve"> PAGEREF _Toc242027320 \h </w:instrText>
+          <w:instrText xml:space="preserve"> PAGEREF _Toc242028216 \h </w:instrText>
         </w:r>
         <w:r>
           <w:rPr>
@@ -1735,7 +1735,7 @@
           <w14:ligatures w14:val="standardContextual"/>
         </w:rPr>
       </w:pPr>
-      <w:hyperlink w:anchor="_Toc242027321" w:history="1">
+      <w:hyperlink w:anchor="_Toc242028217" w:history="1">
         <w:r>
           <w:rPr>
             <w:rStyle w:val="Hyperlink"/>
@@ -1762,7 +1762,7 @@
             <w:noProof/>
             <w:webHidden/>
           </w:rPr>
-          <w:instrText xml:space="preserve"> PAGEREF _Toc242027321 \h </w:instrText>
+          <w:instrText xml:space="preserve"> PAGEREF _Toc242028217 \h </w:instrText>
         </w:r>
         <w:r>
           <w:rPr>
@@ -1809,7 +1809,7 @@
           <w14:ligatures w14:val="standardContextual"/>
         </w:rPr>
       </w:pPr>
-      <w:hyperlink w:anchor="_Toc242027322" w:history="1">
+      <w:hyperlink w:anchor="_Toc242028218" w:history="1">
         <w:r>
           <w:rPr>
             <w:rStyle w:val="Hyperlink"/>
@@ -1836,7 +1836,7 @@
             <w:noProof/>
             <w:webHidden/>
           </w:rPr>
-          <w:instrText xml:space="preserve"> PAGEREF _Toc242027322 \h </w:instrText>
+          <w:instrText xml:space="preserve"> PAGEREF _Toc242028218 \h </w:instrText>
         </w:r>
         <w:r>
           <w:rPr>
@@ -1883,7 +1883,7 @@
           <w14:ligatures w14:val="standardContextual"/>
         </w:rPr>
       </w:pPr>
-      <w:hyperlink w:anchor="_Toc242027323" w:history="1">
+      <w:hyperlink w:anchor="_Toc242028219" w:history="1">
         <w:r>
           <w:rPr>
             <w:rStyle w:val="Hyperlink"/>
@@ -1910,7 +1910,7 @@
             <w:noProof/>
             <w:webHidden/>
           </w:rPr>
-          <w:instrText xml:space="preserve"> PAGEREF _Toc242027323 \h </w:instrText>
+          <w:instrText xml:space="preserve"> PAGEREF _Toc242028219 \h </w:instrText>
         </w:r>
         <w:r>
           <w:rPr>
@@ -1957,7 +1957,7 @@
           <w14:ligatures w14:val="standardContextual"/>
         </w:rPr>
       </w:pPr>
-      <w:hyperlink w:anchor="_Toc242027324" w:history="1">
+      <w:hyperlink w:anchor="_Toc242028220" w:history="1">
         <w:r>
           <w:rPr>
             <w:rStyle w:val="Hyperlink"/>
@@ -1984,7 +1984,7 @@
             <w:noProof/>
             <w:webHidden/>
           </w:rPr>
-          <w:instrText xml:space="preserve"> PAGEREF _Toc242027324 \h </w:instrText>
+          <w:instrText xml:space="preserve"> PAGEREF _Toc242028220 \h </w:instrText>
         </w:r>
         <w:r>
           <w:rPr>
@@ -2031,7 +2031,7 @@
           <w14:ligatures w14:val="standardContextual"/>
         </w:rPr>
       </w:pPr>
-      <w:hyperlink w:anchor="_Toc242027325" w:history="1">
+      <w:hyperlink w:anchor="_Toc242028221" w:history="1">
         <w:r>
           <w:rPr>
             <w:rStyle w:val="Hyperlink"/>
@@ -2058,7 +2058,7 @@
             <w:noProof/>
             <w:webHidden/>
           </w:rPr>
-          <w:instrText xml:space="preserve"> PAGEREF _Toc242027325 \h </w:instrText>
+          <w:instrText xml:space="preserve"> PAGEREF _Toc242028221 \h </w:instrText>
         </w:r>
         <w:r>
           <w:rPr>
@@ -2105,7 +2105,7 @@
           <w14:ligatures w14:val="standardContextual"/>
         </w:rPr>
       </w:pPr>
-      <w:hyperlink w:anchor="_Toc242027326" w:history="1">
+      <w:hyperlink w:anchor="_Toc242028222" w:history="1">
         <w:r>
           <w:rPr>
             <w:rStyle w:val="Hyperlink"/>
@@ -2132,7 +2132,7 @@
             <w:noProof/>
             <w:webHidden/>
           </w:rPr>
-          <w:instrText xml:space="preserve"> PAGEREF _Toc242027326 \h </w:instrText>
+          <w:instrText xml:space="preserve"> PAGEREF _Toc242028222 \h </w:instrText>
         </w:r>
         <w:r>
           <w:rPr>
@@ -2179,7 +2179,7 @@
           <w14:ligatures w14:val="standardContextual"/>
         </w:rPr>
       </w:pPr>
-      <w:hyperlink w:anchor="_Toc242027327" w:history="1">
+      <w:hyperlink w:anchor="_Toc242028223" w:history="1">
         <w:r>
           <w:rPr>
             <w:rStyle w:val="Hyperlink"/>
@@ -2206,7 +2206,7 @@
             <w:noProof/>
             <w:webHidden/>
           </w:rPr>
-          <w:instrText xml:space="preserve"> PAGEREF _Toc242027327 \h </w:instrText>
+          <w:instrText xml:space="preserve"> PAGEREF _Toc242028223 \h </w:instrText>
         </w:r>
         <w:r>
           <w:rPr>
@@ -2253,7 +2253,7 @@
           <w14:ligatures w14:val="standardContextual"/>
         </w:rPr>
       </w:pPr>
-      <w:hyperlink w:anchor="_Toc242027328" w:history="1">
+      <w:hyperlink w:anchor="_Toc242028224" w:history="1">
         <w:r>
           <w:rPr>
             <w:rStyle w:val="Hyperlink"/>
@@ -2280,7 +2280,7 @@
             <w:noProof/>
             <w:webHidden/>
           </w:rPr>
-          <w:instrText xml:space="preserve"> PAGEREF _Toc242027328 \h </w:instrText>
+          <w:instrText xml:space="preserve"> PAGEREF _Toc242028224 \h </w:instrText>
         </w:r>
         <w:r>
           <w:rPr>
@@ -2327,7 +2327,7 @@
           <w14:ligatures w14:val="standardContextual"/>
         </w:rPr>
       </w:pPr>
-      <w:hyperlink w:anchor="_Toc242027329" w:history="1">
+      <w:hyperlink w:anchor="_Toc242028225" w:history="1">
         <w:r>
           <w:rPr>
             <w:rStyle w:val="Hyperlink"/>
@@ -2354,7 +2354,7 @@
             <w:noProof/>
             <w:webHidden/>
           </w:rPr>
-          <w:instrText xml:space="preserve"> PAGEREF _Toc242027329 \h </w:instrText>
+          <w:instrText xml:space="preserve"> PAGEREF _Toc242028225 \h </w:instrText>
         </w:r>
         <w:r>
           <w:rPr>
@@ -2401,7 +2401,7 @@
           <w14:ligatures w14:val="standardContextual"/>
         </w:rPr>
       </w:pPr>
-      <w:hyperlink w:anchor="_Toc242027330" w:history="1">
+      <w:hyperlink w:anchor="_Toc242028226" w:history="1">
         <w:r>
           <w:rPr>
             <w:rStyle w:val="Hyperlink"/>
@@ -2428,7 +2428,7 @@
             <w:noProof/>
             <w:webHidden/>
           </w:rPr>
-          <w:instrText xml:space="preserve"> PAGEREF _Toc242027330 \h </w:instrText>
+          <w:instrText xml:space="preserve"> PAGEREF _Toc242028226 \h </w:instrText>
         </w:r>
         <w:r>
           <w:rPr>
@@ -2475,7 +2475,7 @@
           <w14:ligatures w14:val="standardContextual"/>
         </w:rPr>
       </w:pPr>
-      <w:hyperlink w:anchor="_Toc242027331" w:history="1">
+      <w:hyperlink w:anchor="_Toc242028227" w:history="1">
         <w:r>
           <w:rPr>
             <w:rStyle w:val="Hyperlink"/>
@@ -2502,7 +2502,7 @@
             <w:noProof/>
             <w:webHidden/>
           </w:rPr>
-          <w:instrText xml:space="preserve"> PAGEREF _Toc242027331 \h </w:instrText>
+          <w:instrText xml:space="preserve"> PAGEREF _Toc242028227 \h </w:instrText>
         </w:r>
         <w:r>
           <w:rPr>
@@ -2549,7 +2549,7 @@
           <w14:ligatures w14:val="standardContextual"/>
         </w:rPr>
       </w:pPr>
-      <w:hyperlink w:anchor="_Toc242027332" w:history="1">
+      <w:hyperlink w:anchor="_Toc242028228" w:history="1">
         <w:r>
           <w:rPr>
             <w:rStyle w:val="Hyperlink"/>
@@ -2576,7 +2576,7 @@
             <w:noProof/>
             <w:webHidden/>
           </w:rPr>
-          <w:instrText xml:space="preserve"> PAGEREF _Toc242027332 \h </w:instrText>
+          <w:instrText xml:space="preserve"> PAGEREF _Toc242028228 \h </w:instrText>
         </w:r>
         <w:r>
           <w:rPr>
@@ -2623,7 +2623,7 @@
           <w14:ligatures w14:val="standardContextual"/>
         </w:rPr>
       </w:pPr>
-      <w:hyperlink w:anchor="_Toc242027333" w:history="1">
+      <w:hyperlink w:anchor="_Toc242028229" w:history="1">
         <w:r>
           <w:rPr>
             <w:rStyle w:val="Hyperlink"/>
@@ -2650,7 +2650,7 @@
             <w:noProof/>
             <w:webHidden/>
           </w:rPr>
-          <w:instrText xml:space="preserve"> PAGEREF _Toc242027333 \h </w:instrText>
+          <w:instrText xml:space="preserve"> PAGEREF _Toc242028229 \h </w:instrText>
         </w:r>
         <w:r>
           <w:rPr>
@@ -2697,7 +2697,7 @@
           <w14:ligatures w14:val="standardContextual"/>
         </w:rPr>
       </w:pPr>
-      <w:hyperlink w:anchor="_Toc242027334" w:history="1">
+      <w:hyperlink w:anchor="_Toc242028230" w:history="1">
         <w:r>
           <w:rPr>
             <w:rStyle w:val="Hyperlink"/>
@@ -2724,7 +2724,7 @@
             <w:noProof/>
             <w:webHidden/>
           </w:rPr>
-          <w:instrText xml:space="preserve"> PAGEREF _Toc242027334 \h </w:instrText>
+          <w:instrText xml:space="preserve"> PAGEREF _Toc242028230 \h </w:instrText>
         </w:r>
         <w:r>
           <w:rPr>
@@ -2771,7 +2771,7 @@
           <w14:ligatures w14:val="standardContextual"/>
         </w:rPr>
       </w:pPr>
-      <w:hyperlink w:anchor="_Toc242027335" w:history="1">
+      <w:hyperlink w:anchor="_Toc242028231" w:history="1">
         <w:r>
           <w:rPr>
             <w:rStyle w:val="Hyperlink"/>
@@ -2798,7 +2798,7 @@
             <w:noProof/>
             <w:webHidden/>
           </w:rPr>
-          <w:instrText xml:space="preserve"> PAGEREF _Toc242027335 \h </w:instrText>
+          <w:instrText xml:space="preserve"> PAGEREF _Toc242028231 \h </w:instrText>
         </w:r>
         <w:r>
           <w:rPr>
@@ -2845,7 +2845,7 @@
           <w14:ligatures w14:val="standardContextual"/>
         </w:rPr>
       </w:pPr>
-      <w:hyperlink w:anchor="_Toc242027336" w:history="1">
+      <w:hyperlink w:anchor="_Toc242028232" w:history="1">
         <w:r>
           <w:rPr>
             <w:rStyle w:val="Hyperlink"/>
@@ -2872,7 +2872,7 @@
             <w:noProof/>
             <w:webHidden/>
           </w:rPr>
-          <w:instrText xml:space="preserve"> PAGEREF _Toc242027336 \h </w:instrText>
+          <w:instrText xml:space="preserve"> PAGEREF _Toc242028232 \h </w:instrText>
         </w:r>
         <w:r>
           <w:rPr>
@@ -2919,7 +2919,7 @@
           <w14:ligatures w14:val="standardContextual"/>
         </w:rPr>
       </w:pPr>
-      <w:hyperlink w:anchor="_Toc242027337" w:history="1">
+      <w:hyperlink w:anchor="_Toc242028233" w:history="1">
         <w:r>
           <w:rPr>
             <w:rStyle w:val="Hyperlink"/>
@@ -2946,7 +2946,7 @@
             <w:noProof/>
             <w:webHidden/>
           </w:rPr>
-          <w:instrText xml:space="preserve"> PAGEREF _Toc242027337 \h </w:instrText>
+          <w:instrText xml:space="preserve"> PAGEREF _Toc242028233 \h </w:instrText>
         </w:r>
         <w:r>
           <w:rPr>
@@ -2993,7 +2993,7 @@
           <w14:ligatures w14:val="standardContextual"/>
         </w:rPr>
       </w:pPr>
-      <w:hyperlink w:anchor="_Toc242027338" w:history="1">
+      <w:hyperlink w:anchor="_Toc242028234" w:history="1">
         <w:r>
           <w:rPr>
             <w:rStyle w:val="Hyperlink"/>
@@ -3020,7 +3020,7 @@
             <w:noProof/>
             <w:webHidden/>
           </w:rPr>
-          <w:instrText xml:space="preserve"> PAGEREF _Toc242027338 \h </w:instrText>
+          <w:instrText xml:space="preserve"> PAGEREF _Toc242028234 \h </w:instrText>
         </w:r>
         <w:r>
           <w:rPr>
@@ -3067,7 +3067,7 @@
           <w14:ligatures w14:val="standardContextual"/>
         </w:rPr>
       </w:pPr>
-      <w:hyperlink w:anchor="_Toc242027339" w:history="1">
+      <w:hyperlink w:anchor="_Toc242028235" w:history="1">
         <w:r>
           <w:rPr>
             <w:rStyle w:val="Hyperlink"/>
@@ -3094,7 +3094,7 @@
             <w:noProof/>
             <w:webHidden/>
           </w:rPr>
-          <w:instrText xml:space="preserve"> PAGEREF _Toc242027339 \h </w:instrText>
+          <w:instrText xml:space="preserve"> PAGEREF _Toc242028235 \h </w:instrText>
         </w:r>
         <w:r>
           <w:rPr>
@@ -3141,7 +3141,7 @@
           <w14:ligatures w14:val="standardContextual"/>
         </w:rPr>
       </w:pPr>
-      <w:hyperlink w:anchor="_Toc242027340" w:history="1">
+      <w:hyperlink w:anchor="_Toc242028236" w:history="1">
         <w:r>
           <w:rPr>
             <w:rStyle w:val="Hyperlink"/>
@@ -3168,7 +3168,7 @@
             <w:noProof/>
             <w:webHidden/>
           </w:rPr>
-          <w:instrText xml:space="preserve"> PAGEREF _Toc242027340 \h </w:instrText>
+          <w:instrText xml:space="preserve"> PAGEREF _Toc242028236 \h </w:instrText>
         </w:r>
         <w:r>
           <w:rPr>
@@ -3215,7 +3215,7 @@
           <w14:ligatures w14:val="standardContextual"/>
         </w:rPr>
       </w:pPr>
-      <w:hyperlink w:anchor="_Toc242027341" w:history="1">
+      <w:hyperlink w:anchor="_Toc242028237" w:history="1">
         <w:r>
           <w:rPr>
             <w:rStyle w:val="Hyperlink"/>
@@ -3242,7 +3242,7 @@
             <w:noProof/>
             <w:webHidden/>
           </w:rPr>
-          <w:instrText xml:space="preserve"> PAGEREF _Toc242027341 \h </w:instrText>
+          <w:instrText xml:space="preserve"> PAGEREF _Toc242028237 \h </w:instrText>
         </w:r>
         <w:r>
           <w:rPr>
@@ -3289,7 +3289,7 @@
           <w14:ligatures w14:val="standardContextual"/>
         </w:rPr>
       </w:pPr>
-      <w:hyperlink w:anchor="_Toc242027342" w:history="1">
+      <w:hyperlink w:anchor="_Toc242028238" w:history="1">
         <w:r>
           <w:rPr>
             <w:rStyle w:val="Hyperlink"/>
@@ -3316,7 +3316,7 @@
             <w:noProof/>
             <w:webHidden/>
           </w:rPr>
-          <w:instrText xml:space="preserve"> PAGEREF _Toc242027342 \h </w:instrText>
+          <w:instrText xml:space="preserve"> PAGEREF _Toc242028238 \h </w:instrText>
         </w:r>
         <w:r>
           <w:rPr>
@@ -3363,7 +3363,7 @@
           <w14:ligatures w14:val="standardContextual"/>
         </w:rPr>
       </w:pPr>
-      <w:hyperlink w:anchor="_Toc242027343" w:history="1">
+      <w:hyperlink w:anchor="_Toc242028239" w:history="1">
         <w:r>
           <w:rPr>
             <w:rStyle w:val="Hyperlink"/>
@@ -3390,7 +3390,7 @@
             <w:noProof/>
             <w:webHidden/>
           </w:rPr>
-          <w:instrText xml:space="preserve"> PAGEREF _Toc242027343 \h </w:instrText>
+          <w:instrText xml:space="preserve"> PAGEREF _Toc242028239 \h </w:instrText>
         </w:r>
         <w:r>
           <w:rPr>
@@ -3437,7 +3437,7 @@
           <w14:ligatures w14:val="standardContextual"/>
         </w:rPr>
       </w:pPr>
-      <w:hyperlink w:anchor="_Toc242027344" w:history="1">
+      <w:hyperlink w:anchor="_Toc242028240" w:history="1">
         <w:r>
           <w:rPr>
             <w:rStyle w:val="Hyperlink"/>
@@ -3464,7 +3464,7 @@
             <w:noProof/>
             <w:webHidden/>
           </w:rPr>
-          <w:instrText xml:space="preserve"> PAGEREF _Toc242027344 \h </w:instrText>
+          <w:instrText xml:space="preserve"> PAGEREF _Toc242028240 \h </w:instrText>
         </w:r>
         <w:r>
           <w:rPr>
@@ -3511,7 +3511,7 @@
           <w14:ligatures w14:val="standardContextual"/>
         </w:rPr>
       </w:pPr>
-      <w:hyperlink w:anchor="_Toc242027345" w:history="1">
+      <w:hyperlink w:anchor="_Toc242028241" w:history="1">
         <w:r>
           <w:rPr>
             <w:rStyle w:val="Hyperlink"/>
@@ -3538,7 +3538,7 @@
             <w:noProof/>
             <w:webHidden/>
           </w:rPr>
-          <w:instrText xml:space="preserve"> PAGEREF _Toc242027345 \h </w:instrText>
+          <w:instrText xml:space="preserve"> PAGEREF _Toc242028241 \h </w:instrText>
         </w:r>
         <w:r>
           <w:rPr>
@@ -3585,7 +3585,7 @@
           <w14:ligatures w14:val="standardContextual"/>
         </w:rPr>
       </w:pPr>
-      <w:hyperlink w:anchor="_Toc242027346" w:history="1">
+      <w:hyperlink w:anchor="_Toc242028242" w:history="1">
         <w:r>
           <w:rPr>
             <w:rStyle w:val="Hyperlink"/>
@@ -3612,7 +3612,7 @@
             <w:noProof/>
             <w:webHidden/>
           </w:rPr>
-          <w:instrText xml:space="preserve"> PAGEREF _Toc242027346 \h </w:instrText>
+          <w:instrText xml:space="preserve"> PAGEREF _Toc242028242 \h </w:instrText>
         </w:r>
         <w:r>
           <w:rPr>
@@ -3659,7 +3659,7 @@
           <w14:ligatures w14:val="standardContextual"/>
         </w:rPr>
       </w:pPr>
-      <w:hyperlink w:anchor="_Toc242027347" w:history="1">
+      <w:hyperlink w:anchor="_Toc242028243" w:history="1">
         <w:r>
           <w:rPr>
             <w:rStyle w:val="Hyperlink"/>
@@ -3686,7 +3686,7 @@
             <w:noProof/>
             <w:webHidden/>
           </w:rPr>
-          <w:instrText xml:space="preserve"> PAGEREF _Toc242027347 \h </w:instrText>
+          <w:instrText xml:space="preserve"> PAGEREF _Toc242028243 \h </w:instrText>
         </w:r>
         <w:r>
           <w:rPr>
@@ -3733,7 +3733,7 @@
           <w14:ligatures w14:val="standardContextual"/>
         </w:rPr>
       </w:pPr>
-      <w:hyperlink w:anchor="_Toc242027348" w:history="1">
+      <w:hyperlink w:anchor="_Toc242028244" w:history="1">
         <w:r>
           <w:rPr>
             <w:rStyle w:val="Hyperlink"/>
@@ -3760,7 +3760,7 @@
             <w:noProof/>
             <w:webHidden/>
           </w:rPr>
-          <w:instrText xml:space="preserve"> PAGEREF _Toc242027348 \h </w:instrText>
+          <w:instrText xml:space="preserve"> PAGEREF _Toc242028244 \h </w:instrText>
         </w:r>
         <w:r>
           <w:rPr>
@@ -3807,7 +3807,7 @@
           <w14:ligatures w14:val="standardContextual"/>
         </w:rPr>
       </w:pPr>
-      <w:hyperlink w:anchor="_Toc242027349" w:history="1">
+      <w:hyperlink w:anchor="_Toc242028245" w:history="1">
         <w:r>
           <w:rPr>
             <w:rStyle w:val="Hyperlink"/>
@@ -3834,7 +3834,7 @@
             <w:noProof/>
             <w:webHidden/>
           </w:rPr>
-          <w:instrText xml:space="preserve"> PAGEREF _Toc242027349 \h </w:instrText>
+          <w:instrText xml:space="preserve"> PAGEREF _Toc242028245 \h </w:instrText>
         </w:r>
         <w:r>
           <w:rPr>
@@ -3881,7 +3881,7 @@
           <w14:ligatures w14:val="standardContextual"/>
         </w:rPr>
       </w:pPr>
-      <w:hyperlink w:anchor="_Toc242027350" w:history="1">
+      <w:hyperlink w:anchor="_Toc242028246" w:history="1">
         <w:r>
           <w:rPr>
             <w:rStyle w:val="Hyperlink"/>
@@ -3908,7 +3908,7 @@
             <w:noProof/>
             <w:webHidden/>
           </w:rPr>
-          <w:instrText xml:space="preserve"> PAGEREF _Toc242027350 \h </w:instrText>
+          <w:instrText xml:space="preserve"> PAGEREF _Toc242028246 \h </w:instrText>
         </w:r>
         <w:r>
           <w:rPr>
@@ -3955,7 +3955,7 @@
           <w14:ligatures w14:val="standardContextual"/>
         </w:rPr>
       </w:pPr>
-      <w:hyperlink w:anchor="_Toc242027351" w:history="1">
+      <w:hyperlink w:anchor="_Toc242028247" w:history="1">
         <w:r>
           <w:rPr>
             <w:rStyle w:val="Hyperlink"/>
@@ -3982,7 +3982,7 @@
             <w:noProof/>
             <w:webHidden/>
           </w:rPr>
-          <w:instrText xml:space="preserve"> PAGEREF _Toc242027351 \h </w:instrText>
+          <w:instrText xml:space="preserve"> PAGEREF _Toc242028247 \h </w:instrText>
         </w:r>
         <w:r>
           <w:rPr>
@@ -4029,7 +4029,7 @@
           <w14:ligatures w14:val="standardContextual"/>
         </w:rPr>
       </w:pPr>
-      <w:hyperlink w:anchor="_Toc242027352" w:history="1">
+      <w:hyperlink w:anchor="_Toc242028248" w:history="1">
         <w:r>
           <w:rPr>
             <w:rStyle w:val="Hyperlink"/>
@@ -4056,7 +4056,7 @@
             <w:noProof/>
             <w:webHidden/>
           </w:rPr>
-          <w:instrText xml:space="preserve"> PAGEREF _Toc242027352 \h </w:instrText>
+          <w:instrText xml:space="preserve"> PAGEREF _Toc242028248 \h </w:instrText>
         </w:r>
         <w:r>
           <w:rPr>
@@ -4103,7 +4103,7 @@
           <w14:ligatures w14:val="standardContextual"/>
         </w:rPr>
       </w:pPr>
-      <w:hyperlink w:anchor="_Toc242027353" w:history="1">
+      <w:hyperlink w:anchor="_Toc242028249" w:history="1">
         <w:r>
           <w:rPr>
             <w:rStyle w:val="Hyperlink"/>
@@ -4130,7 +4130,7 @@
             <w:noProof/>
             <w:webHidden/>
           </w:rPr>
-          <w:instrText xml:space="preserve"> PAGEREF _Toc242027353 \h </w:instrText>
+          <w:instrText xml:space="preserve"> PAGEREF _Toc242028249 \h </w:instrText>
         </w:r>
         <w:r>
           <w:rPr>
@@ -4177,7 +4177,7 @@
           <w14:ligatures w14:val="standardContextual"/>
         </w:rPr>
       </w:pPr>
-      <w:hyperlink w:anchor="_Toc242027354" w:history="1">
+      <w:hyperlink w:anchor="_Toc242028250" w:history="1">
         <w:r>
           <w:rPr>
             <w:rStyle w:val="Hyperlink"/>
@@ -4204,7 +4204,7 @@
             <w:noProof/>
             <w:webHidden/>
           </w:rPr>
-          <w:instrText xml:space="preserve"> PAGEREF _Toc242027354 \h </w:instrText>
+          <w:instrText xml:space="preserve"> PAGEREF _Toc242028250 \h </w:instrText>
         </w:r>
         <w:r>
           <w:rPr>
@@ -4251,7 +4251,7 @@
           <w14:ligatures w14:val="standardContextual"/>
         </w:rPr>
       </w:pPr>
-      <w:hyperlink w:anchor="_Toc242027355" w:history="1">
+      <w:hyperlink w:anchor="_Toc242028251" w:history="1">
         <w:r>
           <w:rPr>
             <w:rStyle w:val="Hyperlink"/>
@@ -4278,7 +4278,7 @@
             <w:noProof/>
             <w:webHidden/>
           </w:rPr>
-          <w:instrText xml:space="preserve"> PAGEREF _Toc242027355 \h </w:instrText>
+          <w:instrText xml:space="preserve"> PAGEREF _Toc242028251 \h </w:instrText>
         </w:r>
         <w:r>
           <w:rPr>
@@ -4325,7 +4325,7 @@
           <w14:ligatures w14:val="standardContextual"/>
         </w:rPr>
       </w:pPr>
-      <w:hyperlink w:anchor="_Toc242027356" w:history="1">
+      <w:hyperlink w:anchor="_Toc242028252" w:history="1">
         <w:r>
           <w:rPr>
             <w:rStyle w:val="Hyperlink"/>
@@ -4352,7 +4352,7 @@
             <w:noProof/>
             <w:webHidden/>
           </w:rPr>
-          <w:instrText xml:space="preserve"> PAGEREF _Toc242027356 \h </w:instrText>
+          <w:instrText xml:space="preserve"> PAGEREF _Toc242028252 \h </w:instrText>
         </w:r>
         <w:r>
           <w:rPr>
@@ -4399,7 +4399,7 @@
           <w14:ligatures w14:val="standardContextual"/>
         </w:rPr>
       </w:pPr>
-      <w:hyperlink w:anchor="_Toc242027357" w:history="1">
+      <w:hyperlink w:anchor="_Toc242028253" w:history="1">
         <w:r>
           <w:rPr>
             <w:rStyle w:val="Hyperlink"/>
@@ -4426,7 +4426,7 @@
             <w:noProof/>
             <w:webHidden/>
           </w:rPr>
-          <w:instrText xml:space="preserve"> PAGEREF _Toc242027357 \h </w:instrText>
+          <w:instrText xml:space="preserve"> PAGEREF _Toc242028253 \h </w:instrText>
         </w:r>
         <w:r>
           <w:rPr>
@@ -4473,7 +4473,7 @@
           <w14:ligatures w14:val="standardContextual"/>
         </w:rPr>
       </w:pPr>
-      <w:hyperlink w:anchor="_Toc242027358" w:history="1">
+      <w:hyperlink w:anchor="_Toc242028254" w:history="1">
         <w:r>
           <w:rPr>
             <w:rStyle w:val="Hyperlink"/>
@@ -4500,7 +4500,7 @@
             <w:noProof/>
             <w:webHidden/>
           </w:rPr>
-          <w:instrText xml:space="preserve"> PAGEREF _Toc242027358 \h </w:instrText>
+          <w:instrText xml:space="preserve"> PAGEREF _Toc242028254 \h </w:instrText>
         </w:r>
         <w:r>
           <w:rPr>
@@ -4547,7 +4547,7 @@
           <w14:ligatures w14:val="standardContextual"/>
         </w:rPr>
       </w:pPr>
-      <w:hyperlink w:anchor="_Toc242027359" w:history="1">
+      <w:hyperlink w:anchor="_Toc242028255" w:history="1">
         <w:r>
           <w:rPr>
             <w:rStyle w:val="Hyperlink"/>
@@ -4574,7 +4574,7 @@
             <w:noProof/>
             <w:webHidden/>
           </w:rPr>
-          <w:instrText xml:space="preserve"> PAGEREF _Toc242027359 \h </w:instrText>
+          <w:instrText xml:space="preserve"> PAGEREF _Toc242028255 \h </w:instrText>
         </w:r>
         <w:r>
           <w:rPr>
@@ -4621,7 +4621,7 @@
           <w14:ligatures w14:val="standardContextual"/>
         </w:rPr>
       </w:pPr>
-      <w:hyperlink w:anchor="_Toc242027360" w:history="1">
+      <w:hyperlink w:anchor="_Toc242028256" w:history="1">
         <w:r>
           <w:rPr>
             <w:rStyle w:val="Hyperlink"/>
@@ -4648,7 +4648,7 @@
             <w:noProof/>
             <w:webHidden/>
           </w:rPr>
-          <w:instrText xml:space="preserve"> PAGEREF _Toc242027360 \h </w:instrText>
+          <w:instrText xml:space="preserve"> PAGEREF _Toc242028256 \h </w:instrText>
         </w:r>
         <w:r>
           <w:rPr>
@@ -4695,7 +4695,7 @@
           <w14:ligatures w14:val="standardContextual"/>
         </w:rPr>
       </w:pPr>
-      <w:hyperlink w:anchor="_Toc242027361" w:history="1">
+      <w:hyperlink w:anchor="_Toc242028257" w:history="1">
         <w:r>
           <w:rPr>
             <w:rStyle w:val="Hyperlink"/>
@@ -4722,7 +4722,7 @@
             <w:noProof/>
             <w:webHidden/>
           </w:rPr>
-          <w:instrText xml:space="preserve"> PAGEREF _Toc242027361 \h </w:instrText>
+          <w:instrText xml:space="preserve"> PAGEREF _Toc242028257 \h </w:instrText>
         </w:r>
         <w:r>
           <w:rPr>
@@ -4769,7 +4769,7 @@
           <w14:ligatures w14:val="standardContextual"/>
         </w:rPr>
       </w:pPr>
-      <w:hyperlink w:anchor="_Toc242027362" w:history="1">
+      <w:hyperlink w:anchor="_Toc242028258" w:history="1">
         <w:r>
           <w:rPr>
             <w:rStyle w:val="Hyperlink"/>
@@ -4796,7 +4796,7 @@
             <w:noProof/>
             <w:webHidden/>
           </w:rPr>
-          <w:instrText xml:space="preserve"> PAGEREF _Toc242027362 \h </w:instrText>
+          <w:instrText xml:space="preserve"> PAGEREF _Toc242028258 \h </w:instrText>
         </w:r>
         <w:r>
           <w:rPr>
@@ -4843,7 +4843,7 @@
           <w14:ligatures w14:val="standardContextual"/>
         </w:rPr>
       </w:pPr>
-      <w:hyperlink w:anchor="_Toc242027363" w:history="1">
+      <w:hyperlink w:anchor="_Toc242028259" w:history="1">
         <w:r>
           <w:rPr>
             <w:rStyle w:val="Hyperlink"/>
@@ -4870,7 +4870,7 @@
             <w:noProof/>
             <w:webHidden/>
           </w:rPr>
-          <w:instrText xml:space="preserve"> PAGEREF _Toc242027363 \h </w:instrText>
+          <w:instrText xml:space="preserve"> PAGEREF _Toc242028259 \h </w:instrText>
         </w:r>
         <w:r>
           <w:rPr>
@@ -4917,7 +4917,7 @@
           <w14:ligatures w14:val="standardContextual"/>
         </w:rPr>
       </w:pPr>
-      <w:hyperlink w:anchor="_Toc242027364" w:history="1">
+      <w:hyperlink w:anchor="_Toc242028260" w:history="1">
         <w:r>
           <w:rPr>
             <w:rStyle w:val="Hyperlink"/>
@@ -4944,7 +4944,7 @@
             <w:noProof/>
             <w:webHidden/>
           </w:rPr>
-          <w:instrText xml:space="preserve"> PAGEREF _Toc242027364 \h </w:instrText>
+          <w:instrText xml:space="preserve"> PAGEREF _Toc242028260 \h </w:instrText>
         </w:r>
         <w:r>
           <w:rPr>
@@ -4991,7 +4991,7 @@
           <w14:ligatures w14:val="standardContextual"/>
         </w:rPr>
       </w:pPr>
-      <w:hyperlink w:anchor="_Toc242027365" w:history="1">
+      <w:hyperlink w:anchor="_Toc242028261" w:history="1">
         <w:r>
           <w:rPr>
             <w:rStyle w:val="Hyperlink"/>
@@ -5018,7 +5018,7 @@
             <w:noProof/>
             <w:webHidden/>
           </w:rPr>
-          <w:instrText xml:space="preserve"> PAGEREF _Toc242027365 \h </w:instrText>
+          <w:instrText xml:space="preserve"> PAGEREF _Toc242028261 \h </w:instrText>
         </w:r>
         <w:r>
           <w:rPr>
@@ -5065,7 +5065,7 @@
           <w14:ligatures w14:val="standardContextual"/>
         </w:rPr>
       </w:pPr>
-      <w:hyperlink w:anchor="_Toc242027366" w:history="1">
+      <w:hyperlink w:anchor="_Toc242028262" w:history="1">
         <w:r>
           <w:rPr>
             <w:rStyle w:val="Hyperlink"/>
@@ -5092,7 +5092,7 @@
             <w:noProof/>
             <w:webHidden/>
           </w:rPr>
-          <w:instrText xml:space="preserve"> PAGEREF _Toc242027366 \h </w:instrText>
+          <w:instrText xml:space="preserve"> PAGEREF _Toc242028262 \h </w:instrText>
         </w:r>
         <w:r>
           <w:rPr>
@@ -5139,7 +5139,7 @@
           <w14:ligatures w14:val="standardContextual"/>
         </w:rPr>
       </w:pPr>
-      <w:hyperlink w:anchor="_Toc242027367" w:history="1">
+      <w:hyperlink w:anchor="_Toc242028263" w:history="1">
         <w:r>
           <w:rPr>
             <w:rStyle w:val="Hyperlink"/>
@@ -5166,7 +5166,7 @@
             <w:noProof/>
             <w:webHidden/>
           </w:rPr>
-          <w:instrText xml:space="preserve"> PAGEREF _Toc242027367 \h </w:instrText>
+          <w:instrText xml:space="preserve"> PAGEREF _Toc242028263 \h </w:instrText>
         </w:r>
         <w:r>
           <w:rPr>
@@ -5213,7 +5213,7 @@
           <w14:ligatures w14:val="standardContextual"/>
         </w:rPr>
       </w:pPr>
-      <w:hyperlink w:anchor="_Toc242027368" w:history="1">
+      <w:hyperlink w:anchor="_Toc242028264" w:history="1">
         <w:r>
           <w:rPr>
             <w:rStyle w:val="Hyperlink"/>
@@ -5240,7 +5240,7 @@
             <w:noProof/>
             <w:webHidden/>
           </w:rPr>
-          <w:instrText xml:space="preserve"> PAGEREF _Toc242027368 \h </w:instrText>
+          <w:instrText xml:space="preserve"> PAGEREF _Toc242028264 \h </w:instrText>
         </w:r>
         <w:r>
           <w:rPr>
@@ -5287,7 +5287,7 @@
           <w14:ligatures w14:val="standardContextual"/>
         </w:rPr>
       </w:pPr>
-      <w:hyperlink w:anchor="_Toc242027369" w:history="1">
+      <w:hyperlink w:anchor="_Toc242028265" w:history="1">
         <w:r>
           <w:rPr>
             <w:rStyle w:val="Hyperlink"/>
@@ -5314,7 +5314,7 @@
             <w:noProof/>
             <w:webHidden/>
           </w:rPr>
-          <w:instrText xml:space="preserve"> PAGEREF _Toc242027369 \h </w:instrText>
+          <w:instrText xml:space="preserve"> PAGEREF _Toc242028265 \h </w:instrText>
         </w:r>
         <w:r>
           <w:rPr>
@@ -5361,7 +5361,7 @@
           <w14:ligatures w14:val="standardContextual"/>
         </w:rPr>
       </w:pPr>
-      <w:hyperlink w:anchor="_Toc242027370" w:history="1">
+      <w:hyperlink w:anchor="_Toc242028266" w:history="1">
         <w:r>
           <w:rPr>
             <w:rStyle w:val="Hyperlink"/>
@@ -5388,7 +5388,7 @@
             <w:noProof/>
             <w:webHidden/>
           </w:rPr>
-          <w:instrText xml:space="preserve"> PAGEREF _Toc242027370 \h </w:instrText>
+          <w:instrText xml:space="preserve"> PAGEREF _Toc242028266 \h </w:instrText>
         </w:r>
         <w:r>
           <w:rPr>
@@ -5435,7 +5435,7 @@
           <w14:ligatures w14:val="standardContextual"/>
         </w:rPr>
       </w:pPr>
-      <w:hyperlink w:anchor="_Toc242027371" w:history="1">
+      <w:hyperlink w:anchor="_Toc242028267" w:history="1">
         <w:r>
           <w:rPr>
             <w:rStyle w:val="Hyperlink"/>
@@ -5462,7 +5462,7 @@
             <w:noProof/>
             <w:webHidden/>
           </w:rPr>
-          <w:instrText xml:space="preserve"> PAGEREF _Toc242027371 \h </w:instrText>
+          <w:instrText xml:space="preserve"> PAGEREF _Toc242028267 \h </w:instrText>
         </w:r>
         <w:r>
           <w:rPr>
@@ -5509,7 +5509,7 @@
           <w14:ligatures w14:val="standardContextual"/>
         </w:rPr>
       </w:pPr>
-      <w:hyperlink w:anchor="_Toc242027372" w:history="1">
+      <w:hyperlink w:anchor="_Toc242028268" w:history="1">
         <w:r>
           <w:rPr>
             <w:rStyle w:val="Hyperlink"/>
@@ -5536,7 +5536,7 @@
             <w:noProof/>
             <w:webHidden/>
           </w:rPr>
-          <w:instrText xml:space="preserve"> PAGEREF _Toc242027372 \h </w:instrText>
+          <w:instrText xml:space="preserve"> PAGEREF _Toc242028268 \h </w:instrText>
         </w:r>
         <w:r>
           <w:rPr>
@@ -5583,7 +5583,7 @@
           <w14:ligatures w14:val="standardContextual"/>
         </w:rPr>
       </w:pPr>
-      <w:hyperlink w:anchor="_Toc242027373" w:history="1">
+      <w:hyperlink w:anchor="_Toc242028269" w:history="1">
         <w:r>
           <w:rPr>
             <w:rStyle w:val="Hyperlink"/>
@@ -5610,7 +5610,7 @@
             <w:noProof/>
             <w:webHidden/>
           </w:rPr>
-          <w:instrText xml:space="preserve"> PAGEREF _Toc242027373 \h </w:instrText>
+          <w:instrText xml:space="preserve"> PAGEREF _Toc242028269 \h </w:instrText>
         </w:r>
         <w:r>
           <w:rPr>
@@ -5657,7 +5657,7 @@
           <w14:ligatures w14:val="standardContextual"/>
         </w:rPr>
       </w:pPr>
-      <w:hyperlink w:anchor="_Toc242027374" w:history="1">
+      <w:hyperlink w:anchor="_Toc242028270" w:history="1">
         <w:r>
           <w:rPr>
             <w:rStyle w:val="Hyperlink"/>
@@ -5684,7 +5684,7 @@
             <w:noProof/>
             <w:webHidden/>
           </w:rPr>
-          <w:instrText xml:space="preserve"> PAGEREF _Toc242027374 \h </w:instrText>
+          <w:instrText xml:space="preserve"> PAGEREF _Toc242028270 \h </w:instrText>
         </w:r>
         <w:r>
           <w:rPr>
@@ -5731,7 +5731,7 @@
           <w14:ligatures w14:val="standardContextual"/>
         </w:rPr>
       </w:pPr>
-      <w:hyperlink w:anchor="_Toc242027375" w:history="1">
+      <w:hyperlink w:anchor="_Toc242028271" w:history="1">
         <w:r>
           <w:rPr>
             <w:rStyle w:val="Hyperlink"/>
@@ -5758,7 +5758,7 @@
             <w:noProof/>
             <w:webHidden/>
           </w:rPr>
-          <w:instrText xml:space="preserve"> PAGEREF _Toc242027375 \h </w:instrText>
+          <w:instrText xml:space="preserve"> PAGEREF _Toc242028271 \h </w:instrText>
         </w:r>
         <w:r>
           <w:rPr>
@@ -5805,7 +5805,7 @@
           <w14:ligatures w14:val="standardContextual"/>
         </w:rPr>
       </w:pPr>
-      <w:hyperlink w:anchor="_Toc242027376" w:history="1">
+      <w:hyperlink w:anchor="_Toc242028272" w:history="1">
         <w:r>
           <w:rPr>
             <w:rStyle w:val="Hyperlink"/>
@@ -5832,7 +5832,7 @@
             <w:noProof/>
             <w:webHidden/>
           </w:rPr>
-          <w:instrText xml:space="preserve"> PAGEREF _Toc242027376 \h </w:instrText>
+          <w:instrText xml:space="preserve"> PAGEREF _Toc242028272 \h </w:instrText>
         </w:r>
         <w:r>
           <w:rPr>
@@ -5879,7 +5879,7 @@
           <w14:ligatures w14:val="standardContextual"/>
         </w:rPr>
       </w:pPr>
-      <w:hyperlink w:anchor="_Toc242027377" w:history="1">
+      <w:hyperlink w:anchor="_Toc242028273" w:history="1">
         <w:r>
           <w:rPr>
             <w:rStyle w:val="Hyperlink"/>
@@ -5906,7 +5906,7 @@
             <w:noProof/>
             <w:webHidden/>
           </w:rPr>
-          <w:instrText xml:space="preserve"> PAGEREF _Toc242027377 \h </w:instrText>
+          <w:instrText xml:space="preserve"> PAGEREF _Toc242028273 \h </w:instrText>
         </w:r>
         <w:r>
           <w:rPr>
@@ -5953,7 +5953,7 @@
           <w14:ligatures w14:val="standardContextual"/>
         </w:rPr>
       </w:pPr>
-      <w:hyperlink w:anchor="_Toc242027378" w:history="1">
+      <w:hyperlink w:anchor="_Toc242028274" w:history="1">
         <w:r>
           <w:rPr>
             <w:rStyle w:val="Hyperlink"/>
@@ -5980,7 +5980,7 @@
             <w:noProof/>
             <w:webHidden/>
           </w:rPr>
-          <w:instrText xml:space="preserve"> PAGEREF _Toc242027378 \h </w:instrText>
+          <w:instrText xml:space="preserve"> PAGEREF _Toc242028274 \h </w:instrText>
         </w:r>
         <w:r>
           <w:rPr>
@@ -6027,7 +6027,7 @@
           <w14:ligatures w14:val="standardContextual"/>
         </w:rPr>
       </w:pPr>
-      <w:hyperlink w:anchor="_Toc242027379" w:history="1">
+      <w:hyperlink w:anchor="_Toc242028275" w:history="1">
         <w:r>
           <w:rPr>
             <w:rStyle w:val="Hyperlink"/>
@@ -6054,7 +6054,7 @@
             <w:noProof/>
             <w:webHidden/>
           </w:rPr>
-          <w:instrText xml:space="preserve"> PAGEREF _Toc242027379 \h </w:instrText>
+          <w:instrText xml:space="preserve"> PAGEREF _Toc242028275 \h </w:instrText>
         </w:r>
         <w:r>
           <w:rPr>
@@ -6101,7 +6101,7 @@
           <w14:ligatures w14:val="standardContextual"/>
         </w:rPr>
       </w:pPr>
-      <w:hyperlink w:anchor="_Toc242027380" w:history="1">
+      <w:hyperlink w:anchor="_Toc242028276" w:history="1">
         <w:r>
           <w:rPr>
             <w:rStyle w:val="Hyperlink"/>
@@ -6128,7 +6128,7 @@
             <w:noProof/>
             <w:webHidden/>
           </w:rPr>
-          <w:instrText xml:space="preserve"> PAGEREF _Toc242027380 \h </w:instrText>
+          <w:instrText xml:space="preserve"> PAGEREF _Toc242028276 \h </w:instrText>
         </w:r>
         <w:r>
           <w:rPr>
@@ -6175,7 +6175,7 @@
           <w14:ligatures w14:val="standardContextual"/>
         </w:rPr>
       </w:pPr>
-      <w:hyperlink w:anchor="_Toc242027381" w:history="1">
+      <w:hyperlink w:anchor="_Toc242028277" w:history="1">
         <w:r>
           <w:rPr>
             <w:rStyle w:val="Hyperlink"/>
@@ -6202,7 +6202,7 @@
             <w:noProof/>
             <w:webHidden/>
           </w:rPr>
-          <w:instrText xml:space="preserve"> PAGEREF _Toc242027381 \h </w:instrText>
+          <w:instrText xml:space="preserve"> PAGEREF _Toc242028277 \h </w:instrText>
         </w:r>
         <w:r>
           <w:rPr>
@@ -6249,7 +6249,7 @@
           <w14:ligatures w14:val="standardContextual"/>
         </w:rPr>
       </w:pPr>
-      <w:hyperlink w:anchor="_Toc242027382" w:history="1">
+      <w:hyperlink w:anchor="_Toc242028278" w:history="1">
         <w:r>
           <w:rPr>
             <w:rStyle w:val="Hyperlink"/>
@@ -6276,7 +6276,7 @@
             <w:noProof/>
             <w:webHidden/>
           </w:rPr>
-          <w:instrText xml:space="preserve"> PAGEREF _Toc242027382 \h </w:instrText>
+          <w:instrText xml:space="preserve"> PAGEREF _Toc242028278 \h </w:instrText>
         </w:r>
         <w:r>
           <w:rPr>
@@ -6323,7 +6323,7 @@
           <w14:ligatures w14:val="standardContextual"/>
         </w:rPr>
       </w:pPr>
-      <w:hyperlink w:anchor="_Toc242027383" w:history="1">
+      <w:hyperlink w:anchor="_Toc242028279" w:history="1">
         <w:r>
           <w:rPr>
             <w:rStyle w:val="Hyperlink"/>
@@ -6350,7 +6350,7 @@
             <w:noProof/>
             <w:webHidden/>
           </w:rPr>
-          <w:instrText xml:space="preserve"> PAGEREF _Toc242027383 \h </w:instrText>
+          <w:instrText xml:space="preserve"> PAGEREF _Toc242028279 \h </w:instrText>
         </w:r>
         <w:r>
           <w:rPr>
@@ -6397,7 +6397,7 @@
           <w14:ligatures w14:val="standardContextual"/>
         </w:rPr>
       </w:pPr>
-      <w:hyperlink w:anchor="_Toc242027384" w:history="1">
+      <w:hyperlink w:anchor="_Toc242028280" w:history="1">
         <w:r>
           <w:rPr>
             <w:rStyle w:val="Hyperlink"/>
@@ -6424,7 +6424,7 @@
             <w:noProof/>
             <w:webHidden/>
           </w:rPr>
-          <w:instrText xml:space="preserve"> PAGEREF _Toc242027384 \h </w:instrText>
+          <w:instrText xml:space="preserve"> PAGEREF _Toc242028280 \h </w:instrText>
         </w:r>
         <w:r>
           <w:rPr>
@@ -6471,7 +6471,7 @@
           <w14:ligatures w14:val="standardContextual"/>
         </w:rPr>
       </w:pPr>
-      <w:hyperlink w:anchor="_Toc242027385" w:history="1">
+      <w:hyperlink w:anchor="_Toc242028281" w:history="1">
         <w:r>
           <w:rPr>
             <w:rStyle w:val="Hyperlink"/>
@@ -6498,7 +6498,7 @@
             <w:noProof/>
             <w:webHidden/>
           </w:rPr>
-          <w:instrText xml:space="preserve"> PAGEREF _Toc242027385 \h </w:instrText>
+          <w:instrText xml:space="preserve"> PAGEREF _Toc242028281 \h </w:instrText>
         </w:r>
         <w:r>
           <w:rPr>
@@ -6545,7 +6545,7 @@
           <w14:ligatures w14:val="standardContextual"/>
         </w:rPr>
       </w:pPr>
-      <w:hyperlink w:anchor="_Toc242027386" w:history="1">
+      <w:hyperlink w:anchor="_Toc242028282" w:history="1">
         <w:r>
           <w:rPr>
             <w:rStyle w:val="Hyperlink"/>
@@ -6572,7 +6572,7 @@
             <w:noProof/>
             <w:webHidden/>
           </w:rPr>
-          <w:instrText xml:space="preserve"> PAGEREF _Toc242027386 \h </w:instrText>
+          <w:instrText xml:space="preserve"> PAGEREF _Toc242028282 \h </w:instrText>
         </w:r>
         <w:r>
           <w:rPr>
@@ -6619,7 +6619,7 @@
           <w14:ligatures w14:val="standardContextual"/>
         </w:rPr>
       </w:pPr>
-      <w:hyperlink w:anchor="_Toc242027387" w:history="1">
+      <w:hyperlink w:anchor="_Toc242028283" w:history="1">
         <w:r>
           <w:rPr>
             <w:rStyle w:val="Hyperlink"/>
@@ -6646,7 +6646,7 @@
             <w:noProof/>
             <w:webHidden/>
           </w:rPr>
-          <w:instrText xml:space="preserve"> PAGEREF _Toc242027387 \h </w:instrText>
+          <w:instrText xml:space="preserve"> PAGEREF _Toc242028283 \h </w:instrText>
         </w:r>
         <w:r>
           <w:rPr>
@@ -6693,7 +6693,7 @@
           <w14:ligatures w14:val="standardContextual"/>
         </w:rPr>
       </w:pPr>
-      <w:hyperlink w:anchor="_Toc242027388" w:history="1">
+      <w:hyperlink w:anchor="_Toc242028284" w:history="1">
         <w:r>
           <w:rPr>
             <w:rStyle w:val="Hyperlink"/>
@@ -6720,7 +6720,7 @@
             <w:noProof/>
             <w:webHidden/>
           </w:rPr>
-          <w:instrText xml:space="preserve"> PAGEREF _Toc242027388 \h </w:instrText>
+          <w:instrText xml:space="preserve"> PAGEREF _Toc242028284 \h </w:instrText>
         </w:r>
         <w:r>
           <w:rPr>
@@ -6767,7 +6767,7 @@
           <w14:ligatures w14:val="standardContextual"/>
         </w:rPr>
       </w:pPr>
-      <w:hyperlink w:anchor="_Toc242027389" w:history="1">
+      <w:hyperlink w:anchor="_Toc242028285" w:history="1">
         <w:r>
           <w:rPr>
             <w:rStyle w:val="Hyperlink"/>
@@ -6794,7 +6794,7 @@
             <w:noProof/>
             <w:webHidden/>
           </w:rPr>
-          <w:instrText xml:space="preserve"> PAGEREF _Toc242027389 \h </w:instrText>
+          <w:instrText xml:space="preserve"> PAGEREF _Toc242028285 \h </w:instrText>
         </w:r>
         <w:r>
           <w:rPr>
@@ -6841,7 +6841,7 @@
           <w14:ligatures w14:val="standardContextual"/>
         </w:rPr>
       </w:pPr>
-      <w:hyperlink w:anchor="_Toc242027390" w:history="1">
+      <w:hyperlink w:anchor="_Toc242028286" w:history="1">
         <w:r>
           <w:rPr>
             <w:rStyle w:val="Hyperlink"/>
@@ -6868,7 +6868,7 @@
             <w:noProof/>
             <w:webHidden/>
           </w:rPr>
-          <w:instrText xml:space="preserve"> PAGEREF _Toc242027390 \h </w:instrText>
+          <w:instrText xml:space="preserve"> PAGEREF _Toc242028286 \h </w:instrText>
         </w:r>
         <w:r>
           <w:rPr>
@@ -6915,7 +6915,7 @@
           <w14:ligatures w14:val="standardContextual"/>
         </w:rPr>
       </w:pPr>
-      <w:hyperlink w:anchor="_Toc242027391" w:history="1">
+      <w:hyperlink w:anchor="_Toc242028287" w:history="1">
         <w:r>
           <w:rPr>
             <w:rStyle w:val="Hyperlink"/>
@@ -6942,7 +6942,7 @@
             <w:noProof/>
             <w:webHidden/>
           </w:rPr>
-          <w:instrText xml:space="preserve"> PAGEREF _Toc242027391 \h </w:instrText>
+          <w:instrText xml:space="preserve"> PAGEREF _Toc242028287 \h </w:instrText>
         </w:r>
         <w:r>
           <w:rPr>
@@ -6989,7 +6989,7 @@
           <w14:ligatures w14:val="standardContextual"/>
         </w:rPr>
       </w:pPr>
-      <w:hyperlink w:anchor="_Toc242027392" w:history="1">
+      <w:hyperlink w:anchor="_Toc242028288" w:history="1">
         <w:r>
           <w:rPr>
             <w:rStyle w:val="Hyperlink"/>
@@ -7016,7 +7016,7 @@
             <w:noProof/>
             <w:webHidden/>
           </w:rPr>
-          <w:instrText xml:space="preserve"> PAGEREF _Toc242027392 \h </w:instrText>
+          <w:instrText xml:space="preserve"> PAGEREF _Toc242028288 \h </w:instrText>
         </w:r>
         <w:r>
           <w:rPr>
@@ -7063,7 +7063,7 @@
           <w14:ligatures w14:val="standardContextual"/>
         </w:rPr>
       </w:pPr>
-      <w:hyperlink w:anchor="_Toc242027393" w:history="1">
+      <w:hyperlink w:anchor="_Toc242028289" w:history="1">
         <w:r>
           <w:rPr>
             <w:rStyle w:val="Hyperlink"/>
@@ -7090,7 +7090,7 @@
             <w:noProof/>
             <w:webHidden/>
           </w:rPr>
-          <w:instrText xml:space="preserve"> PAGEREF _Toc242027393 \h </w:instrText>
+          <w:instrText xml:space="preserve"> PAGEREF _Toc242028289 \h </w:instrText>
         </w:r>
         <w:r>
           <w:rPr>
@@ -7137,7 +7137,7 @@
           <w14:ligatures w14:val="standardContextual"/>
         </w:rPr>
       </w:pPr>
-      <w:hyperlink w:anchor="_Toc242027394" w:history="1">
+      <w:hyperlink w:anchor="_Toc242028290" w:history="1">
         <w:r>
           <w:rPr>
             <w:rStyle w:val="Hyperlink"/>
@@ -7164,7 +7164,7 @@
             <w:noProof/>
             <w:webHidden/>
           </w:rPr>
-          <w:instrText xml:space="preserve"> PAGEREF _Toc242027394 \h </w:instrText>
+          <w:instrText xml:space="preserve"> PAGEREF _Toc242028290 \h </w:instrText>
         </w:r>
         <w:r>
           <w:rPr>
@@ -7211,7 +7211,7 @@
           <w14:ligatures w14:val="standardContextual"/>
         </w:rPr>
       </w:pPr>
-      <w:hyperlink w:anchor="_Toc242027395" w:history="1">
+      <w:hyperlink w:anchor="_Toc242028291" w:history="1">
         <w:r>
           <w:rPr>
             <w:rStyle w:val="Hyperlink"/>
@@ -7238,7 +7238,7 @@
             <w:noProof/>
             <w:webHidden/>
           </w:rPr>
-          <w:instrText xml:space="preserve"> PAGEREF _Toc242027395 \h </w:instrText>
+          <w:instrText xml:space="preserve"> PAGEREF _Toc242028291 \h </w:instrText>
         </w:r>
         <w:r>
           <w:rPr>
@@ -7285,7 +7285,7 @@
           <w14:ligatures w14:val="standardContextual"/>
         </w:rPr>
       </w:pPr>
-      <w:hyperlink w:anchor="_Toc242027396" w:history="1">
+      <w:hyperlink w:anchor="_Toc242028292" w:history="1">
         <w:r>
           <w:rPr>
             <w:rStyle w:val="Hyperlink"/>
@@ -7312,7 +7312,7 @@
             <w:noProof/>
             <w:webHidden/>
           </w:rPr>
-          <w:instrText xml:space="preserve"> PAGEREF _Toc242027396 \h </w:instrText>
+          <w:instrText xml:space="preserve"> PAGEREF _Toc242028292 \h </w:instrText>
         </w:r>
         <w:r>
           <w:rPr>
@@ -7359,7 +7359,7 @@
           <w14:ligatures w14:val="standardContextual"/>
         </w:rPr>
       </w:pPr>
-      <w:hyperlink w:anchor="_Toc242027397" w:history="1">
+      <w:hyperlink w:anchor="_Toc242028293" w:history="1">
         <w:r>
           <w:rPr>
             <w:rStyle w:val="Hyperlink"/>
@@ -7386,7 +7386,7 @@
             <w:noProof/>
             <w:webHidden/>
           </w:rPr>
-          <w:instrText xml:space="preserve"> PAGEREF _Toc242027397 \h </w:instrText>
+          <w:instrText xml:space="preserve"> PAGEREF _Toc242028293 \h </w:instrText>
         </w:r>
         <w:r>
           <w:rPr>
@@ -7433,7 +7433,7 @@
           <w14:ligatures w14:val="standardContextual"/>
         </w:rPr>
       </w:pPr>
-      <w:hyperlink w:anchor="_Toc242027398" w:history="1">
+      <w:hyperlink w:anchor="_Toc242028294" w:history="1">
         <w:r>
           <w:rPr>
             <w:rStyle w:val="Hyperlink"/>
@@ -7460,7 +7460,7 @@
             <w:noProof/>
             <w:webHidden/>
           </w:rPr>
-          <w:instrText xml:space="preserve"> PAGEREF _Toc242027398 \h </w:instrText>
+          <w:instrText xml:space="preserve"> PAGEREF _Toc242028294 \h </w:instrText>
         </w:r>
         <w:r>
           <w:rPr>
@@ -7507,7 +7507,7 @@
           <w14:ligatures w14:val="standardContextual"/>
         </w:rPr>
       </w:pPr>
-      <w:hyperlink w:anchor="_Toc242027399" w:history="1">
+      <w:hyperlink w:anchor="_Toc242028295" w:history="1">
         <w:r>
           <w:rPr>
             <w:rStyle w:val="Hyperlink"/>
@@ -7534,7 +7534,7 @@
             <w:noProof/>
             <w:webHidden/>
           </w:rPr>
-          <w:instrText xml:space="preserve"> PAGEREF _Toc242027399 \h </w:instrText>
+          <w:instrText xml:space="preserve"> PAGEREF _Toc242028295 \h </w:instrText>
         </w:r>
         <w:r>
           <w:rPr>
@@ -7581,7 +7581,7 @@
           <w14:ligatures w14:val="standardContextual"/>
         </w:rPr>
       </w:pPr>
-      <w:hyperlink w:anchor="_Toc242027400" w:history="1">
+      <w:hyperlink w:anchor="_Toc242028296" w:history="1">
         <w:r>
           <w:rPr>
             <w:rStyle w:val="Hyperlink"/>
@@ -7608,7 +7608,7 @@
             <w:noProof/>
             <w:webHidden/>
           </w:rPr>
-          <w:instrText xml:space="preserve"> PAGEREF _Toc242027400 \h </w:instrText>
+          <w:instrText xml:space="preserve"> PAGEREF _Toc242028296 \h </w:instrText>
         </w:r>
         <w:r>
           <w:rPr>
@@ -7655,7 +7655,7 @@
           <w14:ligatures w14:val="standardContextual"/>
         </w:rPr>
       </w:pPr>
-      <w:hyperlink w:anchor="_Toc242027401" w:history="1">
+      <w:hyperlink w:anchor="_Toc242028297" w:history="1">
         <w:r>
           <w:rPr>
             <w:rStyle w:val="Hyperlink"/>
@@ -7682,7 +7682,7 @@
             <w:noProof/>
             <w:webHidden/>
           </w:rPr>
-          <w:instrText xml:space="preserve"> PAGEREF _Toc242027401 \h </w:instrText>
+          <w:instrText xml:space="preserve"> PAGEREF _Toc242028297 \h </w:instrText>
         </w:r>
         <w:r>
           <w:rPr>
@@ -7729,7 +7729,7 @@
           <w14:ligatures w14:val="standardContextual"/>
         </w:rPr>
       </w:pPr>
-      <w:hyperlink w:anchor="_Toc242027402" w:history="1">
+      <w:hyperlink w:anchor="_Toc242028298" w:history="1">
         <w:r>
           <w:rPr>
             <w:rStyle w:val="Hyperlink"/>
@@ -7756,7 +7756,7 @@
             <w:noProof/>
             <w:webHidden/>
           </w:rPr>
-          <w:instrText xml:space="preserve"> PAGEREF _Toc242027402 \h </w:instrText>
+          <w:instrText xml:space="preserve"> PAGEREF _Toc242028298 \h </w:instrText>
         </w:r>
         <w:r>
           <w:rPr>
@@ -7803,7 +7803,7 @@
           <w14:ligatures w14:val="standardContextual"/>
         </w:rPr>
       </w:pPr>
-      <w:hyperlink w:anchor="_Toc242027403" w:history="1">
+      <w:hyperlink w:anchor="_Toc242028299" w:history="1">
         <w:r>
           <w:rPr>
             <w:rStyle w:val="Hyperlink"/>
@@ -7830,7 +7830,7 @@
             <w:noProof/>
             <w:webHidden/>
           </w:rPr>
-          <w:instrText xml:space="preserve"> PAGEREF _Toc242027403 \h </w:instrText>
+          <w:instrText xml:space="preserve"> PAGEREF _Toc242028299 \h </w:instrText>
         </w:r>
         <w:r>
           <w:rPr>
@@ -7877,7 +7877,7 @@
           <w14:ligatures w14:val="standardContextual"/>
         </w:rPr>
       </w:pPr>
-      <w:hyperlink w:anchor="_Toc242027404" w:history="1">
+      <w:hyperlink w:anchor="_Toc242028300" w:history="1">
         <w:r>
           <w:rPr>
             <w:rStyle w:val="Hyperlink"/>
@@ -7904,7 +7904,7 @@
             <w:noProof/>
             <w:webHidden/>
           </w:rPr>
-          <w:instrText xml:space="preserve"> PAGEREF _Toc242027404 \h </w:instrText>
+          <w:instrText xml:space="preserve"> PAGEREF _Toc242028300 \h </w:instrText>
         </w:r>
         <w:r>
           <w:rPr>
@@ -7951,7 +7951,7 @@
           <w14:ligatures w14:val="standardContextual"/>
         </w:rPr>
       </w:pPr>
-      <w:hyperlink w:anchor="_Toc242027405" w:history="1">
+      <w:hyperlink w:anchor="_Toc242028301" w:history="1">
         <w:r>
           <w:rPr>
             <w:rStyle w:val="Hyperlink"/>
@@ -7978,7 +7978,7 @@
             <w:noProof/>
             <w:webHidden/>
           </w:rPr>
-          <w:instrText xml:space="preserve"> PAGEREF _Toc242027405 \h </w:instrText>
+          <w:instrText xml:space="preserve"> PAGEREF _Toc242028301 \h </w:instrText>
         </w:r>
         <w:r>
           <w:rPr>
@@ -8025,7 +8025,7 @@
           <w14:ligatures w14:val="standardContextual"/>
         </w:rPr>
       </w:pPr>
-      <w:hyperlink w:anchor="_Toc242027406" w:history="1">
+      <w:hyperlink w:anchor="_Toc242028302" w:history="1">
         <w:r>
           <w:rPr>
             <w:rStyle w:val="Hyperlink"/>
@@ -8052,7 +8052,7 @@
             <w:noProof/>
             <w:webHidden/>
           </w:rPr>
-          <w:instrText xml:space="preserve"> PAGEREF _Toc242027406 \h </w:instrText>
+          <w:instrText xml:space="preserve"> PAGEREF _Toc242028302 \h </w:instrText>
         </w:r>
         <w:r>
           <w:rPr>
@@ -8099,7 +8099,7 @@
           <w14:ligatures w14:val="standardContextual"/>
         </w:rPr>
       </w:pPr>
-      <w:hyperlink w:anchor="_Toc242027407" w:history="1">
+      <w:hyperlink w:anchor="_Toc242028303" w:history="1">
         <w:r>
           <w:rPr>
             <w:rStyle w:val="Hyperlink"/>
@@ -8126,7 +8126,7 @@
             <w:noProof/>
             <w:webHidden/>
           </w:rPr>
-          <w:instrText xml:space="preserve"> PAGEREF _Toc242027407 \h </w:instrText>
+          <w:instrText xml:space="preserve"> PAGEREF _Toc242028303 \h </w:instrText>
         </w:r>
         <w:r>
           <w:rPr>
@@ -8173,7 +8173,7 @@
           <w14:ligatures w14:val="standardContextual"/>
         </w:rPr>
       </w:pPr>
-      <w:hyperlink w:anchor="_Toc242027408" w:history="1">
+      <w:hyperlink w:anchor="_Toc242028304" w:history="1">
         <w:r>
           <w:rPr>
             <w:rStyle w:val="Hyperlink"/>
@@ -8200,7 +8200,7 @@
             <w:noProof/>
             <w:webHidden/>
           </w:rPr>
-          <w:instrText xml:space="preserve"> PAGEREF _Toc242027408 \h </w:instrText>
+          <w:instrText xml:space="preserve"> PAGEREF _Toc242028304 \h </w:instrText>
         </w:r>
         <w:r>
           <w:rPr>
@@ -8247,7 +8247,7 @@
           <w14:ligatures w14:val="standardContextual"/>
         </w:rPr>
       </w:pPr>
-      <w:hyperlink w:anchor="_Toc242027409" w:history="1">
+      <w:hyperlink w:anchor="_Toc242028305" w:history="1">
         <w:r>
           <w:rPr>
             <w:rStyle w:val="Hyperlink"/>
@@ -8274,7 +8274,7 @@
             <w:noProof/>
             <w:webHidden/>
           </w:rPr>
-          <w:instrText xml:space="preserve"> PAGEREF _Toc242027409 \h </w:instrText>
+          <w:instrText xml:space="preserve"> PAGEREF _Toc242028305 \h </w:instrText>
         </w:r>
         <w:r>
           <w:rPr>
@@ -8321,7 +8321,7 @@
           <w14:ligatures w14:val="standardContextual"/>
         </w:rPr>
       </w:pPr>
-      <w:hyperlink w:anchor="_Toc242027410" w:history="1">
+      <w:hyperlink w:anchor="_Toc242028306" w:history="1">
         <w:r>
           <w:rPr>
             <w:rStyle w:val="Hyperlink"/>
@@ -8348,7 +8348,7 @@
             <w:noProof/>
             <w:webHidden/>
           </w:rPr>
-          <w:instrText xml:space="preserve"> PAGEREF _Toc242027410 \h </w:instrText>
+          <w:instrText xml:space="preserve"> PAGEREF _Toc242028306 \h </w:instrText>
         </w:r>
         <w:r>
           <w:rPr>
@@ -8395,7 +8395,7 @@
           <w14:ligatures w14:val="standardContextual"/>
         </w:rPr>
       </w:pPr>
-      <w:hyperlink w:anchor="_Toc242027411" w:history="1">
+      <w:hyperlink w:anchor="_Toc242028307" w:history="1">
         <w:r>
           <w:rPr>
             <w:rStyle w:val="Hyperlink"/>
@@ -8422,7 +8422,7 @@
             <w:noProof/>
             <w:webHidden/>
           </w:rPr>
-          <w:instrText xml:space="preserve"> PAGEREF _Toc242027411 \h </w:instrText>
+          <w:instrText xml:space="preserve"> PAGEREF _Toc242028307 \h </w:instrText>
         </w:r>
         <w:r>
           <w:rPr>
@@ -8469,7 +8469,7 @@
           <w14:ligatures w14:val="standardContextual"/>
         </w:rPr>
       </w:pPr>
-      <w:hyperlink w:anchor="_Toc242027412" w:history="1">
+      <w:hyperlink w:anchor="_Toc242028308" w:history="1">
         <w:r>
           <w:rPr>
             <w:rStyle w:val="Hyperlink"/>
@@ -8496,7 +8496,7 @@
             <w:noProof/>
             <w:webHidden/>
           </w:rPr>
-          <w:instrText xml:space="preserve"> PAGEREF _Toc242027412 \h </w:instrText>
+          <w:instrText xml:space="preserve"> PAGEREF _Toc242028308 \h </w:instrText>
         </w:r>
         <w:r>
           <w:rPr>
@@ -8543,7 +8543,7 @@
           <w14:ligatures w14:val="standardContextual"/>
         </w:rPr>
       </w:pPr>
-      <w:hyperlink w:anchor="_Toc242027413" w:history="1">
+      <w:hyperlink w:anchor="_Toc242028309" w:history="1">
         <w:r>
           <w:rPr>
             <w:rStyle w:val="Hyperlink"/>
@@ -8570,7 +8570,7 @@
             <w:noProof/>
             <w:webHidden/>
           </w:rPr>
-          <w:instrText xml:space="preserve"> PAGEREF _Toc242027413 \h </w:instrText>
+          <w:instrText xml:space="preserve"> PAGEREF _Toc242028309 \h </w:instrText>
         </w:r>
         <w:r>
           <w:rPr>
@@ -8617,7 +8617,7 @@
           <w14:ligatures w14:val="standardContextual"/>
         </w:rPr>
       </w:pPr>
-      <w:hyperlink w:anchor="_Toc242027414" w:history="1">
+      <w:hyperlink w:anchor="_Toc242028310" w:history="1">
         <w:r>
           <w:rPr>
             <w:rStyle w:val="Hyperlink"/>
@@ -8644,7 +8644,7 @@
             <w:noProof/>
             <w:webHidden/>
           </w:rPr>
-          <w:instrText xml:space="preserve"> PAGEREF _Toc242027414 \h </w:instrText>
+          <w:instrText xml:space="preserve"> PAGEREF _Toc242028310 \h </w:instrText>
         </w:r>
         <w:r>
           <w:rPr>
@@ -8691,7 +8691,7 @@
           <w14:ligatures w14:val="standardContextual"/>
         </w:rPr>
       </w:pPr>
-      <w:hyperlink w:anchor="_Toc242027415" w:history="1">
+      <w:hyperlink w:anchor="_Toc242028311" w:history="1">
         <w:r>
           <w:rPr>
             <w:rStyle w:val="Hyperlink"/>
@@ -8718,7 +8718,7 @@
             <w:noProof/>
             <w:webHidden/>
           </w:rPr>
-          <w:instrText xml:space="preserve"> PAGEREF _Toc242027415 \h </w:instrText>
+          <w:instrText xml:space="preserve"> PAGEREF _Toc242028311 \h </w:instrText>
         </w:r>
         <w:r>
           <w:rPr>
@@ -8765,7 +8765,7 @@
           <w14:ligatures w14:val="standardContextual"/>
         </w:rPr>
       </w:pPr>
-      <w:hyperlink w:anchor="_Toc242027416" w:history="1">
+      <w:hyperlink w:anchor="_Toc242028312" w:history="1">
         <w:r>
           <w:rPr>
             <w:rStyle w:val="Hyperlink"/>
@@ -8792,7 +8792,7 @@
             <w:noProof/>
             <w:webHidden/>
           </w:rPr>
-          <w:instrText xml:space="preserve"> PAGEREF _Toc242027416 \h </w:instrText>
+          <w:instrText xml:space="preserve"> PAGEREF _Toc242028312 \h </w:instrText>
         </w:r>
         <w:r>
           <w:rPr>
@@ -8839,7 +8839,7 @@
           <w14:ligatures w14:val="standardContextual"/>
         </w:rPr>
       </w:pPr>
-      <w:hyperlink w:anchor="_Toc242027417" w:history="1">
+      <w:hyperlink w:anchor="_Toc242028313" w:history="1">
         <w:r>
           <w:rPr>
             <w:rStyle w:val="Hyperlink"/>
@@ -8866,7 +8866,7 @@
             <w:noProof/>
             <w:webHidden/>
           </w:rPr>
-          <w:instrText xml:space="preserve"> PAGEREF _Toc242027417 \h </w:instrText>
+          <w:instrText xml:space="preserve"> PAGEREF _Toc242028313 \h </w:instrText>
         </w:r>
         <w:r>
           <w:rPr>
@@ -8913,7 +8913,7 @@
           <w14:ligatures w14:val="standardContextual"/>
         </w:rPr>
       </w:pPr>
-      <w:hyperlink w:anchor="_Toc242027418" w:history="1">
+      <w:hyperlink w:anchor="_Toc242028314" w:history="1">
         <w:r>
           <w:rPr>
             <w:rStyle w:val="Hyperlink"/>
@@ -8940,7 +8940,7 @@
             <w:noProof/>
             <w:webHidden/>
           </w:rPr>
-          <w:instrText xml:space="preserve"> PAGEREF _Toc242027418 \h </w:instrText>
+          <w:instrText xml:space="preserve"> PAGEREF _Toc242028314 \h </w:instrText>
         </w:r>
         <w:r>
           <w:rPr>
@@ -8987,7 +8987,7 @@
           <w14:ligatures w14:val="standardContextual"/>
         </w:rPr>
       </w:pPr>
-      <w:hyperlink w:anchor="_Toc242027419" w:history="1">
+      <w:hyperlink w:anchor="_Toc242028315" w:history="1">
         <w:r>
           <w:rPr>
             <w:rStyle w:val="Hyperlink"/>
@@ -9014,7 +9014,7 @@
             <w:noProof/>
             <w:webHidden/>
           </w:rPr>
-          <w:instrText xml:space="preserve"> PAGEREF _Toc242027419 \h </w:instrText>
+          <w:instrText xml:space="preserve"> PAGEREF _Toc242028315 \h </w:instrText>
         </w:r>
         <w:r>
           <w:rPr>
@@ -9054,7 +9054,7 @@
       <w:pPr>
         <w:pStyle w:val="Heading1"/>
       </w:pPr>
-      <w:bookmarkStart w:id="3" w:name="_Toc242027318"/>
+      <w:bookmarkStart w:id="3" w:name="_Toc242028214"/>
       <w:r>
         <w:t>List of figures</w:t>
       </w:r>
@@ -9079,7 +9079,7 @@
       <w:r>
         <w:fldChar w:fldCharType="separate"/>
       </w:r>
-      <w:hyperlink w:anchor="_Toc242027171" w:history="1">
+      <w:hyperlink w:anchor="_Toc242028067" w:history="1">
         <w:r>
           <w:rPr>
             <w:rStyle w:val="Hyperlink"/>
@@ -9106,7 +9106,7 @@
             <w:noProof/>
             <w:webHidden/>
           </w:rPr>
-          <w:instrText xml:space="preserve"> PAGEREF _Toc242027171 \h </w:instrText>
+          <w:instrText xml:space="preserve"> PAGEREF _Toc242028067 \h </w:instrText>
         </w:r>
         <w:r>
           <w:rPr>
@@ -9147,7 +9147,7 @@
           <w:noProof/>
         </w:rPr>
       </w:pPr>
-      <w:hyperlink w:anchor="_Toc242027172" w:history="1">
+      <w:hyperlink w:anchor="_Toc242028068" w:history="1">
         <w:r>
           <w:rPr>
             <w:rStyle w:val="Hyperlink"/>
@@ -9174,7 +9174,7 @@
             <w:noProof/>
             <w:webHidden/>
           </w:rPr>
-          <w:instrText xml:space="preserve"> PAGEREF _Toc242027172 \h </w:instrText>
+          <w:instrText xml:space="preserve"> PAGEREF _Toc242028068 \h </w:instrText>
         </w:r>
         <w:r>
           <w:rPr>
@@ -9215,7 +9215,7 @@
           <w:noProof/>
         </w:rPr>
       </w:pPr>
-      <w:hyperlink w:anchor="_Toc242027173" w:history="1">
+      <w:hyperlink w:anchor="_Toc242028069" w:history="1">
         <w:r>
           <w:rPr>
             <w:rStyle w:val="Hyperlink"/>
@@ -9242,7 +9242,7 @@
             <w:noProof/>
             <w:webHidden/>
           </w:rPr>
-          <w:instrText xml:space="preserve"> PAGEREF _Toc242027173 \h </w:instrText>
+          <w:instrText xml:space="preserve"> PAGEREF _Toc242028069 \h </w:instrText>
         </w:r>
         <w:r>
           <w:rPr>
@@ -9283,7 +9283,7 @@
           <w:noProof/>
         </w:rPr>
       </w:pPr>
-      <w:hyperlink w:anchor="_Toc242027174" w:history="1">
+      <w:hyperlink w:anchor="_Toc242028070" w:history="1">
         <w:r>
           <w:rPr>
             <w:rStyle w:val="Hyperlink"/>
@@ -9310,7 +9310,7 @@
             <w:noProof/>
             <w:webHidden/>
           </w:rPr>
-          <w:instrText xml:space="preserve"> PAGEREF _Toc242027174 \h </w:instrText>
+          <w:instrText xml:space="preserve"> PAGEREF _Toc242028070 \h </w:instrText>
         </w:r>
         <w:r>
           <w:rPr>
@@ -9351,7 +9351,7 @@
           <w:noProof/>
         </w:rPr>
       </w:pPr>
-      <w:hyperlink w:anchor="_Toc242027175" w:history="1">
+      <w:hyperlink w:anchor="_Toc242028071" w:history="1">
         <w:r>
           <w:rPr>
             <w:rStyle w:val="Hyperlink"/>
@@ -9378,7 +9378,7 @@
             <w:noProof/>
             <w:webHidden/>
           </w:rPr>
-          <w:instrText xml:space="preserve"> PAGEREF _Toc242027175 \h </w:instrText>
+          <w:instrText xml:space="preserve"> PAGEREF _Toc242028071 \h </w:instrText>
         </w:r>
         <w:r>
           <w:rPr>
@@ -9419,7 +9419,7 @@
           <w:noProof/>
         </w:rPr>
       </w:pPr>
-      <w:hyperlink w:anchor="_Toc242027176" w:history="1">
+      <w:hyperlink w:anchor="_Toc242028072" w:history="1">
         <w:r>
           <w:rPr>
             <w:rStyle w:val="Hyperlink"/>
@@ -9446,7 +9446,7 @@
             <w:noProof/>
             <w:webHidden/>
           </w:rPr>
-          <w:instrText xml:space="preserve"> PAGEREF _Toc242027176 \h </w:instrText>
+          <w:instrText xml:space="preserve"> PAGEREF _Toc242028072 \h </w:instrText>
         </w:r>
         <w:r>
           <w:rPr>
@@ -9487,7 +9487,7 @@
           <w:noProof/>
         </w:rPr>
       </w:pPr>
-      <w:hyperlink w:anchor="_Toc242027177" w:history="1">
+      <w:hyperlink w:anchor="_Toc242028073" w:history="1">
         <w:r>
           <w:rPr>
             <w:rStyle w:val="Hyperlink"/>
@@ -9514,7 +9514,7 @@
             <w:noProof/>
             <w:webHidden/>
           </w:rPr>
-          <w:instrText xml:space="preserve"> PAGEREF _Toc242027177 \h </w:instrText>
+          <w:instrText xml:space="preserve"> PAGEREF _Toc242028073 \h </w:instrText>
         </w:r>
         <w:r>
           <w:rPr>
@@ -9555,7 +9555,7 @@
           <w:noProof/>
         </w:rPr>
       </w:pPr>
-      <w:hyperlink w:anchor="_Toc242027178" w:history="1">
+      <w:hyperlink w:anchor="_Toc242028074" w:history="1">
         <w:r>
           <w:rPr>
             <w:rStyle w:val="Hyperlink"/>
@@ -9582,7 +9582,7 @@
             <w:noProof/>
             <w:webHidden/>
           </w:rPr>
-          <w:instrText xml:space="preserve"> PAGEREF _Toc242027178 \h </w:instrText>
+          <w:instrText xml:space="preserve"> PAGEREF _Toc242028074 \h </w:instrText>
         </w:r>
         <w:r>
           <w:rPr>
@@ -9623,7 +9623,7 @@
           <w:noProof/>
         </w:rPr>
       </w:pPr>
-      <w:hyperlink w:anchor="_Toc242027179" w:history="1">
+      <w:hyperlink w:anchor="_Toc242028075" w:history="1">
         <w:r>
           <w:rPr>
             <w:rStyle w:val="Hyperlink"/>
@@ -9650,7 +9650,7 @@
             <w:noProof/>
             <w:webHidden/>
           </w:rPr>
-          <w:instrText xml:space="preserve"> PAGEREF _Toc242027179 \h </w:instrText>
+          <w:instrText xml:space="preserve"> PAGEREF _Toc242028075 \h </w:instrText>
         </w:r>
         <w:r>
           <w:rPr>
@@ -9691,7 +9691,7 @@
           <w:noProof/>
         </w:rPr>
       </w:pPr>
-      <w:hyperlink w:anchor="_Toc242027180" w:history="1">
+      <w:hyperlink w:anchor="_Toc242028076" w:history="1">
         <w:r>
           <w:rPr>
             <w:rStyle w:val="Hyperlink"/>
@@ -9718,7 +9718,7 @@
             <w:noProof/>
             <w:webHidden/>
           </w:rPr>
-          <w:instrText xml:space="preserve"> PAGEREF _Toc242027180 \h </w:instrText>
+          <w:instrText xml:space="preserve"> PAGEREF _Toc242028076 \h </w:instrText>
         </w:r>
         <w:r>
           <w:rPr>
@@ -9759,7 +9759,7 @@
           <w:noProof/>
         </w:rPr>
       </w:pPr>
-      <w:hyperlink w:anchor="_Toc242027181" w:history="1">
+      <w:hyperlink w:anchor="_Toc242028077" w:history="1">
         <w:r>
           <w:rPr>
             <w:rStyle w:val="Hyperlink"/>
@@ -9786,7 +9786,7 @@
             <w:noProof/>
             <w:webHidden/>
           </w:rPr>
-          <w:instrText xml:space="preserve"> PAGEREF _Toc242027181 \h </w:instrText>
+          <w:instrText xml:space="preserve"> PAGEREF _Toc242028077 \h </w:instrText>
         </w:r>
         <w:r>
           <w:rPr>
@@ -9827,7 +9827,7 @@
           <w:noProof/>
         </w:rPr>
       </w:pPr>
-      <w:hyperlink w:anchor="_Toc242027182" w:history="1">
+      <w:hyperlink w:anchor="_Toc242028078" w:history="1">
         <w:r>
           <w:rPr>
             <w:rStyle w:val="Hyperlink"/>
@@ -9854,7 +9854,7 @@
             <w:noProof/>
             <w:webHidden/>
           </w:rPr>
-          <w:instrText xml:space="preserve"> PAGEREF _Toc242027182 \h </w:instrText>
+          <w:instrText xml:space="preserve"> PAGEREF _Toc242028078 \h </w:instrText>
         </w:r>
         <w:r>
           <w:rPr>
@@ -9894,7 +9894,7 @@
       <w:pPr>
         <w:pStyle w:val="Heading1"/>
       </w:pPr>
-      <w:bookmarkStart w:id="4" w:name="_Toc242027319"/>
+      <w:bookmarkStart w:id="4" w:name="_Toc242028215"/>
       <w:r>
         <w:t>List of tables</w:t>
       </w:r>
@@ -9925,7 +9925,7 @@
       <w:r>
         <w:fldChar w:fldCharType="separate"/>
       </w:r>
-      <w:hyperlink w:anchor="_Toc242027183" w:history="1">
+      <w:hyperlink w:anchor="_Toc242028079" w:history="1">
         <w:r>
           <w:rPr>
             <w:rStyle w:val="Hyperlink"/>
@@ -9952,7 +9952,7 @@
             <w:noProof/>
             <w:webHidden/>
           </w:rPr>
-          <w:instrText xml:space="preserve"> PAGEREF _Toc242027183 \h </w:instrText>
+          <w:instrText xml:space="preserve"> PAGEREF _Toc242028079 \h </w:instrText>
         </w:r>
         <w:r>
           <w:rPr>
@@ -9999,7 +9999,7 @@
           <w14:ligatures w14:val="standardContextual"/>
         </w:rPr>
       </w:pPr>
-      <w:hyperlink w:anchor="_Toc242027184" w:history="1">
+      <w:hyperlink w:anchor="_Toc242028080" w:history="1">
         <w:r>
           <w:rPr>
             <w:rStyle w:val="Hyperlink"/>
@@ -10026,7 +10026,7 @@
             <w:noProof/>
             <w:webHidden/>
           </w:rPr>
-          <w:instrText xml:space="preserve"> PAGEREF _Toc242027184 \h </w:instrText>
+          <w:instrText xml:space="preserve"> PAGEREF _Toc242028080 \h </w:instrText>
         </w:r>
         <w:r>
           <w:rPr>
@@ -10073,7 +10073,7 @@
           <w14:ligatures w14:val="standardContextual"/>
         </w:rPr>
       </w:pPr>
-      <w:hyperlink w:anchor="_Toc242027185" w:history="1">
+      <w:hyperlink w:anchor="_Toc242028081" w:history="1">
         <w:r>
           <w:rPr>
             <w:rStyle w:val="Hyperlink"/>
@@ -10100,7 +10100,7 @@
             <w:noProof/>
             <w:webHidden/>
           </w:rPr>
-          <w:instrText xml:space="preserve"> PAGEREF _Toc242027185 \h </w:instrText>
+          <w:instrText xml:space="preserve"> PAGEREF _Toc242028081 \h </w:instrText>
         </w:r>
         <w:r>
           <w:rPr>
@@ -10147,7 +10147,7 @@
           <w14:ligatures w14:val="standardContextual"/>
         </w:rPr>
       </w:pPr>
-      <w:hyperlink w:anchor="_Toc242027186" w:history="1">
+      <w:hyperlink w:anchor="_Toc242028082" w:history="1">
         <w:r>
           <w:rPr>
             <w:rStyle w:val="Hyperlink"/>
@@ -10174,7 +10174,7 @@
             <w:noProof/>
             <w:webHidden/>
           </w:rPr>
-          <w:instrText xml:space="preserve"> PAGEREF _Toc242027186 \h </w:instrText>
+          <w:instrText xml:space="preserve"> PAGEREF _Toc242028082 \h </w:instrText>
         </w:r>
         <w:r>
           <w:rPr>
@@ -10221,7 +10221,7 @@
           <w14:ligatures w14:val="standardContextual"/>
         </w:rPr>
       </w:pPr>
-      <w:hyperlink w:anchor="_Toc242027187" w:history="1">
+      <w:hyperlink w:anchor="_Toc242028083" w:history="1">
         <w:r>
           <w:rPr>
             <w:rStyle w:val="Hyperlink"/>
@@ -10248,7 +10248,7 @@
             <w:noProof/>
             <w:webHidden/>
           </w:rPr>
-          <w:instrText xml:space="preserve"> PAGEREF _Toc242027187 \h </w:instrText>
+          <w:instrText xml:space="preserve"> PAGEREF _Toc242028083 \h </w:instrText>
         </w:r>
         <w:r>
           <w:rPr>
@@ -10295,7 +10295,7 @@
           <w14:ligatures w14:val="standardContextual"/>
         </w:rPr>
       </w:pPr>
-      <w:hyperlink w:anchor="_Toc242027188" w:history="1">
+      <w:hyperlink w:anchor="_Toc242028084" w:history="1">
         <w:r>
           <w:rPr>
             <w:rStyle w:val="Hyperlink"/>
@@ -10322,7 +10322,7 @@
             <w:noProof/>
             <w:webHidden/>
           </w:rPr>
-          <w:instrText xml:space="preserve"> PAGEREF _Toc242027188 \h </w:instrText>
+          <w:instrText xml:space="preserve"> PAGEREF _Toc242028084 \h </w:instrText>
         </w:r>
         <w:r>
           <w:rPr>
@@ -10369,7 +10369,7 @@
           <w14:ligatures w14:val="standardContextual"/>
         </w:rPr>
       </w:pPr>
-      <w:hyperlink w:anchor="_Toc242027189" w:history="1">
+      <w:hyperlink w:anchor="_Toc242028085" w:history="1">
         <w:r>
           <w:rPr>
             <w:rStyle w:val="Hyperlink"/>
@@ -10396,7 +10396,7 @@
             <w:noProof/>
             <w:webHidden/>
           </w:rPr>
-          <w:instrText xml:space="preserve"> PAGEREF _Toc242027189 \h </w:instrText>
+          <w:instrText xml:space="preserve"> PAGEREF _Toc242028085 \h </w:instrText>
         </w:r>
         <w:r>
           <w:rPr>
@@ -10443,7 +10443,7 @@
           <w14:ligatures w14:val="standardContextual"/>
         </w:rPr>
       </w:pPr>
-      <w:hyperlink w:anchor="_Toc242027190" w:history="1">
+      <w:hyperlink w:anchor="_Toc242028086" w:history="1">
         <w:r>
           <w:rPr>
             <w:rStyle w:val="Hyperlink"/>
@@ -10470,7 +10470,7 @@
             <w:noProof/>
             <w:webHidden/>
           </w:rPr>
-          <w:instrText xml:space="preserve"> PAGEREF _Toc242027190 \h </w:instrText>
+          <w:instrText xml:space="preserve"> PAGEREF _Toc242028086 \h </w:instrText>
         </w:r>
         <w:r>
           <w:rPr>
@@ -10517,7 +10517,7 @@
           <w14:ligatures w14:val="standardContextual"/>
         </w:rPr>
       </w:pPr>
-      <w:hyperlink w:anchor="_Toc242027191" w:history="1">
+      <w:hyperlink w:anchor="_Toc242028087" w:history="1">
         <w:r>
           <w:rPr>
             <w:rStyle w:val="Hyperlink"/>
@@ -10544,7 +10544,7 @@
             <w:noProof/>
             <w:webHidden/>
           </w:rPr>
-          <w:instrText xml:space="preserve"> PAGEREF _Toc242027191 \h </w:instrText>
+          <w:instrText xml:space="preserve"> PAGEREF _Toc242028087 \h </w:instrText>
         </w:r>
         <w:r>
           <w:rPr>
@@ -10591,7 +10591,7 @@
           <w14:ligatures w14:val="standardContextual"/>
         </w:rPr>
       </w:pPr>
-      <w:hyperlink w:anchor="_Toc242027192" w:history="1">
+      <w:hyperlink w:anchor="_Toc242028088" w:history="1">
         <w:r>
           <w:rPr>
             <w:rStyle w:val="Hyperlink"/>
@@ -10618,7 +10618,7 @@
             <w:noProof/>
             <w:webHidden/>
           </w:rPr>
-          <w:instrText xml:space="preserve"> PAGEREF _Toc242027192 \h </w:instrText>
+          <w:instrText xml:space="preserve"> PAGEREF _Toc242028088 \h </w:instrText>
         </w:r>
         <w:r>
           <w:rPr>
@@ -10665,7 +10665,7 @@
           <w14:ligatures w14:val="standardContextual"/>
         </w:rPr>
       </w:pPr>
-      <w:hyperlink w:anchor="_Toc242027193" w:history="1">
+      <w:hyperlink w:anchor="_Toc242028089" w:history="1">
         <w:r>
           <w:rPr>
             <w:rStyle w:val="Hyperlink"/>
@@ -10692,7 +10692,7 @@
             <w:noProof/>
             <w:webHidden/>
           </w:rPr>
-          <w:instrText xml:space="preserve"> PAGEREF _Toc242027193 \h </w:instrText>
+          <w:instrText xml:space="preserve"> PAGEREF _Toc242028089 \h </w:instrText>
         </w:r>
         <w:r>
           <w:rPr>
@@ -10739,7 +10739,7 @@
           <w14:ligatures w14:val="standardContextual"/>
         </w:rPr>
       </w:pPr>
-      <w:hyperlink w:anchor="_Toc242027194" w:history="1">
+      <w:hyperlink w:anchor="_Toc242028090" w:history="1">
         <w:r>
           <w:rPr>
             <w:rStyle w:val="Hyperlink"/>
@@ -10766,7 +10766,7 @@
             <w:noProof/>
             <w:webHidden/>
           </w:rPr>
-          <w:instrText xml:space="preserve"> PAGEREF _Toc242027194 \h </w:instrText>
+          <w:instrText xml:space="preserve"> PAGEREF _Toc242028090 \h </w:instrText>
         </w:r>
         <w:r>
           <w:rPr>
@@ -10813,7 +10813,7 @@
           <w14:ligatures w14:val="standardContextual"/>
         </w:rPr>
       </w:pPr>
-      <w:hyperlink w:anchor="_Toc242027195" w:history="1">
+      <w:hyperlink w:anchor="_Toc242028091" w:history="1">
         <w:r>
           <w:rPr>
             <w:rStyle w:val="Hyperlink"/>
@@ -10840,7 +10840,7 @@
             <w:noProof/>
             <w:webHidden/>
           </w:rPr>
-          <w:instrText xml:space="preserve"> PAGEREF _Toc242027195 \h </w:instrText>
+          <w:instrText xml:space="preserve"> PAGEREF _Toc242028091 \h </w:instrText>
         </w:r>
         <w:r>
           <w:rPr>
@@ -10887,7 +10887,7 @@
           <w14:ligatures w14:val="standardContextual"/>
         </w:rPr>
       </w:pPr>
-      <w:hyperlink w:anchor="_Toc242027196" w:history="1">
+      <w:hyperlink w:anchor="_Toc242028092" w:history="1">
         <w:r>
           <w:rPr>
             <w:rStyle w:val="Hyperlink"/>
@@ -10914,7 +10914,7 @@
             <w:noProof/>
             <w:webHidden/>
           </w:rPr>
-          <w:instrText xml:space="preserve"> PAGEREF _Toc242027196 \h </w:instrText>
+          <w:instrText xml:space="preserve"> PAGEREF _Toc242028092 \h </w:instrText>
         </w:r>
         <w:r>
           <w:rPr>
@@ -10961,7 +10961,7 @@
           <w14:ligatures w14:val="standardContextual"/>
         </w:rPr>
       </w:pPr>
-      <w:hyperlink w:anchor="_Toc242027197" w:history="1">
+      <w:hyperlink w:anchor="_Toc242028093" w:history="1">
         <w:r>
           <w:rPr>
             <w:rStyle w:val="Hyperlink"/>
@@ -10988,7 +10988,7 @@
             <w:noProof/>
             <w:webHidden/>
           </w:rPr>
-          <w:instrText xml:space="preserve"> PAGEREF _Toc242027197 \h </w:instrText>
+          <w:instrText xml:space="preserve"> PAGEREF _Toc242028093 \h </w:instrText>
         </w:r>
         <w:r>
           <w:rPr>
@@ -11035,7 +11035,7 @@
           <w14:ligatures w14:val="standardContextual"/>
         </w:rPr>
       </w:pPr>
-      <w:hyperlink w:anchor="_Toc242027198" w:history="1">
+      <w:hyperlink w:anchor="_Toc242028094" w:history="1">
         <w:r>
           <w:rPr>
             <w:rStyle w:val="Hyperlink"/>
@@ -11062,7 +11062,7 @@
             <w:noProof/>
             <w:webHidden/>
           </w:rPr>
-          <w:instrText xml:space="preserve"> PAGEREF _Toc242027198 \h </w:instrText>
+          <w:instrText xml:space="preserve"> PAGEREF _Toc242028094 \h </w:instrText>
         </w:r>
         <w:r>
           <w:rPr>
@@ -11109,7 +11109,7 @@
           <w14:ligatures w14:val="standardContextual"/>
         </w:rPr>
       </w:pPr>
-      <w:hyperlink w:anchor="_Toc242027199" w:history="1">
+      <w:hyperlink w:anchor="_Toc242028095" w:history="1">
         <w:r>
           <w:rPr>
             <w:rStyle w:val="Hyperlink"/>
@@ -11136,7 +11136,7 @@
             <w:noProof/>
             <w:webHidden/>
           </w:rPr>
-          <w:instrText xml:space="preserve"> PAGEREF _Toc242027199 \h </w:instrText>
+          <w:instrText xml:space="preserve"> PAGEREF _Toc242028095 \h </w:instrText>
         </w:r>
         <w:r>
           <w:rPr>
@@ -11183,7 +11183,7 @@
           <w14:ligatures w14:val="standardContextual"/>
         </w:rPr>
       </w:pPr>
-      <w:hyperlink w:anchor="_Toc242027200" w:history="1">
+      <w:hyperlink w:anchor="_Toc242028096" w:history="1">
         <w:r>
           <w:rPr>
             <w:rStyle w:val="Hyperlink"/>
@@ -11210,7 +11210,7 @@
             <w:noProof/>
             <w:webHidden/>
           </w:rPr>
-          <w:instrText xml:space="preserve"> PAGEREF _Toc242027200 \h </w:instrText>
+          <w:instrText xml:space="preserve"> PAGEREF _Toc242028096 \h </w:instrText>
         </w:r>
         <w:r>
           <w:rPr>
@@ -11257,7 +11257,7 @@
           <w14:ligatures w14:val="standardContextual"/>
         </w:rPr>
       </w:pPr>
-      <w:hyperlink w:anchor="_Toc242027201" w:history="1">
+      <w:hyperlink w:anchor="_Toc242028097" w:history="1">
         <w:r>
           <w:rPr>
             <w:rStyle w:val="Hyperlink"/>
@@ -11284,7 +11284,7 @@
             <w:noProof/>
             <w:webHidden/>
           </w:rPr>
-          <w:instrText xml:space="preserve"> PAGEREF _Toc242027201 \h </w:instrText>
+          <w:instrText xml:space="preserve"> PAGEREF _Toc242028097 \h </w:instrText>
         </w:r>
         <w:r>
           <w:rPr>
@@ -11331,7 +11331,7 @@
           <w14:ligatures w14:val="standardContextual"/>
         </w:rPr>
       </w:pPr>
-      <w:hyperlink w:anchor="_Toc242027202" w:history="1">
+      <w:hyperlink w:anchor="_Toc242028098" w:history="1">
         <w:r>
           <w:rPr>
             <w:rStyle w:val="Hyperlink"/>
@@ -11358,7 +11358,7 @@
             <w:noProof/>
             <w:webHidden/>
           </w:rPr>
-          <w:instrText xml:space="preserve"> PAGEREF _Toc242027202 \h </w:instrText>
+          <w:instrText xml:space="preserve"> PAGEREF _Toc242028098 \h </w:instrText>
         </w:r>
         <w:r>
           <w:rPr>
@@ -11405,7 +11405,7 @@
           <w14:ligatures w14:val="standardContextual"/>
         </w:rPr>
       </w:pPr>
-      <w:hyperlink w:anchor="_Toc242027203" w:history="1">
+      <w:hyperlink w:anchor="_Toc242028099" w:history="1">
         <w:r>
           <w:rPr>
             <w:rStyle w:val="Hyperlink"/>
@@ -11432,7 +11432,7 @@
             <w:noProof/>
             <w:webHidden/>
           </w:rPr>
-          <w:instrText xml:space="preserve"> PAGEREF _Toc242027203 \h </w:instrText>
+          <w:instrText xml:space="preserve"> PAGEREF _Toc242028099 \h </w:instrText>
         </w:r>
         <w:r>
           <w:rPr>
@@ -11479,7 +11479,7 @@
           <w14:ligatures w14:val="standardContextual"/>
         </w:rPr>
       </w:pPr>
-      <w:hyperlink w:anchor="_Toc242027204" w:history="1">
+      <w:hyperlink w:anchor="_Toc242028100" w:history="1">
         <w:r>
           <w:rPr>
             <w:rStyle w:val="Hyperlink"/>
@@ -11506,7 +11506,7 @@
             <w:noProof/>
             <w:webHidden/>
           </w:rPr>
-          <w:instrText xml:space="preserve"> PAGEREF _Toc242027204 \h </w:instrText>
+          <w:instrText xml:space="preserve"> PAGEREF _Toc242028100 \h </w:instrText>
         </w:r>
         <w:r>
           <w:rPr>
@@ -11553,7 +11553,7 @@
           <w14:ligatures w14:val="standardContextual"/>
         </w:rPr>
       </w:pPr>
-      <w:hyperlink w:anchor="_Toc242027205" w:history="1">
+      <w:hyperlink w:anchor="_Toc242028101" w:history="1">
         <w:r>
           <w:rPr>
             <w:rStyle w:val="Hyperlink"/>
@@ -11580,7 +11580,7 @@
             <w:noProof/>
             <w:webHidden/>
           </w:rPr>
-          <w:instrText xml:space="preserve"> PAGEREF _Toc242027205 \h </w:instrText>
+          <w:instrText xml:space="preserve"> PAGEREF _Toc242028101 \h </w:instrText>
         </w:r>
         <w:r>
           <w:rPr>
@@ -11627,7 +11627,7 @@
           <w14:ligatures w14:val="standardContextual"/>
         </w:rPr>
       </w:pPr>
-      <w:hyperlink w:anchor="_Toc242027206" w:history="1">
+      <w:hyperlink w:anchor="_Toc242028102" w:history="1">
         <w:r>
           <w:rPr>
             <w:rStyle w:val="Hyperlink"/>
@@ -11654,7 +11654,7 @@
             <w:noProof/>
             <w:webHidden/>
           </w:rPr>
-          <w:instrText xml:space="preserve"> PAGEREF _Toc242027206 \h </w:instrText>
+          <w:instrText xml:space="preserve"> PAGEREF _Toc242028102 \h </w:instrText>
         </w:r>
         <w:r>
           <w:rPr>
@@ -11701,7 +11701,7 @@
           <w14:ligatures w14:val="standardContextual"/>
         </w:rPr>
       </w:pPr>
-      <w:hyperlink w:anchor="_Toc242027207" w:history="1">
+      <w:hyperlink w:anchor="_Toc242028103" w:history="1">
         <w:r>
           <w:rPr>
             <w:rStyle w:val="Hyperlink"/>
@@ -11728,7 +11728,7 @@
             <w:noProof/>
             <w:webHidden/>
           </w:rPr>
-          <w:instrText xml:space="preserve"> PAGEREF _Toc242027207 \h </w:instrText>
+          <w:instrText xml:space="preserve"> PAGEREF _Toc242028103 \h </w:instrText>
         </w:r>
         <w:r>
           <w:rPr>
@@ -11775,7 +11775,7 @@
           <w14:ligatures w14:val="standardContextual"/>
         </w:rPr>
       </w:pPr>
-      <w:hyperlink w:anchor="_Toc242027208" w:history="1">
+      <w:hyperlink w:anchor="_Toc242028104" w:history="1">
         <w:r>
           <w:rPr>
             <w:rStyle w:val="Hyperlink"/>
@@ -11802,7 +11802,7 @@
             <w:noProof/>
             <w:webHidden/>
           </w:rPr>
-          <w:instrText xml:space="preserve"> PAGEREF _Toc242027208 \h </w:instrText>
+          <w:instrText xml:space="preserve"> PAGEREF _Toc242028104 \h </w:instrText>
         </w:r>
         <w:r>
           <w:rPr>
@@ -11849,7 +11849,7 @@
           <w14:ligatures w14:val="standardContextual"/>
         </w:rPr>
       </w:pPr>
-      <w:hyperlink w:anchor="_Toc242027209" w:history="1">
+      <w:hyperlink w:anchor="_Toc242028105" w:history="1">
         <w:r>
           <w:rPr>
             <w:rStyle w:val="Hyperlink"/>
@@ -11876,7 +11876,7 @@
             <w:noProof/>
             <w:webHidden/>
           </w:rPr>
-          <w:instrText xml:space="preserve"> PAGEREF _Toc242027209 \h </w:instrText>
+          <w:instrText xml:space="preserve"> PAGEREF _Toc242028105 \h </w:instrText>
         </w:r>
         <w:r>
           <w:rPr>
@@ -11933,7 +11933,7 @@
       <w:pPr>
         <w:pStyle w:val="Heading1"/>
       </w:pPr>
-      <w:bookmarkStart w:id="5" w:name="_Toc242027320"/>
+      <w:bookmarkStart w:id="5" w:name="_Toc242028216"/>
       <w:r>
         <w:lastRenderedPageBreak/>
         <w:t>Chapter 1: Introduction</w:t>
@@ -11949,7 +11949,7 @@
       <w:pPr>
         <w:pStyle w:val="Heading2"/>
       </w:pPr>
-      <w:bookmarkStart w:id="6" w:name="_Toc242027321"/>
+      <w:bookmarkStart w:id="6" w:name="_Toc242028217"/>
       <w:r>
         <w:t>1.1 Background</w:t>
       </w:r>
@@ -11964,7 +11964,7 @@
       <w:pPr>
         <w:pStyle w:val="Heading2"/>
       </w:pPr>
-      <w:bookmarkStart w:id="7" w:name="_Toc242027322"/>
+      <w:bookmarkStart w:id="7" w:name="_Toc242028218"/>
       <w:r>
         <w:t>1.2 Problem statement</w:t>
       </w:r>
@@ -11979,7 +11979,7 @@
       <w:pPr>
         <w:pStyle w:val="Heading2"/>
       </w:pPr>
-      <w:bookmarkStart w:id="8" w:name="_Toc242027323"/>
+      <w:bookmarkStart w:id="8" w:name="_Toc242028219"/>
       <w:r>
         <w:t>1.3 Motivation</w:t>
       </w:r>
@@ -11999,7 +11999,7 @@
       <w:pPr>
         <w:pStyle w:val="Heading2"/>
       </w:pPr>
-      <w:bookmarkStart w:id="9" w:name="_Toc242027324"/>
+      <w:bookmarkStart w:id="9" w:name="_Toc242028220"/>
       <w:r>
         <w:t>1.4 Domain requirements</w:t>
       </w:r>
@@ -12230,7 +12230,7 @@
       <w:pPr>
         <w:pStyle w:val="Heading2"/>
       </w:pPr>
-      <w:bookmarkStart w:id="10" w:name="_Toc242027325"/>
+      <w:bookmarkStart w:id="10" w:name="_Toc242028221"/>
       <w:r>
         <w:lastRenderedPageBreak/>
         <w:t>1.5 Project objectives</w:t>
@@ -12323,7 +12323,7 @@
       <w:pPr>
         <w:pStyle w:val="Heading2"/>
       </w:pPr>
-      <w:bookmarkStart w:id="11" w:name="_Toc242027326"/>
+      <w:bookmarkStart w:id="11" w:name="_Toc242028222"/>
       <w:r>
         <w:t>1.6 Scope</w:t>
       </w:r>
@@ -12338,7 +12338,7 @@
       <w:pPr>
         <w:pStyle w:val="Heading2"/>
       </w:pPr>
-      <w:bookmarkStart w:id="12" w:name="_Toc242027327"/>
+      <w:bookmarkStart w:id="12" w:name="_Toc242028223"/>
       <w:r>
         <w:t>1.7 Proposed solution</w:t>
       </w:r>
@@ -12356,7 +12356,7 @@
       <w:pPr>
         <w:pStyle w:val="Heading2"/>
       </w:pPr>
-      <w:bookmarkStart w:id="13" w:name="_Toc242027328"/>
+      <w:bookmarkStart w:id="13" w:name="_Toc242028224"/>
       <w:r>
         <w:t>1.8 Report organization</w:t>
       </w:r>
@@ -12371,7 +12371,7 @@
       <w:pPr>
         <w:pStyle w:val="Heading1"/>
       </w:pPr>
-      <w:bookmarkStart w:id="14" w:name="_Toc242027329"/>
+      <w:bookmarkStart w:id="14" w:name="_Toc242028225"/>
       <w:r>
         <w:t>Chapter 2: Domain analysis and knowledge acquisition</w:t>
       </w:r>
@@ -12386,7 +12386,7 @@
       <w:pPr>
         <w:pStyle w:val="Heading2"/>
       </w:pPr>
-      <w:bookmarkStart w:id="15" w:name="_Toc242027330"/>
+      <w:bookmarkStart w:id="15" w:name="_Toc242028226"/>
       <w:r>
         <w:t>2.1 Smart parking domain</w:t>
       </w:r>
@@ -12404,7 +12404,7 @@
       <w:pPr>
         <w:pStyle w:val="Heading2"/>
       </w:pPr>
-      <w:bookmarkStart w:id="16" w:name="_Toc242027331"/>
+      <w:bookmarkStart w:id="16" w:name="_Toc242028227"/>
       <w:r>
         <w:lastRenderedPageBreak/>
         <w:t>2.2 Domain entities</w:t>
@@ -12418,7 +12418,7 @@
         <w:spacing w:before="80"/>
         <w:jc w:val="center"/>
       </w:pPr>
-      <w:bookmarkStart w:id="17" w:name="_Toc242027183"/>
+      <w:bookmarkStart w:id="17" w:name="_Toc242028079"/>
       <w:r>
         <w:t xml:space="preserve">Table </w:t>
       </w:r>
@@ -13165,7 +13165,7 @@
       <w:pPr>
         <w:pStyle w:val="Heading2"/>
       </w:pPr>
-      <w:bookmarkStart w:id="18" w:name="_Toc242027332"/>
+      <w:bookmarkStart w:id="18" w:name="_Toc242028228"/>
       <w:r>
         <w:t>2.3 Domain relationships</w:t>
       </w:r>
@@ -13183,7 +13183,7 @@
       <w:pPr>
         <w:pStyle w:val="Heading2"/>
       </w:pPr>
-      <w:bookmarkStart w:id="19" w:name="_Toc242027333"/>
+      <w:bookmarkStart w:id="19" w:name="_Toc242028229"/>
       <w:r>
         <w:t>2.4 Knowledge acquisition</w:t>
       </w:r>
@@ -13208,7 +13208,7 @@
       <w:pPr>
         <w:pStyle w:val="Heading2"/>
       </w:pPr>
-      <w:bookmarkStart w:id="20" w:name="_Toc242027334"/>
+      <w:bookmarkStart w:id="20" w:name="_Toc242028230"/>
       <w:r>
         <w:t>2.5 Domain constraints</w:t>
       </w:r>
@@ -13223,7 +13223,7 @@
       <w:pPr>
         <w:pStyle w:val="Heading2"/>
       </w:pPr>
-      <w:bookmarkStart w:id="21" w:name="_Toc242027335"/>
+      <w:bookmarkStart w:id="21" w:name="_Toc242028231"/>
       <w:r>
         <w:t>2.6 Limitations of traditional database systems</w:t>
       </w:r>
@@ -13279,7 +13279,7 @@
       <w:pPr>
         <w:pStyle w:val="Heading1"/>
       </w:pPr>
-      <w:bookmarkStart w:id="22" w:name="_Toc242027336"/>
+      <w:bookmarkStart w:id="22" w:name="_Toc242028232"/>
       <w:r>
         <w:t>Chapter 3: Knowledge representation architecture</w:t>
       </w:r>
@@ -13294,7 +13294,7 @@
       <w:pPr>
         <w:pStyle w:val="Heading2"/>
       </w:pPr>
-      <w:bookmarkStart w:id="23" w:name="_Toc242027337"/>
+      <w:bookmarkStart w:id="23" w:name="_Toc242028233"/>
       <w:r>
         <w:t>3.1 Overall knowledge model</w:t>
       </w:r>
@@ -13311,7 +13311,7 @@
           <w:noProof/>
         </w:rPr>
         <w:drawing>
-          <wp:inline distT="0" distB="0" distL="0" distR="0" wp14:anchorId="3429F93B" wp14:editId="494B1783">
+          <wp:inline distT="0" distB="0" distL="0" distR="0" wp14:anchorId="399871F2" wp14:editId="28581ED7">
             <wp:extent cx="5705867" cy="2916942"/>
             <wp:effectExtent l="0" t="0" r="0" b="0"/>
             <wp:docPr id="1" name="Picture 1"/>
@@ -13353,7 +13353,7 @@
         <w:spacing w:before="80" w:after="160"/>
         <w:jc w:val="center"/>
       </w:pPr>
-      <w:bookmarkStart w:id="24" w:name="_Toc242027171"/>
+      <w:bookmarkStart w:id="24" w:name="_Toc242028067"/>
       <w:r>
         <w:t xml:space="preserve">Figure </w:t>
       </w:r>
@@ -13389,7 +13389,7 @@
       <w:pPr>
         <w:pStyle w:val="Heading2"/>
       </w:pPr>
-      <w:bookmarkStart w:id="25" w:name="_Toc242027338"/>
+      <w:bookmarkStart w:id="25" w:name="_Toc242028234"/>
       <w:r>
         <w:t>3.2 Concept hierarchy</w:t>
       </w:r>
@@ -13407,7 +13407,7 @@
       <w:pPr>
         <w:pStyle w:val="Heading2"/>
       </w:pPr>
-      <w:bookmarkStart w:id="26" w:name="_Toc242027339"/>
+      <w:bookmarkStart w:id="26" w:name="_Toc242028235"/>
       <w:r>
         <w:lastRenderedPageBreak/>
         <w:t>3.3 Knowledge representation paradigms</w:t>
@@ -13421,7 +13421,7 @@
         <w:spacing w:before="80"/>
         <w:jc w:val="center"/>
       </w:pPr>
-      <w:bookmarkStart w:id="27" w:name="_Toc242027184"/>
+      <w:bookmarkStart w:id="27" w:name="_Toc242028080"/>
       <w:r>
         <w:t xml:space="preserve">Table </w:t>
       </w:r>
@@ -13893,7 +13893,7 @@
       <w:pPr>
         <w:pStyle w:val="Heading1"/>
       </w:pPr>
-      <w:bookmarkStart w:id="28" w:name="_Toc242027340"/>
+      <w:bookmarkStart w:id="28" w:name="_Toc242028236"/>
       <w:r>
         <w:t>Chapter 4: Frames and scripts</w:t>
       </w:r>
@@ -13908,7 +13908,7 @@
       <w:pPr>
         <w:pStyle w:val="Heading2"/>
       </w:pPr>
-      <w:bookmarkStart w:id="29" w:name="_Toc242027341"/>
+      <w:bookmarkStart w:id="29" w:name="_Toc242028237"/>
       <w:r>
         <w:t>4.1 Frame architecture</w:t>
       </w:r>
@@ -13939,7 +13939,7 @@
         </w:rPr>
         <w:lastRenderedPageBreak/>
         <w:drawing>
-          <wp:inline distT="0" distB="0" distL="0" distR="0" wp14:anchorId="60D1D694" wp14:editId="6D21CB5F">
+          <wp:inline distT="0" distB="0" distL="0" distR="0" wp14:anchorId="57A3F459" wp14:editId="47E1D6CB">
             <wp:extent cx="5135890" cy="5660147"/>
             <wp:effectExtent l="0" t="0" r="0" b="0"/>
             <wp:docPr id="2" name="Picture 2"/>
@@ -13981,7 +13981,7 @@
         <w:spacing w:before="80" w:after="160"/>
         <w:jc w:val="center"/>
       </w:pPr>
-      <w:bookmarkStart w:id="30" w:name="_Toc242027172"/>
+      <w:bookmarkStart w:id="30" w:name="_Toc242028068"/>
       <w:r>
         <w:t xml:space="preserve">Figure </w:t>
       </w:r>
@@ -14012,7 +14012,7 @@
       <w:pPr>
         <w:pStyle w:val="Heading2"/>
       </w:pPr>
-      <w:bookmarkStart w:id="31" w:name="_Toc242027342"/>
+      <w:bookmarkStart w:id="31" w:name="_Toc242028238"/>
       <w:r>
         <w:t>4.2 Frame: Person</w:t>
       </w:r>
@@ -14030,7 +14030,7 @@
         <w:spacing w:before="80"/>
         <w:jc w:val="center"/>
       </w:pPr>
-      <w:bookmarkStart w:id="32" w:name="_Toc242027185"/>
+      <w:bookmarkStart w:id="32" w:name="_Toc242028081"/>
       <w:r>
         <w:t xml:space="preserve">Table </w:t>
       </w:r>
@@ -14628,7 +14628,7 @@
       <w:pPr>
         <w:pStyle w:val="Heading2"/>
       </w:pPr>
-      <w:bookmarkStart w:id="33" w:name="_Toc242027343"/>
+      <w:bookmarkStart w:id="33" w:name="_Toc242028239"/>
       <w:r>
         <w:t>4.3 Frame: Student</w:t>
       </w:r>
@@ -14646,7 +14646,7 @@
         <w:spacing w:before="80"/>
         <w:jc w:val="center"/>
       </w:pPr>
-      <w:bookmarkStart w:id="34" w:name="_Toc242027186"/>
+      <w:bookmarkStart w:id="34" w:name="_Toc242028082"/>
       <w:r>
         <w:lastRenderedPageBreak/>
         <w:t xml:space="preserve">Table </w:t>
@@ -15040,7 +15040,7 @@
       <w:pPr>
         <w:pStyle w:val="Heading2"/>
       </w:pPr>
-      <w:bookmarkStart w:id="35" w:name="_Toc242027344"/>
+      <w:bookmarkStart w:id="35" w:name="_Toc242028240"/>
       <w:r>
         <w:t>4.4 Frame: Faculty / Staff</w:t>
       </w:r>
@@ -15058,7 +15058,7 @@
         <w:spacing w:before="80"/>
         <w:jc w:val="center"/>
       </w:pPr>
-      <w:bookmarkStart w:id="36" w:name="_Toc242027187"/>
+      <w:bookmarkStart w:id="36" w:name="_Toc242028083"/>
       <w:r>
         <w:t xml:space="preserve">Table </w:t>
       </w:r>
@@ -15667,7 +15667,7 @@
       <w:pPr>
         <w:pStyle w:val="Heading2"/>
       </w:pPr>
-      <w:bookmarkStart w:id="37" w:name="_Toc242027345"/>
+      <w:bookmarkStart w:id="37" w:name="_Toc242028241"/>
       <w:r>
         <w:t>4.5 Frame: Visitor</w:t>
       </w:r>
@@ -15680,7 +15680,7 @@
         <w:spacing w:before="80"/>
         <w:jc w:val="center"/>
       </w:pPr>
-      <w:bookmarkStart w:id="38" w:name="_Toc242027188"/>
+      <w:bookmarkStart w:id="38" w:name="_Toc242028084"/>
       <w:r>
         <w:t xml:space="preserve">Table </w:t>
       </w:r>
@@ -16084,7 +16084,7 @@
       <w:pPr>
         <w:pStyle w:val="Heading2"/>
       </w:pPr>
-      <w:bookmarkStart w:id="39" w:name="_Toc242027346"/>
+      <w:bookmarkStart w:id="39" w:name="_Toc242028242"/>
       <w:r>
         <w:t>4.6 Frame: Vehicle</w:t>
       </w:r>
@@ -16097,7 +16097,7 @@
         <w:spacing w:before="80"/>
         <w:jc w:val="center"/>
       </w:pPr>
-      <w:bookmarkStart w:id="40" w:name="_Toc242027189"/>
+      <w:bookmarkStart w:id="40" w:name="_Toc242028085"/>
       <w:r>
         <w:t xml:space="preserve">Table </w:t>
       </w:r>
@@ -16501,7 +16501,7 @@
       <w:pPr>
         <w:pStyle w:val="Heading2"/>
       </w:pPr>
-      <w:bookmarkStart w:id="41" w:name="_Toc242027347"/>
+      <w:bookmarkStart w:id="41" w:name="_Toc242028243"/>
       <w:r>
         <w:t>4.7 Frame: Parking permit</w:t>
       </w:r>
@@ -16514,7 +16514,7 @@
         <w:spacing w:before="80"/>
         <w:jc w:val="center"/>
       </w:pPr>
-      <w:bookmarkStart w:id="42" w:name="_Toc242027190"/>
+      <w:bookmarkStart w:id="42" w:name="_Toc242028086"/>
       <w:r>
         <w:t xml:space="preserve">Table </w:t>
       </w:r>
@@ -17123,7 +17123,7 @@
       <w:pPr>
         <w:pStyle w:val="Heading2"/>
       </w:pPr>
-      <w:bookmarkStart w:id="43" w:name="_Toc242027348"/>
+      <w:bookmarkStart w:id="43" w:name="_Toc242028244"/>
       <w:r>
         <w:t>4.8 Frame: Parking space</w:t>
       </w:r>
@@ -17141,7 +17141,7 @@
         <w:spacing w:before="80"/>
         <w:jc w:val="center"/>
       </w:pPr>
-      <w:bookmarkStart w:id="44" w:name="_Toc242027191"/>
+      <w:bookmarkStart w:id="44" w:name="_Toc242028087"/>
       <w:r>
         <w:lastRenderedPageBreak/>
         <w:t xml:space="preserve">Table </w:t>
@@ -18312,7 +18312,7 @@
       <w:pPr>
         <w:pStyle w:val="Heading2"/>
       </w:pPr>
-      <w:bookmarkStart w:id="45" w:name="_Toc242027349"/>
+      <w:bookmarkStart w:id="45" w:name="_Toc242028245"/>
       <w:r>
         <w:t>4.9 Frame: Parking zone</w:t>
       </w:r>
@@ -18330,7 +18330,7 @@
         <w:spacing w:before="80"/>
         <w:jc w:val="center"/>
       </w:pPr>
-      <w:bookmarkStart w:id="46" w:name="_Toc242027192"/>
+      <w:bookmarkStart w:id="46" w:name="_Toc242028088"/>
       <w:r>
         <w:t xml:space="preserve">Table </w:t>
       </w:r>
@@ -19050,7 +19050,7 @@
       <w:pPr>
         <w:pStyle w:val="Heading2"/>
       </w:pPr>
-      <w:bookmarkStart w:id="47" w:name="_Toc242027350"/>
+      <w:bookmarkStart w:id="47" w:name="_Toc242028246"/>
       <w:r>
         <w:t>4.10 Frame: Reservation</w:t>
       </w:r>
@@ -19068,7 +19068,7 @@
         <w:spacing w:before="80"/>
         <w:jc w:val="center"/>
       </w:pPr>
-      <w:bookmarkStart w:id="48" w:name="_Toc242027193"/>
+      <w:bookmarkStart w:id="48" w:name="_Toc242028089"/>
       <w:r>
         <w:t xml:space="preserve">Table </w:t>
       </w:r>
@@ -19566,7 +19566,7 @@
       <w:pPr>
         <w:pStyle w:val="Heading2"/>
       </w:pPr>
-      <w:bookmarkStart w:id="49" w:name="_Toc242027351"/>
+      <w:bookmarkStart w:id="49" w:name="_Toc242028247"/>
       <w:r>
         <w:t>4.11 Script / event sequence</w:t>
       </w:r>
@@ -19592,7 +19592,7 @@
         </w:rPr>
         <w:lastRenderedPageBreak/>
         <w:drawing>
-          <wp:inline distT="0" distB="0" distL="0" distR="0" wp14:anchorId="4483F306" wp14:editId="150EFC3B">
+          <wp:inline distT="0" distB="0" distL="0" distR="0" wp14:anchorId="3DFA0921" wp14:editId="3C3D1998">
             <wp:extent cx="5617475" cy="2231140"/>
             <wp:effectExtent l="0" t="0" r="0" b="0"/>
             <wp:docPr id="3" name="Picture 3"/>
@@ -19634,7 +19634,7 @@
         <w:spacing w:before="80" w:after="160"/>
         <w:jc w:val="center"/>
       </w:pPr>
-      <w:bookmarkStart w:id="50" w:name="_Toc242027173"/>
+      <w:bookmarkStart w:id="50" w:name="_Toc242028069"/>
       <w:r>
         <w:t xml:space="preserve">Figure </w:t>
       </w:r>
@@ -19708,7 +19708,7 @@
       <w:pPr>
         <w:pStyle w:val="Heading1"/>
       </w:pPr>
-      <w:bookmarkStart w:id="51" w:name="_Toc242027352"/>
+      <w:bookmarkStart w:id="51" w:name="_Toc242028248"/>
       <w:r>
         <w:t>Chapter 5: Semantic network</w:t>
       </w:r>
@@ -19723,7 +19723,7 @@
       <w:pPr>
         <w:pStyle w:val="Heading2"/>
       </w:pPr>
-      <w:bookmarkStart w:id="52" w:name="_Toc242027353"/>
+      <w:bookmarkStart w:id="52" w:name="_Toc242028249"/>
       <w:r>
         <w:t>5.1 Semantic network design</w:t>
       </w:r>
@@ -19745,7 +19745,7 @@
           <w:noProof/>
         </w:rPr>
         <w:drawing>
-          <wp:inline distT="0" distB="0" distL="0" distR="0" wp14:anchorId="7AEF2F1C" wp14:editId="44EF308B">
+          <wp:inline distT="0" distB="0" distL="0" distR="0" wp14:anchorId="0F0BB78F" wp14:editId="4F8DAC89">
             <wp:extent cx="5687579" cy="2590805"/>
             <wp:effectExtent l="0" t="0" r="0" b="0"/>
             <wp:docPr id="4" name="Picture 4"/>
@@ -19787,7 +19787,7 @@
         <w:spacing w:before="80" w:after="160"/>
         <w:jc w:val="center"/>
       </w:pPr>
-      <w:bookmarkStart w:id="53" w:name="_Toc242027174"/>
+      <w:bookmarkStart w:id="53" w:name="_Toc242028070"/>
       <w:r>
         <w:t xml:space="preserve">Figure </w:t>
       </w:r>
@@ -19826,7 +19826,7 @@
         </w:rPr>
         <w:lastRenderedPageBreak/>
         <w:drawing>
-          <wp:inline distT="0" distB="0" distL="0" distR="0" wp14:anchorId="27262994" wp14:editId="7E15C783">
+          <wp:inline distT="0" distB="0" distL="0" distR="0" wp14:anchorId="0920D778" wp14:editId="4BF6C5F3">
             <wp:extent cx="5617475" cy="2682245"/>
             <wp:effectExtent l="0" t="0" r="0" b="0"/>
             <wp:docPr id="5" name="Picture 5"/>
@@ -19868,7 +19868,7 @@
         <w:spacing w:before="80" w:after="160"/>
         <w:jc w:val="center"/>
       </w:pPr>
-      <w:bookmarkStart w:id="54" w:name="_Toc242027175"/>
+      <w:bookmarkStart w:id="54" w:name="_Toc242028071"/>
       <w:r>
         <w:t xml:space="preserve">Figure </w:t>
       </w:r>
@@ -19899,7 +19899,7 @@
       <w:pPr>
         <w:pStyle w:val="Heading2"/>
       </w:pPr>
-      <w:bookmarkStart w:id="55" w:name="_Toc242027354"/>
+      <w:bookmarkStart w:id="55" w:name="_Toc242028250"/>
       <w:r>
         <w:t>5.2 Relationship types</w:t>
       </w:r>
@@ -19912,7 +19912,7 @@
         <w:spacing w:before="80"/>
         <w:jc w:val="center"/>
       </w:pPr>
-      <w:bookmarkStart w:id="56" w:name="_Toc242027194"/>
+      <w:bookmarkStart w:id="56" w:name="_Toc242028090"/>
       <w:r>
         <w:t xml:space="preserve">Table </w:t>
       </w:r>
@@ -20659,7 +20659,7 @@
       <w:pPr>
         <w:pStyle w:val="Heading2"/>
       </w:pPr>
-      <w:bookmarkStart w:id="57" w:name="_Toc242027355"/>
+      <w:bookmarkStart w:id="57" w:name="_Toc242028251"/>
       <w:r>
         <w:t>5.3 Semantic network walkthrough</w:t>
       </w:r>
@@ -20767,7 +20767,7 @@
       <w:pPr>
         <w:pStyle w:val="Heading1"/>
       </w:pPr>
-      <w:bookmarkStart w:id="58" w:name="_Toc242027356"/>
+      <w:bookmarkStart w:id="58" w:name="_Toc242028252"/>
       <w:r>
         <w:lastRenderedPageBreak/>
         <w:t>Chapter 6: First-order logic (FOL)</w:t>
@@ -20783,7 +20783,7 @@
       <w:pPr>
         <w:pStyle w:val="Heading2"/>
       </w:pPr>
-      <w:bookmarkStart w:id="59" w:name="_Toc242027357"/>
+      <w:bookmarkStart w:id="59" w:name="_Toc242028253"/>
       <w:r>
         <w:t>6.1 FOL vocabulary</w:t>
       </w:r>
@@ -20849,7 +20849,7 @@
       <w:pPr>
         <w:pStyle w:val="Heading2"/>
       </w:pPr>
-      <w:bookmarkStart w:id="60" w:name="_Toc242027358"/>
+      <w:bookmarkStart w:id="60" w:name="_Toc242028254"/>
       <w:r>
         <w:t>6.2 Domain facts</w:t>
       </w:r>
@@ -20904,7 +20904,7 @@
       <w:pPr>
         <w:pStyle w:val="Heading2"/>
       </w:pPr>
-      <w:bookmarkStart w:id="61" w:name="_Toc242027359"/>
+      <w:bookmarkStart w:id="61" w:name="_Toc242028255"/>
       <w:r>
         <w:t>6.3 FOL rules</w:t>
       </w:r>
@@ -20922,7 +20922,7 @@
         <w:spacing w:before="80"/>
         <w:jc w:val="center"/>
       </w:pPr>
-      <w:bookmarkStart w:id="62" w:name="_Toc242027195"/>
+      <w:bookmarkStart w:id="62" w:name="_Toc242028091"/>
       <w:r>
         <w:t xml:space="preserve">Table </w:t>
       </w:r>
@@ -21940,7 +21940,7 @@
       <w:pPr>
         <w:pStyle w:val="Heading2"/>
       </w:pPr>
-      <w:bookmarkStart w:id="63" w:name="_Toc242027360"/>
+      <w:bookmarkStart w:id="63" w:name="_Toc242028256"/>
       <w:r>
         <w:t>6.4 Quantifier usage</w:t>
       </w:r>
@@ -21963,7 +21963,7 @@
         <w:spacing w:before="80"/>
         <w:jc w:val="center"/>
       </w:pPr>
-      <w:bookmarkStart w:id="64" w:name="_Toc242027196"/>
+      <w:bookmarkStart w:id="64" w:name="_Toc242028092"/>
       <w:r>
         <w:t xml:space="preserve">Table </w:t>
       </w:r>
@@ -23184,7 +23184,7 @@
       <w:pPr>
         <w:pStyle w:val="Heading2"/>
       </w:pPr>
-      <w:bookmarkStart w:id="65" w:name="_Toc242027361"/>
+      <w:bookmarkStart w:id="65" w:name="_Toc242028257"/>
       <w:r>
         <w:lastRenderedPageBreak/>
         <w:t>6.5 Consistency verification</w:t>
@@ -23203,7 +23203,7 @@
       <w:pPr>
         <w:pStyle w:val="Heading1"/>
       </w:pPr>
-      <w:bookmarkStart w:id="66" w:name="_Toc242027362"/>
+      <w:bookmarkStart w:id="66" w:name="_Toc242028258"/>
       <w:r>
         <w:t>Chapter 7: Description logic</w:t>
       </w:r>
@@ -23218,7 +23218,7 @@
       <w:pPr>
         <w:pStyle w:val="Heading2"/>
       </w:pPr>
-      <w:bookmarkStart w:id="67" w:name="_Toc242027363"/>
+      <w:bookmarkStart w:id="67" w:name="_Toc242028259"/>
       <w:r>
         <w:t>7.1 DL concepts</w:t>
       </w:r>
@@ -23233,7 +23233,7 @@
       <w:pPr>
         <w:pStyle w:val="Heading2"/>
       </w:pPr>
-      <w:bookmarkStart w:id="68" w:name="_Toc242027364"/>
+      <w:bookmarkStart w:id="68" w:name="_Toc242028260"/>
       <w:r>
         <w:t>7.2 DL roles</w:t>
       </w:r>
@@ -23251,7 +23251,7 @@
         <w:spacing w:before="80"/>
         <w:jc w:val="center"/>
       </w:pPr>
-      <w:bookmarkStart w:id="69" w:name="_Toc242027197"/>
+      <w:bookmarkStart w:id="69" w:name="_Toc242028093"/>
       <w:r>
         <w:t xml:space="preserve">Table </w:t>
       </w:r>
@@ -23860,7 +23860,7 @@
       <w:pPr>
         <w:pStyle w:val="Heading2"/>
       </w:pPr>
-      <w:bookmarkStart w:id="70" w:name="_Toc242027365"/>
+      <w:bookmarkStart w:id="70" w:name="_Toc242028261"/>
       <w:r>
         <w:t>7.3 Subsumption axioms</w:t>
       </w:r>
@@ -23878,7 +23878,7 @@
         <w:spacing w:before="80"/>
         <w:jc w:val="center"/>
       </w:pPr>
-      <w:bookmarkStart w:id="71" w:name="_Toc242027198"/>
+      <w:bookmarkStart w:id="71" w:name="_Toc242028094"/>
       <w:r>
         <w:t xml:space="preserve">Table </w:t>
       </w:r>
@@ -24412,7 +24412,7 @@
       <w:pPr>
         <w:pStyle w:val="Heading2"/>
       </w:pPr>
-      <w:bookmarkStart w:id="72" w:name="_Toc242027366"/>
+      <w:bookmarkStart w:id="72" w:name="_Toc242028262"/>
       <w:r>
         <w:t>7.4 Disjointness axioms</w:t>
       </w:r>
@@ -24430,7 +24430,7 @@
         <w:spacing w:before="80"/>
         <w:jc w:val="center"/>
       </w:pPr>
-      <w:bookmarkStart w:id="73" w:name="_Toc242027199"/>
+      <w:bookmarkStart w:id="73" w:name="_Toc242028095"/>
       <w:r>
         <w:lastRenderedPageBreak/>
         <w:t xml:space="preserve">Table </w:t>
@@ -24960,7 +24960,7 @@
       <w:pPr>
         <w:pStyle w:val="Heading2"/>
       </w:pPr>
-      <w:bookmarkStart w:id="74" w:name="_Toc242027367"/>
+      <w:bookmarkStart w:id="74" w:name="_Toc242028263"/>
       <w:r>
         <w:t>7.5 Membership assertions</w:t>
       </w:r>
@@ -24975,7 +24975,7 @@
       <w:pPr>
         <w:pStyle w:val="Heading2"/>
       </w:pPr>
-      <w:bookmarkStart w:id="75" w:name="_Toc242027368"/>
+      <w:bookmarkStart w:id="75" w:name="_Toc242028264"/>
       <w:r>
         <w:t>7.6 Existential and universal restrictions</w:t>
       </w:r>
@@ -24988,7 +24988,7 @@
         <w:spacing w:before="80"/>
         <w:jc w:val="center"/>
       </w:pPr>
-      <w:bookmarkStart w:id="76" w:name="_Toc242027200"/>
+      <w:bookmarkStart w:id="76" w:name="_Toc242028096"/>
       <w:r>
         <w:t xml:space="preserve">Table </w:t>
       </w:r>
@@ -25531,7 +25531,7 @@
         <w:spacing w:before="80"/>
         <w:jc w:val="center"/>
       </w:pPr>
-      <w:bookmarkStart w:id="77" w:name="_Toc242027201"/>
+      <w:bookmarkStart w:id="77" w:name="_Toc242028097"/>
       <w:r>
         <w:t xml:space="preserve">Table </w:t>
       </w:r>
@@ -26002,7 +26002,7 @@
       <w:pPr>
         <w:pStyle w:val="Heading2"/>
       </w:pPr>
-      <w:bookmarkStart w:id="78" w:name="_Toc242027369"/>
+      <w:bookmarkStart w:id="78" w:name="_Toc242028265"/>
       <w:r>
         <w:t>7.7 DL interpretation</w:t>
       </w:r>
@@ -26031,7 +26031,7 @@
       <w:pPr>
         <w:pStyle w:val="Heading1"/>
       </w:pPr>
-      <w:bookmarkStart w:id="79" w:name="_Toc242027370"/>
+      <w:bookmarkStart w:id="79" w:name="_Toc242028266"/>
       <w:r>
         <w:t>Chapter 8: Knowledge base and Horn clauses</w:t>
       </w:r>
@@ -26046,7 +26046,7 @@
       <w:pPr>
         <w:pStyle w:val="Heading2"/>
       </w:pPr>
-      <w:bookmarkStart w:id="80" w:name="_Toc242027371"/>
+      <w:bookmarkStart w:id="80" w:name="_Toc242028267"/>
       <w:r>
         <w:t>8.1 Knowledge base</w:t>
       </w:r>
@@ -26061,7 +26061,7 @@
       <w:pPr>
         <w:pStyle w:val="Heading2"/>
       </w:pPr>
-      <w:bookmarkStart w:id="81" w:name="_Toc242027372"/>
+      <w:bookmarkStart w:id="81" w:name="_Toc242028268"/>
       <w:r>
         <w:t>8.2 Facts</w:t>
       </w:r>
@@ -26147,7 +26147,7 @@
       <w:pPr>
         <w:pStyle w:val="Heading2"/>
       </w:pPr>
-      <w:bookmarkStart w:id="82" w:name="_Toc242027373"/>
+      <w:bookmarkStart w:id="82" w:name="_Toc242028269"/>
       <w:r>
         <w:t>8.3 Rules</w:t>
       </w:r>
@@ -26175,7 +26175,7 @@
         <w:spacing w:before="80"/>
         <w:jc w:val="center"/>
       </w:pPr>
-      <w:bookmarkStart w:id="83" w:name="_Toc242027202"/>
+      <w:bookmarkStart w:id="83" w:name="_Toc242028098"/>
       <w:r>
         <w:t xml:space="preserve">Table </w:t>
       </w:r>
@@ -28653,7 +28653,7 @@
       <w:pPr>
         <w:pStyle w:val="Heading2"/>
       </w:pPr>
-      <w:bookmarkStart w:id="84" w:name="_Toc242027374"/>
+      <w:bookmarkStart w:id="84" w:name="_Toc242028270"/>
       <w:r>
         <w:t>8.4 Horn clause conversion</w:t>
       </w:r>
@@ -28720,7 +28720,7 @@
       <w:pPr>
         <w:pStyle w:val="Heading1"/>
       </w:pPr>
-      <w:bookmarkStart w:id="85" w:name="_Toc242027375"/>
+      <w:bookmarkStart w:id="85" w:name="_Toc242028271"/>
       <w:r>
         <w:t>Chapter 9: Inference engine: forward and backward chaining</w:t>
       </w:r>
@@ -28735,7 +28735,7 @@
       <w:pPr>
         <w:pStyle w:val="Heading2"/>
       </w:pPr>
-      <w:bookmarkStart w:id="86" w:name="_Toc242027376"/>
+      <w:bookmarkStart w:id="86" w:name="_Toc242028272"/>
       <w:r>
         <w:t>9.1 Inference engine architecture</w:t>
       </w:r>
@@ -28752,7 +28752,7 @@
           <w:noProof/>
         </w:rPr>
         <w:drawing>
-          <wp:inline distT="0" distB="0" distL="0" distR="0" wp14:anchorId="2493E800" wp14:editId="593801C5">
+          <wp:inline distT="0" distB="0" distL="0" distR="0" wp14:anchorId="5514CD53" wp14:editId="1A15BF06">
             <wp:extent cx="5724155" cy="2045212"/>
             <wp:effectExtent l="0" t="0" r="0" b="0"/>
             <wp:docPr id="6" name="Picture 6"/>
@@ -28794,7 +28794,7 @@
         <w:spacing w:before="80" w:after="160"/>
         <w:jc w:val="center"/>
       </w:pPr>
-      <w:bookmarkStart w:id="87" w:name="_Toc242027176"/>
+      <w:bookmarkStart w:id="87" w:name="_Toc242028072"/>
       <w:r>
         <w:t xml:space="preserve">Figure </w:t>
       </w:r>
@@ -28830,7 +28830,7 @@
       <w:pPr>
         <w:pStyle w:val="Heading2"/>
       </w:pPr>
-      <w:bookmarkStart w:id="88" w:name="_Toc242027377"/>
+      <w:bookmarkStart w:id="88" w:name="_Toc242028273"/>
       <w:r>
         <w:t>9.2 Forward chaining algorithm</w:t>
       </w:r>
@@ -28957,7 +28957,7 @@
       <w:pPr>
         <w:pStyle w:val="Heading2"/>
       </w:pPr>
-      <w:bookmarkStart w:id="89" w:name="_Toc242027378"/>
+      <w:bookmarkStart w:id="89" w:name="_Toc242028274"/>
       <w:r>
         <w:t>9.3 Forward chaining trace</w:t>
       </w:r>
@@ -28975,7 +28975,7 @@
         <w:spacing w:before="80"/>
         <w:jc w:val="center"/>
       </w:pPr>
-      <w:bookmarkStart w:id="90" w:name="_Toc242027203"/>
+      <w:bookmarkStart w:id="90" w:name="_Toc242028099"/>
       <w:r>
         <w:t xml:space="preserve">Table </w:t>
       </w:r>
@@ -30265,7 +30265,7 @@
         <w:spacing w:before="80"/>
         <w:jc w:val="center"/>
       </w:pPr>
-      <w:bookmarkStart w:id="91" w:name="_Toc242027204"/>
+      <w:bookmarkStart w:id="91" w:name="_Toc242028100"/>
       <w:r>
         <w:t xml:space="preserve">Table </w:t>
       </w:r>
@@ -30609,7 +30609,7 @@
               <w:rPr>
                 <w:sz w:val="16"/>
               </w:rPr>
-              <w:t>16</w:t>
+              <w:t>17</w:t>
             </w:r>
           </w:p>
         </w:tc>
@@ -30735,7 +30735,7 @@
               <w:rPr>
                 <w:sz w:val="16"/>
               </w:rPr>
-              <w:t>22</w:t>
+              <w:t>20</w:t>
             </w:r>
           </w:p>
         </w:tc>
@@ -30861,7 +30861,7 @@
               <w:rPr>
                 <w:sz w:val="16"/>
               </w:rPr>
-              <w:t>25</w:t>
+              <w:t>24</w:t>
             </w:r>
           </w:p>
         </w:tc>
@@ -30987,7 +30987,7 @@
               <w:rPr>
                 <w:sz w:val="16"/>
               </w:rPr>
-              <w:t>42</w:t>
+              <w:t>40</w:t>
             </w:r>
           </w:p>
         </w:tc>
@@ -31239,7 +31239,7 @@
               <w:rPr>
                 <w:sz w:val="16"/>
               </w:rPr>
-              <w:t>65</w:t>
+              <w:t>72</w:t>
             </w:r>
           </w:p>
         </w:tc>
@@ -31365,7 +31365,7 @@
               <w:rPr>
                 <w:sz w:val="16"/>
               </w:rPr>
-              <w:t>78</w:t>
+              <w:t>77</w:t>
             </w:r>
           </w:p>
         </w:tc>
@@ -31491,7 +31491,7 @@
               <w:rPr>
                 <w:sz w:val="16"/>
               </w:rPr>
-              <w:t>94</w:t>
+              <w:t>92</w:t>
             </w:r>
           </w:p>
         </w:tc>
@@ -31744,7 +31744,7 @@
         <w:spacing w:before="80"/>
         <w:jc w:val="center"/>
       </w:pPr>
-      <w:bookmarkStart w:id="92" w:name="_Toc242027205"/>
+      <w:bookmarkStart w:id="92" w:name="_Toc242028101"/>
       <w:r>
         <w:t xml:space="preserve">Table </w:t>
       </w:r>
@@ -32613,7 +32613,7 @@
       <w:pPr>
         <w:pStyle w:val="Heading2"/>
       </w:pPr>
-      <w:bookmarkStart w:id="93" w:name="_Toc242027379"/>
+      <w:bookmarkStart w:id="93" w:name="_Toc242028275"/>
       <w:r>
         <w:t>9.4 Backward chaining algorithm</w:t>
       </w:r>
@@ -32720,7 +32720,7 @@
       <w:pPr>
         <w:pStyle w:val="Heading2"/>
       </w:pPr>
-      <w:bookmarkStart w:id="94" w:name="_Toc242027380"/>
+      <w:bookmarkStart w:id="94" w:name="_Toc242028276"/>
       <w:r>
         <w:t>9.5 Backward chaining trace</w:t>
       </w:r>
@@ -32748,7 +32748,7 @@
         <w:spacing w:before="80"/>
         <w:jc w:val="center"/>
       </w:pPr>
-      <w:bookmarkStart w:id="95" w:name="_Toc242027206"/>
+      <w:bookmarkStart w:id="95" w:name="_Toc242028102"/>
       <w:r>
         <w:t xml:space="preserve">Table </w:t>
       </w:r>
@@ -34238,7 +34238,7 @@
       <w:pPr>
         <w:pStyle w:val="Heading2"/>
       </w:pPr>
-      <w:bookmarkStart w:id="96" w:name="_Toc242027381"/>
+      <w:bookmarkStart w:id="96" w:name="_Toc242028277"/>
       <w:r>
         <w:t>9.6 Forward vs. backward chaining</w:t>
       </w:r>
@@ -34256,7 +34256,7 @@
       <w:pPr>
         <w:pStyle w:val="Heading1"/>
       </w:pPr>
-      <w:bookmarkStart w:id="97" w:name="_Toc242027382"/>
+      <w:bookmarkStart w:id="97" w:name="_Toc242028278"/>
       <w:r>
         <w:t>Chapter 10: System implementation</w:t>
       </w:r>
@@ -34271,7 +34271,7 @@
       <w:pPr>
         <w:pStyle w:val="Heading2"/>
       </w:pPr>
-      <w:bookmarkStart w:id="98" w:name="_Toc242027383"/>
+      <w:bookmarkStart w:id="98" w:name="_Toc242028279"/>
       <w:r>
         <w:t>10.1 Technology stack</w:t>
       </w:r>
@@ -34289,7 +34289,7 @@
       <w:pPr>
         <w:pStyle w:val="Heading2"/>
       </w:pPr>
-      <w:bookmarkStart w:id="99" w:name="_Toc242027384"/>
+      <w:bookmarkStart w:id="99" w:name="_Toc242028280"/>
       <w:r>
         <w:t>10.2 Project structure</w:t>
       </w:r>
@@ -34354,7 +34354,7 @@
       </w:r>
       <w:r>
         <w:br/>
-        <w:t xml:space="preserve">  tests/        test_consistency.py, test_core.py, test_reasoning.py, test_representation.py, test_site_export.py</w:t>
+        <w:t xml:space="preserve">  tests/        test_consistency.py, test_core.py, test_prolog.py, test_reasoning.py, test_representation.py, test_site_export.py</w:t>
       </w:r>
       <w:r>
         <w:br/>
@@ -34383,7 +34383,7 @@
       <w:pPr>
         <w:pStyle w:val="Heading2"/>
       </w:pPr>
-      <w:bookmarkStart w:id="100" w:name="_Toc242027385"/>
+      <w:bookmarkStart w:id="100" w:name="_Toc242028281"/>
       <w:r>
         <w:t>10.3 Knowledge base implementation</w:t>
       </w:r>
@@ -34398,7 +34398,7 @@
       <w:pPr>
         <w:pStyle w:val="Heading2"/>
       </w:pPr>
-      <w:bookmarkStart w:id="101" w:name="_Toc242027386"/>
+      <w:bookmarkStart w:id="101" w:name="_Toc242028282"/>
       <w:r>
         <w:t>10.4 Frame implementation</w:t>
       </w:r>
@@ -34413,7 +34413,7 @@
       <w:pPr>
         <w:pStyle w:val="Heading2"/>
       </w:pPr>
-      <w:bookmarkStart w:id="102" w:name="_Toc242027387"/>
+      <w:bookmarkStart w:id="102" w:name="_Toc242028283"/>
       <w:r>
         <w:t>10.5 Forward chaining implementation</w:t>
       </w:r>
@@ -34499,7 +34499,7 @@
       <w:pPr>
         <w:pStyle w:val="Heading2"/>
       </w:pPr>
-      <w:bookmarkStart w:id="103" w:name="_Toc242027388"/>
+      <w:bookmarkStart w:id="103" w:name="_Toc242028284"/>
       <w:r>
         <w:t>10.6 Backward chaining implementation</w:t>
       </w:r>
@@ -34578,7 +34578,7 @@
       <w:pPr>
         <w:pStyle w:val="Heading2"/>
       </w:pPr>
-      <w:bookmarkStart w:id="104" w:name="_Toc242027389"/>
+      <w:bookmarkStart w:id="104" w:name="_Toc242028285"/>
       <w:r>
         <w:t>10.7 User interaction / CLI</w:t>
       </w:r>
@@ -34617,7 +34617,7 @@
       <w:pPr>
         <w:pStyle w:val="Heading2"/>
       </w:pPr>
-      <w:bookmarkStart w:id="105" w:name="_Toc242027390"/>
+      <w:bookmarkStart w:id="105" w:name="_Toc242028286"/>
       <w:r>
         <w:t>10.8 Sample execution</w:t>
       </w:r>
@@ -34691,7 +34691,7 @@
       <w:pPr>
         <w:pStyle w:val="Heading2"/>
       </w:pPr>
-      <w:bookmarkStart w:id="106" w:name="_Toc242027391"/>
+      <w:bookmarkStart w:id="106" w:name="_Toc242028287"/>
       <w:r>
         <w:t>10.9 Project website</w:t>
       </w:r>
@@ -34737,7 +34737,7 @@
       <w:pPr>
         <w:pStyle w:val="Heading1"/>
       </w:pPr>
-      <w:bookmarkStart w:id="107" w:name="_Toc242027392"/>
+      <w:bookmarkStart w:id="107" w:name="_Toc242028288"/>
       <w:r>
         <w:t>Chapter 11: Testing and results</w:t>
       </w:r>
@@ -34752,7 +34752,7 @@
       <w:pPr>
         <w:pStyle w:val="Heading2"/>
       </w:pPr>
-      <w:bookmarkStart w:id="108" w:name="_Toc242027393"/>
+      <w:bookmarkStart w:id="108" w:name="_Toc242028289"/>
       <w:r>
         <w:t>11.1 Testing strategy</w:t>
       </w:r>
@@ -34767,7 +34767,7 @@
       <w:pPr>
         <w:pStyle w:val="Heading2"/>
       </w:pPr>
-      <w:bookmarkStart w:id="109" w:name="_Toc242027394"/>
+      <w:bookmarkStart w:id="109" w:name="_Toc242028290"/>
       <w:r>
         <w:t>11.2 Test cases</w:t>
       </w:r>
@@ -34780,7 +34780,7 @@
         <w:spacing w:before="80"/>
         <w:jc w:val="center"/>
       </w:pPr>
-      <w:bookmarkStart w:id="110" w:name="_Toc242027207"/>
+      <w:bookmarkStart w:id="110" w:name="_Toc242028103"/>
       <w:r>
         <w:t xml:space="preserve">Table </w:t>
       </w:r>
@@ -36500,7 +36500,7 @@
       <w:pPr>
         <w:pStyle w:val="Heading2"/>
       </w:pPr>
-      <w:bookmarkStart w:id="111" w:name="_Toc242027395"/>
+      <w:bookmarkStart w:id="111" w:name="_Toc242028291"/>
       <w:r>
         <w:t>11.3 Results analysis</w:t>
       </w:r>
@@ -36518,7 +36518,7 @@
       <w:pPr>
         <w:pStyle w:val="Heading2"/>
       </w:pPr>
-      <w:bookmarkStart w:id="112" w:name="_Toc242027396"/>
+      <w:bookmarkStart w:id="112" w:name="_Toc242028292"/>
       <w:r>
         <w:t>11.4 Inference accuracy / consistency</w:t>
       </w:r>
@@ -36561,7 +36561,17 @@
         <w:pStyle w:val="ListBullet"/>
       </w:pPr>
       <w:r>
-        <w:t>The generated Prolog program is parsed back by a unit test and contains exactly the same facts and rules.</w:t>
+        <w:t xml:space="preserve">The generated Prolog program is parsed back by a unit test and contains exactly the same facts and rules. Loaded in SWI-Prolog 10, it proves exactly the conclusions the Python forward chainer derives in all 13 scenarios, including the IC4 violation in TC12, and it loads without warnings. </w:t>
+      </w:r>
+      <w:r>
+        <w:rPr>
+          <w:rFonts w:ascii="Consolas" w:hAnsi="Consolas"/>
+          <w:sz w:val="19"/>
+        </w:rPr>
+        <w:t>python main.py prolog</w:t>
+      </w:r>
+      <w:r>
+        <w:t xml:space="preserve"> repeats this check, and GitHub Actions runs it on every push.</w:t>
       </w:r>
     </w:p>
     <w:p>
@@ -36569,7 +36579,7 @@
         <w:pStyle w:val="ListBullet"/>
       </w:pPr>
       <w:r>
-        <w:t>The suite has 68 unit tests, all passing.</w:t>
+        <w:t>The suite has 70 unit tests, all passing.</w:t>
       </w:r>
     </w:p>
     <w:p>
@@ -36581,7 +36591,7 @@
       <w:pPr>
         <w:pStyle w:val="Heading1"/>
       </w:pPr>
-      <w:bookmarkStart w:id="113" w:name="_Toc242027397"/>
+      <w:bookmarkStart w:id="113" w:name="_Toc242028293"/>
       <w:r>
         <w:t>Chapter 12: Expressivity, tractability and design analysis</w:t>
       </w:r>
@@ -36596,7 +36606,7 @@
       <w:pPr>
         <w:pStyle w:val="Heading2"/>
       </w:pPr>
-      <w:bookmarkStart w:id="114" w:name="_Toc242027398"/>
+      <w:bookmarkStart w:id="114" w:name="_Toc242028294"/>
       <w:r>
         <w:t>12.1 Propositional logic limitations</w:t>
       </w:r>
@@ -36604,19 +36614,19 @@
     </w:p>
     <w:p>
       <w:r>
-        <w:t xml:space="preserve">Propositional logic has no objects or variables. "A student with a valid student permit may enter a student zone" must be written once for every student, permit and zone: ali_valid ∧ ali_student → ali_zone_a, and so on. With 8 people, 7 permits and 3 zones, R13 alone becomes dozens of rules, and each new student needs new ones. It also cannot say "every bay is in some zone" (F01) or compare an expiry date with today. Inference is decidable, and propositional Horn clauses can even be decided in linear time, </w:t>
-      </w:r>
-      <w:r>
-        <w:t>but the knowledge base would grow with every person and bay.</w:t>
+        <w:t xml:space="preserve">Propositional logic has no objects or variables. "A student with a valid student permit may enter a student zone" must be written once for every student, permit and zone: ali_valid ∧ ali_student → ali_zone_a, and so on. With 8 people, 7 permits and 3 zones, R13 alone becomes dozens of rules, and each new student needs new ones. It also </w:t>
+      </w:r>
+      <w:r>
+        <w:lastRenderedPageBreak/>
+        <w:t>cannot say "every bay is in some zone" (F01) or compare an expiry date with today. Inference is decidable, and propositional Horn clauses can even be decided in linear time, but the knowledge base would grow with every person and bay.</w:t>
       </w:r>
     </w:p>
     <w:p>
       <w:pPr>
         <w:pStyle w:val="Heading2"/>
       </w:pPr>
-      <w:bookmarkStart w:id="115" w:name="_Toc242027399"/>
-      <w:r>
-        <w:lastRenderedPageBreak/>
+      <w:bookmarkStart w:id="115" w:name="_Toc242028295"/>
+      <w:r>
         <w:t>12.2 FOL expressivity</w:t>
       </w:r>
       <w:bookmarkEnd w:id="115"/>
@@ -36630,7 +36640,7 @@
       <w:pPr>
         <w:pStyle w:val="Heading2"/>
       </w:pPr>
-      <w:bookmarkStart w:id="116" w:name="_Toc242027400"/>
+      <w:bookmarkStart w:id="116" w:name="_Toc242028296"/>
       <w:r>
         <w:t>12.3 FOL computational limitations</w:t>
       </w:r>
@@ -36645,7 +36655,7 @@
       <w:pPr>
         <w:pStyle w:val="Heading2"/>
       </w:pPr>
-      <w:bookmarkStart w:id="117" w:name="_Toc242027401"/>
+      <w:bookmarkStart w:id="117" w:name="_Toc242028297"/>
       <w:r>
         <w:t>12.4 Description logic trade-offs</w:t>
       </w:r>
@@ -36663,7 +36673,7 @@
       <w:pPr>
         <w:pStyle w:val="Heading2"/>
       </w:pPr>
-      <w:bookmarkStart w:id="118" w:name="_Toc242027402"/>
+      <w:bookmarkStart w:id="118" w:name="_Toc242028298"/>
       <w:r>
         <w:t>12.5 Horn clauses and tractable inference</w:t>
       </w:r>
@@ -36681,7 +36691,7 @@
       <w:pPr>
         <w:pStyle w:val="Heading2"/>
       </w:pPr>
-      <w:bookmarkStart w:id="119" w:name="_Toc242027403"/>
+      <w:bookmarkStart w:id="119" w:name="_Toc242028299"/>
       <w:r>
         <w:t>12.6 Why multi-paradigm KRR?</w:t>
       </w:r>
@@ -36699,7 +36709,7 @@
       <w:pPr>
         <w:pStyle w:val="Heading1"/>
       </w:pPr>
-      <w:bookmarkStart w:id="120" w:name="_Toc242027404"/>
+      <w:bookmarkStart w:id="120" w:name="_Toc242028300"/>
       <w:r>
         <w:t>Chapter 13: Limitations and future work</w:t>
       </w:r>
@@ -36714,7 +36724,7 @@
       <w:pPr>
         <w:pStyle w:val="Heading2"/>
       </w:pPr>
-      <w:bookmarkStart w:id="121" w:name="_Toc242027405"/>
+      <w:bookmarkStart w:id="121" w:name="_Toc242028301"/>
       <w:r>
         <w:t>13.1 Current limitations</w:t>
       </w:r>
@@ -36772,7 +36782,7 @@
       <w:pPr>
         <w:pStyle w:val="Heading2"/>
       </w:pPr>
-      <w:bookmarkStart w:id="122" w:name="_Toc242027406"/>
+      <w:bookmarkStart w:id="122" w:name="_Toc242028302"/>
       <w:r>
         <w:lastRenderedPageBreak/>
         <w:t>13.2 Future improvements</w:t>
@@ -36883,7 +36893,7 @@
       <w:pPr>
         <w:pStyle w:val="Heading1"/>
       </w:pPr>
-      <w:bookmarkStart w:id="123" w:name="_Toc242027407"/>
+      <w:bookmarkStart w:id="123" w:name="_Toc242028303"/>
       <w:r>
         <w:t>Chapter 14: Conclusion</w:t>
       </w:r>
@@ -36898,7 +36908,7 @@
       <w:pPr>
         <w:pStyle w:val="Heading2"/>
       </w:pPr>
-      <w:bookmarkStart w:id="124" w:name="_Toc242027408"/>
+      <w:bookmarkStart w:id="124" w:name="_Toc242028304"/>
       <w:r>
         <w:t>14.1 Summary</w:t>
       </w:r>
@@ -36913,7 +36923,7 @@
       <w:pPr>
         <w:pStyle w:val="Heading2"/>
       </w:pPr>
-      <w:bookmarkStart w:id="125" w:name="_Toc242027409"/>
+      <w:bookmarkStart w:id="125" w:name="_Toc242028305"/>
       <w:r>
         <w:t>14.2 Achievements</w:t>
       </w:r>
@@ -36928,7 +36938,7 @@
       <w:pPr>
         <w:pStyle w:val="Heading2"/>
       </w:pPr>
-      <w:bookmarkStart w:id="126" w:name="_Toc242027410"/>
+      <w:bookmarkStart w:id="126" w:name="_Toc242028306"/>
       <w:r>
         <w:t>14.3 Final evaluation</w:t>
       </w:r>
@@ -36943,7 +36953,7 @@
       <w:pPr>
         <w:pStyle w:val="Heading1"/>
       </w:pPr>
-      <w:bookmarkStart w:id="127" w:name="_Toc242027411"/>
+      <w:bookmarkStart w:id="127" w:name="_Toc242028307"/>
       <w:r>
         <w:t>References</w:t>
       </w:r>
@@ -37170,7 +37180,7 @@
       <w:pPr>
         <w:pStyle w:val="Heading1"/>
       </w:pPr>
-      <w:bookmarkStart w:id="128" w:name="_Toc242027412"/>
+      <w:bookmarkStart w:id="128" w:name="_Toc242028308"/>
       <w:r>
         <w:t>Appendix A: Complete knowledge base</w:t>
       </w:r>
@@ -37365,7 +37375,7 @@
       <w:pPr>
         <w:pStyle w:val="Heading1"/>
       </w:pPr>
-      <w:bookmarkStart w:id="129" w:name="_Toc242027413"/>
+      <w:bookmarkStart w:id="129" w:name="_Toc242028309"/>
       <w:r>
         <w:t>Appendix B: Complete Horn clauses</w:t>
       </w:r>
@@ -37420,7 +37430,7 @@
       </w:r>
       <w:r>
         <w:br/>
-        <w:t>allocate(X, S) :- requests(X, S, T), can_allocate(X, S), \+ loses(X, S), \+ double_booked(X).</w:t>
+        <w:t>allocate(X, S) :- requests(X, S, _T), can_allocate(X, S), \+ loses(X, S), \+ double_booked(X).</w:t>
       </w:r>
       <w:r>
         <w:br/>
@@ -37460,7 +37470,7 @@
       </w:r>
       <w:r>
         <w:br/>
-        <w:t>violation(ic3) :- allocate(X, S), space_status(S, occupied).</w:t>
+        <w:t>violation(ic3) :- allocate(_X, S), space_status(S, occupied).</w:t>
       </w:r>
       <w:r>
         <w:br/>
@@ -37520,7 +37530,7 @@
       <w:pPr>
         <w:pStyle w:val="Heading1"/>
       </w:pPr>
-      <w:bookmarkStart w:id="130" w:name="_Toc242027414"/>
+      <w:bookmarkStart w:id="130" w:name="_Toc242028310"/>
       <w:r>
         <w:t>Appendix C: Forward chaining traces</w:t>
       </w:r>
@@ -37537,91 +37547,91 @@
         <w:shd w:val="clear" w:color="auto" w:fill="F3F4F6"/>
       </w:pPr>
       <w:r>
-        <w:t xml:space="preserve">  1 C1 R01 person(sara)                            54 C3 R13 zone_access(ali, zone_a)</w:t>
+        <w:t xml:space="preserve">  1 C1 R01 person(ali)                             54 C3 R13 zone_access(ali, zone_a)</w:t>
       </w:r>
       <w:r>
         <w:br/>
-        <w:t xml:space="preserve">  2 C1 R01 person(ali)                             55 C3 R13 zone_access(zara, zone_a)</w:t>
+        <w:t xml:space="preserve">  2 C1 R01 person(usman)                           55 C3 R13 zone_access(zara, zone_a)</w:t>
       </w:r>
       <w:r>
         <w:br/>
-        <w:t xml:space="preserve">  3 C1 R01 person(usman)                           56 C3 R13 zone_access(bilal, zone_v)</w:t>
+        <w:t xml:space="preserve">  3 C1 R01 person(zara)                            56 C3 R13 zone_access(bilal, zone_v)</w:t>
       </w:r>
       <w:r>
         <w:br/>
       </w:r>
       <w:r>
-        <w:t xml:space="preserve">  4 C1 R01 person(zara)                            57 C4 R11 authorized_driver(fatima)</w:t>
+        <w:t xml:space="preserve">  4 C1 R01 person(sara)                            57 C4 R11 authorized_driver(ahmed)</w:t>
       </w:r>
       <w:r>
         <w:br/>
-        <w:t xml:space="preserve">  5 C1 R03 person(bilal)                           58 C4 R11 authorized_driver(ahmed)</w:t>
+        <w:t xml:space="preserve">  5 C1 R03 person(hina)                            58 C4 R11 authorized_driver(fatima)</w:t>
       </w:r>
       <w:r>
         <w:br/>
-        <w:t xml:space="preserve">  6 C1 R03 person(hina)                            59 C4 R13 zone_access(fatima, zone_e)</w:t>
+        <w:t xml:space="preserve">  6 C1 R03 person(bilal)                           59 C4 R13 zone_access(ahmed, zone_e)</w:t>
       </w:r>
       <w:r>
         <w:br/>
-        <w:t xml:space="preserve">  7 C1 R04 employee(ahmed)                         60 C4 R13 zone_access(ahmed, zone_e)</w:t>
+        <w:t xml:space="preserve">  7 C1 R04 employee(ahmed)                         60 C4 R13 zone_access(fatima, zone_e)</w:t>
       </w:r>
       <w:r>
         <w:br/>
-        <w:t xml:space="preserve">  8 C1 R05 employee(fatima)                        61 C4 R14 suitable_space(ali, s_a1)</w:t>
+        <w:t xml:space="preserve">  8 C1 R05 employee(fatima)                        61 C4 R14 suitable_space(zara, s_a5)</w:t>
       </w:r>
       <w:r>
         <w:br/>
       </w:r>
       <w:r>
-        <w:t xml:space="preserve">  9 C1 R06 permit_valid(p_zara)                    62 C4 R14 suitable_space(ali, s_a3)</w:t>
+        <w:t xml:space="preserve">  9 C1 R06 permit_valid(p_zara)                    62 C4 R14 suitable_space(zara, s_a3)</w:t>
       </w:r>
       <w:r>
         <w:br/>
-        <w:t xml:space="preserve"> 10 C1 R06 permit_valid(p_ahmed)                   63 C4 R14 suitable_space(ali, s_a2)</w:t>
+        <w:t xml:space="preserve"> 10 C1 R06 permit_valid(vp_bilal)                  63 C4 R14 suitable_space(zara, s_a1)</w:t>
       </w:r>
       <w:r>
         <w:br/>
-        <w:t xml:space="preserve"> 11 C1 R06 permit_valid(vp_bilal)                  64 C4 R14 suitable_space(ali, s_a5)</w:t>
+        <w:t xml:space="preserve"> 11 C1 R06 permit_valid(p_ahmed)                   64 C4 R14 suitable_space(zara, s_a2)</w:t>
       </w:r>
       <w:r>
         <w:br/>
-        <w:t xml:space="preserve"> 12 C1 R06 permit_valid(p_sara)                    65 C4 R14 suitable_space(sara, s_a1)</w:t>
+        <w:t xml:space="preserve"> 12 C1 R06 permit_valid(p_sara)                    65 C4 R14 suitable_space(ali, s_a5)</w:t>
       </w:r>
       <w:r>
         <w:br/>
-        <w:t xml:space="preserve"> 13 C1 R06 permit_valid(p_fatima)                  66 C4 R14 suitable_space(sara, s_a3)</w:t>
+        <w:t xml:space="preserve"> 13 C1 R06 permit_valid(p_ali)                     66 C4 R14 suitable_space(ali, s_a3)</w:t>
       </w:r>
       <w:r>
         <w:br/>
       </w:r>
       <w:r>
-        <w:t xml:space="preserve"> 14 C1 R06 permit_valid(p_ali)                     67 C4 R14 suitable_space(sara, s_a2)</w:t>
+        <w:t xml:space="preserve"> 14 C1 R06 permit_valid(p_fatima)                  67 C4 R14 suitable_space(ali, s_a1)</w:t>
       </w:r>
       <w:r>
         <w:br/>
-        <w:t xml:space="preserve"> 15 C1 R07 permit_matches_role(ali, p_ali)         68 C4 R14 suitable_space(sara, s_a5)</w:t>
+        <w:t xml:space="preserve"> 15 C1 R07 permit_matches_role(zara, p_zara)       68 C4 R14 suitable_space(ali, s_a2)</w:t>
       </w:r>
       <w:r>
         <w:br/>
-        <w:t xml:space="preserve"> 16 C1 R07 permit_matches_role(sara, p_sara)       69 C4 R14 suitable_space(zara, s_a1)</w:t>
+        <w:t xml:space="preserve"> 16 C1 R07 permit_matches_role(usman, p_usman)     69 C4 R14 suitable_space(bilal, s_v1)</w:t>
       </w:r>
       <w:r>
         <w:br/>
-        <w:t xml:space="preserve"> 17 C1 R07 permit_matches_role(usman, p_usman)     70 C4 R14 suitable_space(zara, s_a3)</w:t>
+        <w:t xml:space="preserve"> 17 C1 R07 permit_matches_role(sara, p_sara)       70 C4 R14 suitable_space(sara, s_a5)</w:t>
       </w:r>
       <w:r>
         <w:br/>
-        <w:t xml:space="preserve"> 18 C1 R07 permit_matches_role(zara, p_zara)       71 C4 R14 suitable_space(zara, s_a2)</w:t>
+        <w:t xml:space="preserve"> 18 C1 R07 permit_matches_role(ali, p_ali)         71 C4 R14 suitable_space(sara, s_a3)</w:t>
       </w:r>
       <w:r>
         <w:br/>
       </w:r>
       <w:r>
-        <w:t xml:space="preserve"> 19 C1 R09 permit_matches_role(bilal, vp_bilal)    72 C4 R14 suitable_space(zara, s_a5)</w:t>
+        <w:t xml:space="preserve"> 19 C1 R09 permit_matches_role(bilal, vp_bilal)    72 C4 R14 suitable_space(sara, s_a1)</w:t>
       </w:r>
       <w:r>
         <w:br/>
-        <w:t xml:space="preserve"> 20 C1 R12 zone_open(zone_v)                       73 C4 R14 suitable_space(bilal, s_v1)</w:t>
+        <w:t xml:space="preserve"> 20 C1 R12 zone_open(zone_a)                       73 C4 R14 suitable_space(sara, s_a2)</w:t>
       </w:r>
       <w:r>
         <w:br/>
@@ -37629,7 +37639,7 @@
       </w:r>
       <w:r>
         <w:br/>
-        <w:t xml:space="preserve"> 22 C1 R12 zone_open(zone_a)                       75 C5 R14 suitable_space(ahmed, s_e3)</w:t>
+        <w:t xml:space="preserve"> 22 C1 R12 zone_open(zone_v)                       75 C5 R14 suitable_space(ahmed, s_e3)</w:t>
       </w:r>
       <w:r>
         <w:br/>
@@ -37639,37 +37649,37 @@
         <w:br/>
       </w:r>
       <w:r>
-        <w:t xml:space="preserve"> 24 C1 R17 space_free(s_e2)                        77 C5 R15 eligible_for_space(ali, s_a5)</w:t>
+        <w:t xml:space="preserve"> 24 C1 R17 space_free(s_a1)                        77 C5 R15 eligible_for_space(sara, s_a1)</w:t>
       </w:r>
       <w:r>
         <w:br/>
-        <w:t xml:space="preserve"> 25 C1 R17 space_free(s_a1)                        78 C5 R15 eligible_for_space(sara, s_a1)</w:t>
+        <w:t xml:space="preserve"> 25 C1 R17 space_free(s_e1)                        78 C5 R15 eligible_for_space(ali, s_a1)</w:t>
       </w:r>
       <w:r>
         <w:br/>
-        <w:t xml:space="preserve"> 26 C1 R17 space_free(s_a3)                        79 C5 R15 eligible_for_space(zara, s_a5)</w:t>
+        <w:t xml:space="preserve"> 26 C1 R17 space_free(s_e2)                        79 C5 R15 eligible_for_space(zara, s_a2)</w:t>
       </w:r>
       <w:r>
         <w:br/>
-        <w:t xml:space="preserve"> 27 C1 R17 space_free(s_v1)                        80 C5 R15 eligible_for_space(ali, s_a2)</w:t>
+        <w:t xml:space="preserve"> 27 C1 R17 space_free(s_a3)                        80 C5 R15 eligible_for_space(sara, s_a5)</w:t>
       </w:r>
       <w:r>
         <w:br/>
-        <w:t xml:space="preserve"> 28 C1 R17 space_free(s_e1)                        81 C5 R15 eligible_for_space(ali, s_a1)</w:t>
+        <w:t xml:space="preserve"> 28 C1 R17 space_free(s_v1)                        81 C5 R15 eligible_for_space(sara, s_a2)</w:t>
       </w:r>
       <w:r>
         <w:br/>
       </w:r>
       <w:r>
-        <w:t xml:space="preserve"> 29 C1 R18 holds_reservation(ahmed, s_e3)          82 C5 R15 eligible_for_space(sara, s_a5)</w:t>
+        <w:t xml:space="preserve"> 29 C1 R18 holds_reservation(ahmed, s_e3)          82 C5 R15 eligible_for_space(zara, s_a5)</w:t>
       </w:r>
       <w:r>
         <w:br/>
-        <w:t xml:space="preserve"> 30 C1 R18 holds_reservation(zara, s_a5)           83 C5 R15 eligible_for_space(zara, s_a2)</w:t>
+        <w:t xml:space="preserve"> 30 C1 R18 holds_reservation(zara, s_a5)           83 C5 R15 eligible_for_space(ali, s_a5)</w:t>
       </w:r>
       <w:r>
         <w:br/>
-        <w:t xml:space="preserve"> 31 C1 R23 priority(ali, 1)                        84 C5 R15 eligible_for_space(zara, s_a1)</w:t>
+        <w:t xml:space="preserve"> 31 C1 R23 priority(ali, 1)                        84 C5 R15 eligible_for_space(ali, s_a2)</w:t>
       </w:r>
       <w:r>
         <w:br/>
@@ -37677,51 +37687,51 @@
       </w:r>
       <w:r>
         <w:br/>
-        <w:t xml:space="preserve"> 33 C1 R23 priority(zara, 1)                       86 C5 R15 eligible_for_space(sara, s_a2)</w:t>
+        <w:t xml:space="preserve"> 33 C1 R23 priority(zara, 1)                       86 C5 R15 eligible_for_space(zara, s_a1)</w:t>
       </w:r>
       <w:r>
         <w:br/>
       </w:r>
       <w:r>
-        <w:t xml:space="preserve"> 34 C1 R24 priority(bilal, 1)                      87 C5 R16 eligible_for_space(sara, s_a3)</w:t>
+        <w:t xml:space="preserve"> 34 C1 R24 priority(hina, 1)                       87 C5 R16 eligible_for_space(sara, s_a3)</w:t>
       </w:r>
       <w:r>
         <w:br/>
-        <w:t xml:space="preserve"> 35 C1 R24 priority(hina, 1)                       88 C6 R15 eligible_for_space(ahmed, s_e1)</w:t>
+        <w:t xml:space="preserve"> 35 C1 R24 priority(bilal, 1)                      88 C6 R15 eligible_for_space(ahmed, s_e3)</w:t>
       </w:r>
       <w:r>
         <w:br/>
-        <w:t xml:space="preserve"> 36 C2 R02 person(ahmed)                           89 C6 R15 eligible_for_space(ahmed, s_e2)</w:t>
+        <w:t xml:space="preserve"> 36 C2 R02 person(ahmed)                           89 C6 R15 eligible_for_space(ahmed, s_e1)</w:t>
       </w:r>
       <w:r>
         <w:br/>
-        <w:t xml:space="preserve"> 37 C2 R02 person(fatima)                          90 C6 R15 eligible_for_space(ahmed, s_e3)</w:t>
+        <w:t xml:space="preserve"> 37 C2 R02 person(fatima)                          90 C6 R15 eligible_for_space(ahmed, s_e2)</w:t>
       </w:r>
       <w:r>
         <w:br/>
-        <w:t xml:space="preserve"> 38 C2 R08 permit_matches_role(fatima, p_fatima)   91 C6 R19 can_allocate(zara, s_a1)</w:t>
+        <w:t xml:space="preserve"> 38 C2 R08 permit_matches_role(ahmed, p_ahmed)     91 C6 R19 can_allocate(sara, s_a3)</w:t>
       </w:r>
       <w:r>
         <w:br/>
       </w:r>
       <w:r>
-        <w:t xml:space="preserve"> 39 C2 R08 permit_matches_role(ahmed, p_ahmed)     92 C6 R19 can_allocate(sara, s_a3)</w:t>
+        <w:t xml:space="preserve"> 39 C2 R08 permit_matches_role(fatima, p_fatima)   92 C6 R19 can_allocate(sara, s_a1)</w:t>
       </w:r>
       <w:r>
         <w:br/>
-        <w:t xml:space="preserve"> 40 C2 R10 authorized(bilal, vp_bilal)             93 C6 R19 can_allocate(bilal, s_v1)</w:t>
+        <w:t xml:space="preserve"> 40 C2 R10 authorized(sara, p_sara)                93 C6 R19 can_allocate(bilal, s_v1)</w:t>
       </w:r>
       <w:r>
         <w:br/>
-        <w:t xml:space="preserve"> 41 C2 R10 authorized(ali, p_ali)                  94 C6 R19 can_allocate(sara, s_a1)</w:t>
+        <w:t xml:space="preserve"> 41 C2 R10 authorized(ali, p_ali)                  94 C6 R19 can_allocate(zara, s_a1)</w:t>
       </w:r>
       <w:r>
         <w:br/>
-        <w:t xml:space="preserve"> 42 C2 R10 authorized(sara, p_sara)                95 C6 R19 can_allocate(ali, s_a1)</w:t>
+        <w:t xml:space="preserve"> 42 C2 R10 authorized(zara, p_zara)                95 C6 R19 can_allocate(ali, s_a1)</w:t>
       </w:r>
       <w:r>
         <w:br/>
-        <w:t xml:space="preserve"> 43 C2 R10 authorized(zara, p_zara)                96 C6 R20 can_allocate(zara, s_a5)</w:t>
+        <w:t xml:space="preserve"> 43 C2 R10 authorized(bilal, vp_bilal)             96 C6 R20 can_allocate(zara, s_a5)</w:t>
       </w:r>
       <w:r>
         <w:br/>
@@ -37743,14 +37753,14 @@
       </w:r>
       <w:r>
         <w:br/>
-        <w:t xml:space="preserve"> 48 C3 R10 authorized(ahmed, p_ahmed)             101 C7 R25 loses(usman, s_a1)</w:t>
+        <w:t xml:space="preserve"> 48 C3 R10 authorized(ahmed, p_ahmed)             101 C7 R25 loses(ali, s_a1)</w:t>
       </w:r>
       <w:r>
         <w:br/>
       </w:r>
       <w:r>
         <w:lastRenderedPageBreak/>
-        <w:t xml:space="preserve"> 49 C3 R11 authorized_driver(sara)                102 C7 R25 loses(ali, s_a1)</w:t>
+        <w:t xml:space="preserve"> 49 C3 R11 authorized_driver(sara)                102 C7 R25 loses(usman, s_a1)</w:t>
       </w:r>
       <w:r>
         <w:br/>
@@ -37775,7 +37785,7 @@
       <w:pPr>
         <w:pStyle w:val="Heading1"/>
       </w:pPr>
-      <w:bookmarkStart w:id="131" w:name="_Toc242027415"/>
+      <w:bookmarkStart w:id="131" w:name="_Toc242028311"/>
       <w:r>
         <w:t>Appendix D: Backward chaining traces</w:t>
       </w:r>
@@ -38028,7 +38038,7 @@
       <w:pPr>
         <w:pStyle w:val="Heading1"/>
       </w:pPr>
-      <w:bookmarkStart w:id="132" w:name="_Toc242027416"/>
+      <w:bookmarkStart w:id="132" w:name="_Toc242028312"/>
       <w:r>
         <w:t>Appendix E: Important source code</w:t>
       </w:r>
@@ -38122,7 +38132,7 @@
       <w:pPr>
         <w:pStyle w:val="Heading1"/>
       </w:pPr>
-      <w:bookmarkStart w:id="133" w:name="_Toc242027417"/>
+      <w:bookmarkStart w:id="133" w:name="_Toc242028313"/>
       <w:r>
         <w:t>Appendix F: Execution screenshots</w:t>
       </w:r>
@@ -38144,7 +38154,7 @@
           <w:noProof/>
         </w:rPr>
         <w:drawing>
-          <wp:inline distT="0" distB="0" distL="0" distR="0" wp14:anchorId="54A8BE21" wp14:editId="6892D07A">
+          <wp:inline distT="0" distB="0" distL="0" distR="0" wp14:anchorId="4F4E02CD" wp14:editId="7ECE4018">
             <wp:extent cx="5579902" cy="2504262"/>
             <wp:effectExtent l="0" t="0" r="0" b="0"/>
             <wp:docPr id="7" name="Picture 7"/>
@@ -38186,7 +38196,7 @@
         <w:spacing w:before="80" w:after="160"/>
         <w:jc w:val="center"/>
       </w:pPr>
-      <w:bookmarkStart w:id="134" w:name="_Toc242027177"/>
+      <w:bookmarkStart w:id="134" w:name="_Toc242028073"/>
       <w:r>
         <w:t xml:space="preserve">Figure </w:t>
       </w:r>
@@ -38224,7 +38234,7 @@
           <w:noProof/>
         </w:rPr>
         <w:drawing>
-          <wp:inline distT="0" distB="0" distL="0" distR="0" wp14:anchorId="6354C603" wp14:editId="463D5E4C">
+          <wp:inline distT="0" distB="0" distL="0" distR="0" wp14:anchorId="497DDFD0" wp14:editId="7D001B94">
             <wp:extent cx="5579902" cy="2948304"/>
             <wp:effectExtent l="0" t="0" r="0" b="0"/>
             <wp:docPr id="8" name="Picture 8"/>
@@ -38266,7 +38276,7 @@
         <w:spacing w:before="80" w:after="160"/>
         <w:jc w:val="center"/>
       </w:pPr>
-      <w:bookmarkStart w:id="135" w:name="_Toc242027178"/>
+      <w:bookmarkStart w:id="135" w:name="_Toc242028074"/>
       <w:r>
         <w:t xml:space="preserve">Figure </w:t>
       </w:r>
@@ -38305,7 +38315,7 @@
         </w:rPr>
         <w:lastRenderedPageBreak/>
         <w:drawing>
-          <wp:inline distT="0" distB="0" distL="0" distR="0" wp14:anchorId="3B575117" wp14:editId="1FCEC423">
+          <wp:inline distT="0" distB="0" distL="0" distR="0" wp14:anchorId="082F07FC" wp14:editId="0F5214E8">
             <wp:extent cx="5579902" cy="2736078"/>
             <wp:effectExtent l="0" t="0" r="0" b="0"/>
             <wp:docPr id="9" name="Picture 9"/>
@@ -38347,7 +38357,7 @@
         <w:spacing w:before="80" w:after="160"/>
         <w:jc w:val="center"/>
       </w:pPr>
-      <w:bookmarkStart w:id="136" w:name="_Toc242027179"/>
+      <w:bookmarkStart w:id="136" w:name="_Toc242028075"/>
       <w:r>
         <w:t xml:space="preserve">Figure </w:t>
       </w:r>
@@ -38385,7 +38395,7 @@
           <w:noProof/>
         </w:rPr>
         <w:drawing>
-          <wp:inline distT="0" distB="0" distL="0" distR="0" wp14:anchorId="5A4731F4" wp14:editId="7854432A">
+          <wp:inline distT="0" distB="0" distL="0" distR="0" wp14:anchorId="5AF8D143" wp14:editId="1680CE09">
             <wp:extent cx="5579902" cy="2971159"/>
             <wp:effectExtent l="0" t="0" r="0" b="0"/>
             <wp:docPr id="10" name="Picture 10"/>
@@ -38427,7 +38437,7 @@
         <w:spacing w:before="80" w:after="160"/>
         <w:jc w:val="center"/>
       </w:pPr>
-      <w:bookmarkStart w:id="137" w:name="_Toc242027180"/>
+      <w:bookmarkStart w:id="137" w:name="_Toc242028076"/>
       <w:r>
         <w:t xml:space="preserve">Figure </w:t>
       </w:r>
@@ -38466,7 +38476,7 @@
         </w:rPr>
         <w:lastRenderedPageBreak/>
         <w:drawing>
-          <wp:inline distT="0" distB="0" distL="0" distR="0" wp14:anchorId="53A1A72E" wp14:editId="7B97728A">
+          <wp:inline distT="0" distB="0" distL="0" distR="0" wp14:anchorId="666CE8D0" wp14:editId="7B2C6094">
             <wp:extent cx="5580097" cy="2399442"/>
             <wp:effectExtent l="0" t="0" r="0" b="0"/>
             <wp:docPr id="11" name="Picture 11"/>
@@ -38508,7 +38518,7 @@
         <w:spacing w:before="80" w:after="160"/>
         <w:jc w:val="center"/>
       </w:pPr>
-      <w:bookmarkStart w:id="138" w:name="_Toc242027181"/>
+      <w:bookmarkStart w:id="138" w:name="_Toc242028077"/>
       <w:r>
         <w:t xml:space="preserve">Figure </w:t>
       </w:r>
@@ -38546,7 +38556,7 @@
           <w:noProof/>
         </w:rPr>
         <w:drawing>
-          <wp:inline distT="0" distB="0" distL="0" distR="0" wp14:anchorId="7C12085F" wp14:editId="5AD8289C">
+          <wp:inline distT="0" distB="0" distL="0" distR="0" wp14:anchorId="708218FB" wp14:editId="4A0541E7">
             <wp:extent cx="5580097" cy="3470821"/>
             <wp:effectExtent l="0" t="0" r="0" b="0"/>
             <wp:docPr id="12" name="Picture 12"/>
@@ -38588,7 +38598,7 @@
         <w:spacing w:before="80" w:after="160"/>
         <w:jc w:val="center"/>
       </w:pPr>
-      <w:bookmarkStart w:id="139" w:name="_Toc242027182"/>
+      <w:bookmarkStart w:id="139" w:name="_Toc242028078"/>
       <w:r>
         <w:t xml:space="preserve">Figure </w:t>
       </w:r>
@@ -38619,7 +38629,7 @@
       <w:pPr>
         <w:pStyle w:val="Heading1"/>
       </w:pPr>
-      <w:bookmarkStart w:id="140" w:name="_Toc242027418"/>
+      <w:bookmarkStart w:id="140" w:name="_Toc242028314"/>
       <w:r>
         <w:t>Appendix G: Team participation evidence</w:t>
       </w:r>
@@ -38637,7 +38647,7 @@
         <w:spacing w:before="80"/>
         <w:jc w:val="center"/>
       </w:pPr>
-      <w:bookmarkStart w:id="141" w:name="_Toc242027208"/>
+      <w:bookmarkStart w:id="141" w:name="_Toc242028104"/>
       <w:r>
         <w:lastRenderedPageBreak/>
         <w:t xml:space="preserve">Table </w:t>
@@ -39144,7 +39154,7 @@
       <w:pPr>
         <w:pStyle w:val="Heading1"/>
       </w:pPr>
-      <w:bookmarkStart w:id="142" w:name="_Toc242027419"/>
+      <w:bookmarkStart w:id="142" w:name="_Toc242028315"/>
       <w:r>
         <w:t>CT-351 CCP final compliance checklist</w:t>
       </w:r>
@@ -39157,7 +39167,7 @@
         <w:spacing w:before="80"/>
         <w:jc w:val="center"/>
       </w:pPr>
-      <w:bookmarkStart w:id="143" w:name="_Toc242027209"/>
+      <w:bookmarkStart w:id="143" w:name="_Toc242028105"/>
       <w:r>
         <w:t xml:space="preserve">Table </w:t>
       </w:r>
@@ -40979,31 +40989,31 @@
       </w:rPr>
     </w:lvl>
   </w:abstractNum>
-  <w:num w:numId="1" w16cid:durableId="62027675">
+  <w:num w:numId="1" w16cid:durableId="1645936968">
     <w:abstractNumId w:val="8"/>
   </w:num>
-  <w:num w:numId="2" w16cid:durableId="1678538193">
+  <w:num w:numId="2" w16cid:durableId="2076656514">
     <w:abstractNumId w:val="6"/>
   </w:num>
-  <w:num w:numId="3" w16cid:durableId="398132645">
+  <w:num w:numId="3" w16cid:durableId="828599741">
     <w:abstractNumId w:val="5"/>
   </w:num>
-  <w:num w:numId="4" w16cid:durableId="831868921">
+  <w:num w:numId="4" w16cid:durableId="1522629152">
     <w:abstractNumId w:val="4"/>
   </w:num>
-  <w:num w:numId="5" w16cid:durableId="126432676">
+  <w:num w:numId="5" w16cid:durableId="1197238227">
     <w:abstractNumId w:val="7"/>
   </w:num>
-  <w:num w:numId="6" w16cid:durableId="1891917410">
+  <w:num w:numId="6" w16cid:durableId="390664592">
     <w:abstractNumId w:val="3"/>
   </w:num>
-  <w:num w:numId="7" w16cid:durableId="464667479">
+  <w:num w:numId="7" w16cid:durableId="1456488092">
     <w:abstractNumId w:val="2"/>
   </w:num>
-  <w:num w:numId="8" w16cid:durableId="996150328">
+  <w:num w:numId="8" w16cid:durableId="1127351754">
     <w:abstractNumId w:val="1"/>
   </w:num>
-  <w:num w:numId="9" w16cid:durableId="1698001628">
+  <w:num w:numId="9" w16cid:durableId="934558675">
     <w:abstractNumId w:val="0"/>
   </w:num>
 </w:numbering>
@@ -52425,7 +52435,7 @@
     <w:autoRedefine/>
     <w:uiPriority w:val="39"/>
     <w:unhideWhenUsed/>
-    <w:rsid w:val="006D5146"/>
+    <w:rsid w:val="002076A3"/>
     <w:pPr>
       <w:spacing w:after="0" w:line="240" w:lineRule="auto"/>
     </w:pPr>
@@ -52441,7 +52451,7 @@
     <w:autoRedefine/>
     <w:uiPriority w:val="39"/>
     <w:unhideWhenUsed/>
-    <w:rsid w:val="006D5146"/>
+    <w:rsid w:val="002076A3"/>
     <w:pPr>
       <w:spacing w:after="0" w:line="240" w:lineRule="auto"/>
       <w:ind w:left="210"/>
@@ -52458,7 +52468,7 @@
     <w:autoRedefine/>
     <w:uiPriority w:val="39"/>
     <w:unhideWhenUsed/>
-    <w:rsid w:val="006D5146"/>
+    <w:rsid w:val="002076A3"/>
     <w:pPr>
       <w:spacing w:after="100" w:line="278" w:lineRule="auto"/>
       <w:ind w:left="480"/>
@@ -52479,7 +52489,7 @@
     <w:autoRedefine/>
     <w:uiPriority w:val="39"/>
     <w:unhideWhenUsed/>
-    <w:rsid w:val="006D5146"/>
+    <w:rsid w:val="002076A3"/>
     <w:pPr>
       <w:spacing w:after="100" w:line="278" w:lineRule="auto"/>
       <w:ind w:left="720"/>
@@ -52500,7 +52510,7 @@
     <w:autoRedefine/>
     <w:uiPriority w:val="39"/>
     <w:unhideWhenUsed/>
-    <w:rsid w:val="006D5146"/>
+    <w:rsid w:val="002076A3"/>
     <w:pPr>
       <w:spacing w:after="100" w:line="278" w:lineRule="auto"/>
       <w:ind w:left="960"/>
@@ -52521,7 +52531,7 @@
     <w:autoRedefine/>
     <w:uiPriority w:val="39"/>
     <w:unhideWhenUsed/>
-    <w:rsid w:val="006D5146"/>
+    <w:rsid w:val="002076A3"/>
     <w:pPr>
       <w:spacing w:after="100" w:line="278" w:lineRule="auto"/>
       <w:ind w:left="1200"/>
@@ -52542,7 +52552,7 @@
     <w:autoRedefine/>
     <w:uiPriority w:val="39"/>
     <w:unhideWhenUsed/>
-    <w:rsid w:val="006D5146"/>
+    <w:rsid w:val="002076A3"/>
     <w:pPr>
       <w:spacing w:after="100" w:line="278" w:lineRule="auto"/>
       <w:ind w:left="1440"/>
@@ -52563,7 +52573,7 @@
     <w:autoRedefine/>
     <w:uiPriority w:val="39"/>
     <w:unhideWhenUsed/>
-    <w:rsid w:val="006D5146"/>
+    <w:rsid w:val="002076A3"/>
     <w:pPr>
       <w:spacing w:after="100" w:line="278" w:lineRule="auto"/>
       <w:ind w:left="1680"/>
@@ -52584,7 +52594,7 @@
     <w:autoRedefine/>
     <w:uiPriority w:val="39"/>
     <w:unhideWhenUsed/>
-    <w:rsid w:val="006D5146"/>
+    <w:rsid w:val="002076A3"/>
     <w:pPr>
       <w:spacing w:after="100" w:line="278" w:lineRule="auto"/>
       <w:ind w:left="1920"/>
@@ -52603,7 +52613,7 @@
     <w:basedOn w:val="DefaultParagraphFont"/>
     <w:uiPriority w:val="99"/>
     <w:unhideWhenUsed/>
-    <w:rsid w:val="006D5146"/>
+    <w:rsid w:val="002076A3"/>
     <w:rPr>
       <w:color w:val="0000FF" w:themeColor="hyperlink"/>
       <w:u w:val="single"/>
@@ -52615,7 +52625,7 @@
     <w:uiPriority w:val="99"/>
     <w:semiHidden/>
     <w:unhideWhenUsed/>
-    <w:rsid w:val="006D5146"/>
+    <w:rsid w:val="002076A3"/>
     <w:rPr>
       <w:color w:val="605E5C"/>
       <w:shd w:val="clear" w:color="auto" w:fill="E1DFDD"/>
@@ -52627,7 +52637,7 @@
     <w:next w:val="Normal"/>
     <w:uiPriority w:val="99"/>
     <w:unhideWhenUsed/>
-    <w:rsid w:val="006D5146"/>
+    <w:rsid w:val="002076A3"/>
     <w:pPr>
       <w:spacing w:after="0" w:line="240" w:lineRule="auto"/>
     </w:pPr>

</xml_diff>

<commit_message>
Set report document properties and trim the report template
</commit_message>
<xml_diff>
--- a/docs/report/Smart_Parking_KRR_CCP_Report.docx
+++ b/docs/report/Smart_Parking_KRR_CCP_Report.docx
@@ -1198,7 +1198,7 @@
       <w:pPr>
         <w:pStyle w:val="Heading1"/>
       </w:pPr>
-      <w:bookmarkStart w:id="0" w:name="_Toc242028211"/>
+      <w:bookmarkStart w:id="0" w:name="_Toc242030945"/>
       <w:r>
         <w:lastRenderedPageBreak/>
         <w:t>Acknowledgements</w:t>
@@ -1214,7 +1214,7 @@
       <w:pPr>
         <w:pStyle w:val="Heading1"/>
       </w:pPr>
-      <w:bookmarkStart w:id="1" w:name="_Toc242028212"/>
+      <w:bookmarkStart w:id="1" w:name="_Toc242030946"/>
       <w:r>
         <w:t>Executive summary</w:t>
       </w:r>
@@ -1247,7 +1247,7 @@
       <w:pPr>
         <w:pStyle w:val="Heading1"/>
       </w:pPr>
-      <w:bookmarkStart w:id="2" w:name="_Toc242028213"/>
+      <w:bookmarkStart w:id="2" w:name="_Toc242030947"/>
       <w:r>
         <w:t>Table of contents</w:t>
       </w:r>
@@ -1291,7 +1291,7 @@
       <w:r>
         <w:fldChar w:fldCharType="separate"/>
       </w:r>
-      <w:hyperlink w:anchor="_Toc242028211" w:history="1">
+      <w:hyperlink w:anchor="_Toc242030945" w:history="1">
         <w:r>
           <w:rPr>
             <w:rStyle w:val="Hyperlink"/>
@@ -1318,7 +1318,7 @@
             <w:noProof/>
             <w:webHidden/>
           </w:rPr>
-          <w:instrText xml:space="preserve"> PAGEREF _Toc242028211 \h </w:instrText>
+          <w:instrText xml:space="preserve"> PAGEREF _Toc242030945 \h </w:instrText>
         </w:r>
         <w:r>
           <w:rPr>
@@ -1365,7 +1365,7 @@
           <w14:ligatures w14:val="standardContextual"/>
         </w:rPr>
       </w:pPr>
-      <w:hyperlink w:anchor="_Toc242028212" w:history="1">
+      <w:hyperlink w:anchor="_Toc242030946" w:history="1">
         <w:r>
           <w:rPr>
             <w:rStyle w:val="Hyperlink"/>
@@ -1392,7 +1392,7 @@
             <w:noProof/>
             <w:webHidden/>
           </w:rPr>
-          <w:instrText xml:space="preserve"> PAGEREF _Toc242028212 \h </w:instrText>
+          <w:instrText xml:space="preserve"> PAGEREF _Toc242030946 \h </w:instrText>
         </w:r>
         <w:r>
           <w:rPr>
@@ -1439,7 +1439,7 @@
           <w14:ligatures w14:val="standardContextual"/>
         </w:rPr>
       </w:pPr>
-      <w:hyperlink w:anchor="_Toc242028213" w:history="1">
+      <w:hyperlink w:anchor="_Toc242030947" w:history="1">
         <w:r>
           <w:rPr>
             <w:rStyle w:val="Hyperlink"/>
@@ -1466,7 +1466,7 @@
             <w:noProof/>
             <w:webHidden/>
           </w:rPr>
-          <w:instrText xml:space="preserve"> PAGEREF _Toc242028213 \h </w:instrText>
+          <w:instrText xml:space="preserve"> PAGEREF _Toc242030947 \h </w:instrText>
         </w:r>
         <w:r>
           <w:rPr>
@@ -1513,7 +1513,7 @@
           <w14:ligatures w14:val="standardContextual"/>
         </w:rPr>
       </w:pPr>
-      <w:hyperlink w:anchor="_Toc242028214" w:history="1">
+      <w:hyperlink w:anchor="_Toc242030948" w:history="1">
         <w:r>
           <w:rPr>
             <w:rStyle w:val="Hyperlink"/>
@@ -1540,7 +1540,7 @@
             <w:noProof/>
             <w:webHidden/>
           </w:rPr>
-          <w:instrText xml:space="preserve"> PAGEREF _Toc242028214 \h </w:instrText>
+          <w:instrText xml:space="preserve"> PAGEREF _Toc242030948 \h </w:instrText>
         </w:r>
         <w:r>
           <w:rPr>
@@ -1587,7 +1587,7 @@
           <w14:ligatures w14:val="standardContextual"/>
         </w:rPr>
       </w:pPr>
-      <w:hyperlink w:anchor="_Toc242028215" w:history="1">
+      <w:hyperlink w:anchor="_Toc242030949" w:history="1">
         <w:r>
           <w:rPr>
             <w:rStyle w:val="Hyperlink"/>
@@ -1614,7 +1614,7 @@
             <w:noProof/>
             <w:webHidden/>
           </w:rPr>
-          <w:instrText xml:space="preserve"> PAGEREF _Toc242028215 \h </w:instrText>
+          <w:instrText xml:space="preserve"> PAGEREF _Toc242030949 \h </w:instrText>
         </w:r>
         <w:r>
           <w:rPr>
@@ -1661,7 +1661,7 @@
           <w14:ligatures w14:val="standardContextual"/>
         </w:rPr>
       </w:pPr>
-      <w:hyperlink w:anchor="_Toc242028216" w:history="1">
+      <w:hyperlink w:anchor="_Toc242030950" w:history="1">
         <w:r>
           <w:rPr>
             <w:rStyle w:val="Hyperlink"/>
@@ -1688,7 +1688,7 @@
             <w:noProof/>
             <w:webHidden/>
           </w:rPr>
-          <w:instrText xml:space="preserve"> PAGEREF _Toc242028216 \h </w:instrText>
+          <w:instrText xml:space="preserve"> PAGEREF _Toc242030950 \h </w:instrText>
         </w:r>
         <w:r>
           <w:rPr>
@@ -1735,7 +1735,7 @@
           <w14:ligatures w14:val="standardContextual"/>
         </w:rPr>
       </w:pPr>
-      <w:hyperlink w:anchor="_Toc242028217" w:history="1">
+      <w:hyperlink w:anchor="_Toc242030951" w:history="1">
         <w:r>
           <w:rPr>
             <w:rStyle w:val="Hyperlink"/>
@@ -1762,7 +1762,7 @@
             <w:noProof/>
             <w:webHidden/>
           </w:rPr>
-          <w:instrText xml:space="preserve"> PAGEREF _Toc242028217 \h </w:instrText>
+          <w:instrText xml:space="preserve"> PAGEREF _Toc242030951 \h </w:instrText>
         </w:r>
         <w:r>
           <w:rPr>
@@ -1809,7 +1809,7 @@
           <w14:ligatures w14:val="standardContextual"/>
         </w:rPr>
       </w:pPr>
-      <w:hyperlink w:anchor="_Toc242028218" w:history="1">
+      <w:hyperlink w:anchor="_Toc242030952" w:history="1">
         <w:r>
           <w:rPr>
             <w:rStyle w:val="Hyperlink"/>
@@ -1836,7 +1836,7 @@
             <w:noProof/>
             <w:webHidden/>
           </w:rPr>
-          <w:instrText xml:space="preserve"> PAGEREF _Toc242028218 \h </w:instrText>
+          <w:instrText xml:space="preserve"> PAGEREF _Toc242030952 \h </w:instrText>
         </w:r>
         <w:r>
           <w:rPr>
@@ -1883,7 +1883,7 @@
           <w14:ligatures w14:val="standardContextual"/>
         </w:rPr>
       </w:pPr>
-      <w:hyperlink w:anchor="_Toc242028219" w:history="1">
+      <w:hyperlink w:anchor="_Toc242030953" w:history="1">
         <w:r>
           <w:rPr>
             <w:rStyle w:val="Hyperlink"/>
@@ -1910,7 +1910,7 @@
             <w:noProof/>
             <w:webHidden/>
           </w:rPr>
-          <w:instrText xml:space="preserve"> PAGEREF _Toc242028219 \h </w:instrText>
+          <w:instrText xml:space="preserve"> PAGEREF _Toc242030953 \h </w:instrText>
         </w:r>
         <w:r>
           <w:rPr>
@@ -1957,7 +1957,7 @@
           <w14:ligatures w14:val="standardContextual"/>
         </w:rPr>
       </w:pPr>
-      <w:hyperlink w:anchor="_Toc242028220" w:history="1">
+      <w:hyperlink w:anchor="_Toc242030954" w:history="1">
         <w:r>
           <w:rPr>
             <w:rStyle w:val="Hyperlink"/>
@@ -1984,7 +1984,7 @@
             <w:noProof/>
             <w:webHidden/>
           </w:rPr>
-          <w:instrText xml:space="preserve"> PAGEREF _Toc242028220 \h </w:instrText>
+          <w:instrText xml:space="preserve"> PAGEREF _Toc242030954 \h </w:instrText>
         </w:r>
         <w:r>
           <w:rPr>
@@ -2031,7 +2031,7 @@
           <w14:ligatures w14:val="standardContextual"/>
         </w:rPr>
       </w:pPr>
-      <w:hyperlink w:anchor="_Toc242028221" w:history="1">
+      <w:hyperlink w:anchor="_Toc242030955" w:history="1">
         <w:r>
           <w:rPr>
             <w:rStyle w:val="Hyperlink"/>
@@ -2058,7 +2058,7 @@
             <w:noProof/>
             <w:webHidden/>
           </w:rPr>
-          <w:instrText xml:space="preserve"> PAGEREF _Toc242028221 \h </w:instrText>
+          <w:instrText xml:space="preserve"> PAGEREF _Toc242030955 \h </w:instrText>
         </w:r>
         <w:r>
           <w:rPr>
@@ -2105,7 +2105,7 @@
           <w14:ligatures w14:val="standardContextual"/>
         </w:rPr>
       </w:pPr>
-      <w:hyperlink w:anchor="_Toc242028222" w:history="1">
+      <w:hyperlink w:anchor="_Toc242030956" w:history="1">
         <w:r>
           <w:rPr>
             <w:rStyle w:val="Hyperlink"/>
@@ -2132,7 +2132,7 @@
             <w:noProof/>
             <w:webHidden/>
           </w:rPr>
-          <w:instrText xml:space="preserve"> PAGEREF _Toc242028222 \h </w:instrText>
+          <w:instrText xml:space="preserve"> PAGEREF _Toc242030956 \h </w:instrText>
         </w:r>
         <w:r>
           <w:rPr>
@@ -2179,7 +2179,7 @@
           <w14:ligatures w14:val="standardContextual"/>
         </w:rPr>
       </w:pPr>
-      <w:hyperlink w:anchor="_Toc242028223" w:history="1">
+      <w:hyperlink w:anchor="_Toc242030957" w:history="1">
         <w:r>
           <w:rPr>
             <w:rStyle w:val="Hyperlink"/>
@@ -2206,7 +2206,7 @@
             <w:noProof/>
             <w:webHidden/>
           </w:rPr>
-          <w:instrText xml:space="preserve"> PAGEREF _Toc242028223 \h </w:instrText>
+          <w:instrText xml:space="preserve"> PAGEREF _Toc242030957 \h </w:instrText>
         </w:r>
         <w:r>
           <w:rPr>
@@ -2253,7 +2253,7 @@
           <w14:ligatures w14:val="standardContextual"/>
         </w:rPr>
       </w:pPr>
-      <w:hyperlink w:anchor="_Toc242028224" w:history="1">
+      <w:hyperlink w:anchor="_Toc242030958" w:history="1">
         <w:r>
           <w:rPr>
             <w:rStyle w:val="Hyperlink"/>
@@ -2280,7 +2280,7 @@
             <w:noProof/>
             <w:webHidden/>
           </w:rPr>
-          <w:instrText xml:space="preserve"> PAGEREF _Toc242028224 \h </w:instrText>
+          <w:instrText xml:space="preserve"> PAGEREF _Toc242030958 \h </w:instrText>
         </w:r>
         <w:r>
           <w:rPr>
@@ -2327,7 +2327,7 @@
           <w14:ligatures w14:val="standardContextual"/>
         </w:rPr>
       </w:pPr>
-      <w:hyperlink w:anchor="_Toc242028225" w:history="1">
+      <w:hyperlink w:anchor="_Toc242030959" w:history="1">
         <w:r>
           <w:rPr>
             <w:rStyle w:val="Hyperlink"/>
@@ -2354,7 +2354,7 @@
             <w:noProof/>
             <w:webHidden/>
           </w:rPr>
-          <w:instrText xml:space="preserve"> PAGEREF _Toc242028225 \h </w:instrText>
+          <w:instrText xml:space="preserve"> PAGEREF _Toc242030959 \h </w:instrText>
         </w:r>
         <w:r>
           <w:rPr>
@@ -2401,7 +2401,7 @@
           <w14:ligatures w14:val="standardContextual"/>
         </w:rPr>
       </w:pPr>
-      <w:hyperlink w:anchor="_Toc242028226" w:history="1">
+      <w:hyperlink w:anchor="_Toc242030960" w:history="1">
         <w:r>
           <w:rPr>
             <w:rStyle w:val="Hyperlink"/>
@@ -2428,7 +2428,7 @@
             <w:noProof/>
             <w:webHidden/>
           </w:rPr>
-          <w:instrText xml:space="preserve"> PAGEREF _Toc242028226 \h </w:instrText>
+          <w:instrText xml:space="preserve"> PAGEREF _Toc242030960 \h </w:instrText>
         </w:r>
         <w:r>
           <w:rPr>
@@ -2475,7 +2475,7 @@
           <w14:ligatures w14:val="standardContextual"/>
         </w:rPr>
       </w:pPr>
-      <w:hyperlink w:anchor="_Toc242028227" w:history="1">
+      <w:hyperlink w:anchor="_Toc242030961" w:history="1">
         <w:r>
           <w:rPr>
             <w:rStyle w:val="Hyperlink"/>
@@ -2502,7 +2502,7 @@
             <w:noProof/>
             <w:webHidden/>
           </w:rPr>
-          <w:instrText xml:space="preserve"> PAGEREF _Toc242028227 \h </w:instrText>
+          <w:instrText xml:space="preserve"> PAGEREF _Toc242030961 \h </w:instrText>
         </w:r>
         <w:r>
           <w:rPr>
@@ -2549,7 +2549,7 @@
           <w14:ligatures w14:val="standardContextual"/>
         </w:rPr>
       </w:pPr>
-      <w:hyperlink w:anchor="_Toc242028228" w:history="1">
+      <w:hyperlink w:anchor="_Toc242030962" w:history="1">
         <w:r>
           <w:rPr>
             <w:rStyle w:val="Hyperlink"/>
@@ -2576,7 +2576,7 @@
             <w:noProof/>
             <w:webHidden/>
           </w:rPr>
-          <w:instrText xml:space="preserve"> PAGEREF _Toc242028228 \h </w:instrText>
+          <w:instrText xml:space="preserve"> PAGEREF _Toc242030962 \h </w:instrText>
         </w:r>
         <w:r>
           <w:rPr>
@@ -2623,7 +2623,7 @@
           <w14:ligatures w14:val="standardContextual"/>
         </w:rPr>
       </w:pPr>
-      <w:hyperlink w:anchor="_Toc242028229" w:history="1">
+      <w:hyperlink w:anchor="_Toc242030963" w:history="1">
         <w:r>
           <w:rPr>
             <w:rStyle w:val="Hyperlink"/>
@@ -2650,7 +2650,7 @@
             <w:noProof/>
             <w:webHidden/>
           </w:rPr>
-          <w:instrText xml:space="preserve"> PAGEREF _Toc242028229 \h </w:instrText>
+          <w:instrText xml:space="preserve"> PAGEREF _Toc242030963 \h </w:instrText>
         </w:r>
         <w:r>
           <w:rPr>
@@ -2697,7 +2697,7 @@
           <w14:ligatures w14:val="standardContextual"/>
         </w:rPr>
       </w:pPr>
-      <w:hyperlink w:anchor="_Toc242028230" w:history="1">
+      <w:hyperlink w:anchor="_Toc242030964" w:history="1">
         <w:r>
           <w:rPr>
             <w:rStyle w:val="Hyperlink"/>
@@ -2724,7 +2724,7 @@
             <w:noProof/>
             <w:webHidden/>
           </w:rPr>
-          <w:instrText xml:space="preserve"> PAGEREF _Toc242028230 \h </w:instrText>
+          <w:instrText xml:space="preserve"> PAGEREF _Toc242030964 \h </w:instrText>
         </w:r>
         <w:r>
           <w:rPr>
@@ -2771,7 +2771,7 @@
           <w14:ligatures w14:val="standardContextual"/>
         </w:rPr>
       </w:pPr>
-      <w:hyperlink w:anchor="_Toc242028231" w:history="1">
+      <w:hyperlink w:anchor="_Toc242030965" w:history="1">
         <w:r>
           <w:rPr>
             <w:rStyle w:val="Hyperlink"/>
@@ -2798,7 +2798,7 @@
             <w:noProof/>
             <w:webHidden/>
           </w:rPr>
-          <w:instrText xml:space="preserve"> PAGEREF _Toc242028231 \h </w:instrText>
+          <w:instrText xml:space="preserve"> PAGEREF _Toc242030965 \h </w:instrText>
         </w:r>
         <w:r>
           <w:rPr>
@@ -2845,7 +2845,7 @@
           <w14:ligatures w14:val="standardContextual"/>
         </w:rPr>
       </w:pPr>
-      <w:hyperlink w:anchor="_Toc242028232" w:history="1">
+      <w:hyperlink w:anchor="_Toc242030966" w:history="1">
         <w:r>
           <w:rPr>
             <w:rStyle w:val="Hyperlink"/>
@@ -2872,7 +2872,7 @@
             <w:noProof/>
             <w:webHidden/>
           </w:rPr>
-          <w:instrText xml:space="preserve"> PAGEREF _Toc242028232 \h </w:instrText>
+          <w:instrText xml:space="preserve"> PAGEREF _Toc242030966 \h </w:instrText>
         </w:r>
         <w:r>
           <w:rPr>
@@ -2919,7 +2919,7 @@
           <w14:ligatures w14:val="standardContextual"/>
         </w:rPr>
       </w:pPr>
-      <w:hyperlink w:anchor="_Toc242028233" w:history="1">
+      <w:hyperlink w:anchor="_Toc242030967" w:history="1">
         <w:r>
           <w:rPr>
             <w:rStyle w:val="Hyperlink"/>
@@ -2946,7 +2946,7 @@
             <w:noProof/>
             <w:webHidden/>
           </w:rPr>
-          <w:instrText xml:space="preserve"> PAGEREF _Toc242028233 \h </w:instrText>
+          <w:instrText xml:space="preserve"> PAGEREF _Toc242030967 \h </w:instrText>
         </w:r>
         <w:r>
           <w:rPr>
@@ -2993,7 +2993,7 @@
           <w14:ligatures w14:val="standardContextual"/>
         </w:rPr>
       </w:pPr>
-      <w:hyperlink w:anchor="_Toc242028234" w:history="1">
+      <w:hyperlink w:anchor="_Toc242030968" w:history="1">
         <w:r>
           <w:rPr>
             <w:rStyle w:val="Hyperlink"/>
@@ -3020,7 +3020,7 @@
             <w:noProof/>
             <w:webHidden/>
           </w:rPr>
-          <w:instrText xml:space="preserve"> PAGEREF _Toc242028234 \h </w:instrText>
+          <w:instrText xml:space="preserve"> PAGEREF _Toc242030968 \h </w:instrText>
         </w:r>
         <w:r>
           <w:rPr>
@@ -3067,7 +3067,7 @@
           <w14:ligatures w14:val="standardContextual"/>
         </w:rPr>
       </w:pPr>
-      <w:hyperlink w:anchor="_Toc242028235" w:history="1">
+      <w:hyperlink w:anchor="_Toc242030969" w:history="1">
         <w:r>
           <w:rPr>
             <w:rStyle w:val="Hyperlink"/>
@@ -3094,7 +3094,7 @@
             <w:noProof/>
             <w:webHidden/>
           </w:rPr>
-          <w:instrText xml:space="preserve"> PAGEREF _Toc242028235 \h </w:instrText>
+          <w:instrText xml:space="preserve"> PAGEREF _Toc242030969 \h </w:instrText>
         </w:r>
         <w:r>
           <w:rPr>
@@ -3141,7 +3141,7 @@
           <w14:ligatures w14:val="standardContextual"/>
         </w:rPr>
       </w:pPr>
-      <w:hyperlink w:anchor="_Toc242028236" w:history="1">
+      <w:hyperlink w:anchor="_Toc242030970" w:history="1">
         <w:r>
           <w:rPr>
             <w:rStyle w:val="Hyperlink"/>
@@ -3168,7 +3168,7 @@
             <w:noProof/>
             <w:webHidden/>
           </w:rPr>
-          <w:instrText xml:space="preserve"> PAGEREF _Toc242028236 \h </w:instrText>
+          <w:instrText xml:space="preserve"> PAGEREF _Toc242030970 \h </w:instrText>
         </w:r>
         <w:r>
           <w:rPr>
@@ -3215,7 +3215,7 @@
           <w14:ligatures w14:val="standardContextual"/>
         </w:rPr>
       </w:pPr>
-      <w:hyperlink w:anchor="_Toc242028237" w:history="1">
+      <w:hyperlink w:anchor="_Toc242030971" w:history="1">
         <w:r>
           <w:rPr>
             <w:rStyle w:val="Hyperlink"/>
@@ -3242,7 +3242,7 @@
             <w:noProof/>
             <w:webHidden/>
           </w:rPr>
-          <w:instrText xml:space="preserve"> PAGEREF _Toc242028237 \h </w:instrText>
+          <w:instrText xml:space="preserve"> PAGEREF _Toc242030971 \h </w:instrText>
         </w:r>
         <w:r>
           <w:rPr>
@@ -3289,7 +3289,7 @@
           <w14:ligatures w14:val="standardContextual"/>
         </w:rPr>
       </w:pPr>
-      <w:hyperlink w:anchor="_Toc242028238" w:history="1">
+      <w:hyperlink w:anchor="_Toc242030972" w:history="1">
         <w:r>
           <w:rPr>
             <w:rStyle w:val="Hyperlink"/>
@@ -3316,7 +3316,7 @@
             <w:noProof/>
             <w:webHidden/>
           </w:rPr>
-          <w:instrText xml:space="preserve"> PAGEREF _Toc242028238 \h </w:instrText>
+          <w:instrText xml:space="preserve"> PAGEREF _Toc242030972 \h </w:instrText>
         </w:r>
         <w:r>
           <w:rPr>
@@ -3363,7 +3363,7 @@
           <w14:ligatures w14:val="standardContextual"/>
         </w:rPr>
       </w:pPr>
-      <w:hyperlink w:anchor="_Toc242028239" w:history="1">
+      <w:hyperlink w:anchor="_Toc242030973" w:history="1">
         <w:r>
           <w:rPr>
             <w:rStyle w:val="Hyperlink"/>
@@ -3390,7 +3390,7 @@
             <w:noProof/>
             <w:webHidden/>
           </w:rPr>
-          <w:instrText xml:space="preserve"> PAGEREF _Toc242028239 \h </w:instrText>
+          <w:instrText xml:space="preserve"> PAGEREF _Toc242030973 \h </w:instrText>
         </w:r>
         <w:r>
           <w:rPr>
@@ -3437,7 +3437,7 @@
           <w14:ligatures w14:val="standardContextual"/>
         </w:rPr>
       </w:pPr>
-      <w:hyperlink w:anchor="_Toc242028240" w:history="1">
+      <w:hyperlink w:anchor="_Toc242030974" w:history="1">
         <w:r>
           <w:rPr>
             <w:rStyle w:val="Hyperlink"/>
@@ -3464,7 +3464,7 @@
             <w:noProof/>
             <w:webHidden/>
           </w:rPr>
-          <w:instrText xml:space="preserve"> PAGEREF _Toc242028240 \h </w:instrText>
+          <w:instrText xml:space="preserve"> PAGEREF _Toc242030974 \h </w:instrText>
         </w:r>
         <w:r>
           <w:rPr>
@@ -3511,7 +3511,7 @@
           <w14:ligatures w14:val="standardContextual"/>
         </w:rPr>
       </w:pPr>
-      <w:hyperlink w:anchor="_Toc242028241" w:history="1">
+      <w:hyperlink w:anchor="_Toc242030975" w:history="1">
         <w:r>
           <w:rPr>
             <w:rStyle w:val="Hyperlink"/>
@@ -3538,7 +3538,7 @@
             <w:noProof/>
             <w:webHidden/>
           </w:rPr>
-          <w:instrText xml:space="preserve"> PAGEREF _Toc242028241 \h </w:instrText>
+          <w:instrText xml:space="preserve"> PAGEREF _Toc242030975 \h </w:instrText>
         </w:r>
         <w:r>
           <w:rPr>
@@ -3585,7 +3585,7 @@
           <w14:ligatures w14:val="standardContextual"/>
         </w:rPr>
       </w:pPr>
-      <w:hyperlink w:anchor="_Toc242028242" w:history="1">
+      <w:hyperlink w:anchor="_Toc242030976" w:history="1">
         <w:r>
           <w:rPr>
             <w:rStyle w:val="Hyperlink"/>
@@ -3612,7 +3612,7 @@
             <w:noProof/>
             <w:webHidden/>
           </w:rPr>
-          <w:instrText xml:space="preserve"> PAGEREF _Toc242028242 \h </w:instrText>
+          <w:instrText xml:space="preserve"> PAGEREF _Toc242030976 \h </w:instrText>
         </w:r>
         <w:r>
           <w:rPr>
@@ -3659,7 +3659,7 @@
           <w14:ligatures w14:val="standardContextual"/>
         </w:rPr>
       </w:pPr>
-      <w:hyperlink w:anchor="_Toc242028243" w:history="1">
+      <w:hyperlink w:anchor="_Toc242030977" w:history="1">
         <w:r>
           <w:rPr>
             <w:rStyle w:val="Hyperlink"/>
@@ -3686,7 +3686,7 @@
             <w:noProof/>
             <w:webHidden/>
           </w:rPr>
-          <w:instrText xml:space="preserve"> PAGEREF _Toc242028243 \h </w:instrText>
+          <w:instrText xml:space="preserve"> PAGEREF _Toc242030977 \h </w:instrText>
         </w:r>
         <w:r>
           <w:rPr>
@@ -3733,7 +3733,7 @@
           <w14:ligatures w14:val="standardContextual"/>
         </w:rPr>
       </w:pPr>
-      <w:hyperlink w:anchor="_Toc242028244" w:history="1">
+      <w:hyperlink w:anchor="_Toc242030978" w:history="1">
         <w:r>
           <w:rPr>
             <w:rStyle w:val="Hyperlink"/>
@@ -3760,7 +3760,7 @@
             <w:noProof/>
             <w:webHidden/>
           </w:rPr>
-          <w:instrText xml:space="preserve"> PAGEREF _Toc242028244 \h </w:instrText>
+          <w:instrText xml:space="preserve"> PAGEREF _Toc242030978 \h </w:instrText>
         </w:r>
         <w:r>
           <w:rPr>
@@ -3807,7 +3807,7 @@
           <w14:ligatures w14:val="standardContextual"/>
         </w:rPr>
       </w:pPr>
-      <w:hyperlink w:anchor="_Toc242028245" w:history="1">
+      <w:hyperlink w:anchor="_Toc242030979" w:history="1">
         <w:r>
           <w:rPr>
             <w:rStyle w:val="Hyperlink"/>
@@ -3834,7 +3834,7 @@
             <w:noProof/>
             <w:webHidden/>
           </w:rPr>
-          <w:instrText xml:space="preserve"> PAGEREF _Toc242028245 \h </w:instrText>
+          <w:instrText xml:space="preserve"> PAGEREF _Toc242030979 \h </w:instrText>
         </w:r>
         <w:r>
           <w:rPr>
@@ -3881,7 +3881,7 @@
           <w14:ligatures w14:val="standardContextual"/>
         </w:rPr>
       </w:pPr>
-      <w:hyperlink w:anchor="_Toc242028246" w:history="1">
+      <w:hyperlink w:anchor="_Toc242030980" w:history="1">
         <w:r>
           <w:rPr>
             <w:rStyle w:val="Hyperlink"/>
@@ -3908,7 +3908,7 @@
             <w:noProof/>
             <w:webHidden/>
           </w:rPr>
-          <w:instrText xml:space="preserve"> PAGEREF _Toc242028246 \h </w:instrText>
+          <w:instrText xml:space="preserve"> PAGEREF _Toc242030980 \h </w:instrText>
         </w:r>
         <w:r>
           <w:rPr>
@@ -3955,7 +3955,7 @@
           <w14:ligatures w14:val="standardContextual"/>
         </w:rPr>
       </w:pPr>
-      <w:hyperlink w:anchor="_Toc242028247" w:history="1">
+      <w:hyperlink w:anchor="_Toc242030981" w:history="1">
         <w:r>
           <w:rPr>
             <w:rStyle w:val="Hyperlink"/>
@@ -3982,7 +3982,7 @@
             <w:noProof/>
             <w:webHidden/>
           </w:rPr>
-          <w:instrText xml:space="preserve"> PAGEREF _Toc242028247 \h </w:instrText>
+          <w:instrText xml:space="preserve"> PAGEREF _Toc242030981 \h </w:instrText>
         </w:r>
         <w:r>
           <w:rPr>
@@ -4029,7 +4029,7 @@
           <w14:ligatures w14:val="standardContextual"/>
         </w:rPr>
       </w:pPr>
-      <w:hyperlink w:anchor="_Toc242028248" w:history="1">
+      <w:hyperlink w:anchor="_Toc242030982" w:history="1">
         <w:r>
           <w:rPr>
             <w:rStyle w:val="Hyperlink"/>
@@ -4056,7 +4056,7 @@
             <w:noProof/>
             <w:webHidden/>
           </w:rPr>
-          <w:instrText xml:space="preserve"> PAGEREF _Toc242028248 \h </w:instrText>
+          <w:instrText xml:space="preserve"> PAGEREF _Toc242030982 \h </w:instrText>
         </w:r>
         <w:r>
           <w:rPr>
@@ -4103,7 +4103,7 @@
           <w14:ligatures w14:val="standardContextual"/>
         </w:rPr>
       </w:pPr>
-      <w:hyperlink w:anchor="_Toc242028249" w:history="1">
+      <w:hyperlink w:anchor="_Toc242030983" w:history="1">
         <w:r>
           <w:rPr>
             <w:rStyle w:val="Hyperlink"/>
@@ -4130,7 +4130,7 @@
             <w:noProof/>
             <w:webHidden/>
           </w:rPr>
-          <w:instrText xml:space="preserve"> PAGEREF _Toc242028249 \h </w:instrText>
+          <w:instrText xml:space="preserve"> PAGEREF _Toc242030983 \h </w:instrText>
         </w:r>
         <w:r>
           <w:rPr>
@@ -4177,7 +4177,7 @@
           <w14:ligatures w14:val="standardContextual"/>
         </w:rPr>
       </w:pPr>
-      <w:hyperlink w:anchor="_Toc242028250" w:history="1">
+      <w:hyperlink w:anchor="_Toc242030984" w:history="1">
         <w:r>
           <w:rPr>
             <w:rStyle w:val="Hyperlink"/>
@@ -4204,7 +4204,7 @@
             <w:noProof/>
             <w:webHidden/>
           </w:rPr>
-          <w:instrText xml:space="preserve"> PAGEREF _Toc242028250 \h </w:instrText>
+          <w:instrText xml:space="preserve"> PAGEREF _Toc242030984 \h </w:instrText>
         </w:r>
         <w:r>
           <w:rPr>
@@ -4251,7 +4251,7 @@
           <w14:ligatures w14:val="standardContextual"/>
         </w:rPr>
       </w:pPr>
-      <w:hyperlink w:anchor="_Toc242028251" w:history="1">
+      <w:hyperlink w:anchor="_Toc242030985" w:history="1">
         <w:r>
           <w:rPr>
             <w:rStyle w:val="Hyperlink"/>
@@ -4278,7 +4278,7 @@
             <w:noProof/>
             <w:webHidden/>
           </w:rPr>
-          <w:instrText xml:space="preserve"> PAGEREF _Toc242028251 \h </w:instrText>
+          <w:instrText xml:space="preserve"> PAGEREF _Toc242030985 \h </w:instrText>
         </w:r>
         <w:r>
           <w:rPr>
@@ -4325,7 +4325,7 @@
           <w14:ligatures w14:val="standardContextual"/>
         </w:rPr>
       </w:pPr>
-      <w:hyperlink w:anchor="_Toc242028252" w:history="1">
+      <w:hyperlink w:anchor="_Toc242030986" w:history="1">
         <w:r>
           <w:rPr>
             <w:rStyle w:val="Hyperlink"/>
@@ -4352,7 +4352,7 @@
             <w:noProof/>
             <w:webHidden/>
           </w:rPr>
-          <w:instrText xml:space="preserve"> PAGEREF _Toc242028252 \h </w:instrText>
+          <w:instrText xml:space="preserve"> PAGEREF _Toc242030986 \h </w:instrText>
         </w:r>
         <w:r>
           <w:rPr>
@@ -4399,7 +4399,7 @@
           <w14:ligatures w14:val="standardContextual"/>
         </w:rPr>
       </w:pPr>
-      <w:hyperlink w:anchor="_Toc242028253" w:history="1">
+      <w:hyperlink w:anchor="_Toc242030987" w:history="1">
         <w:r>
           <w:rPr>
             <w:rStyle w:val="Hyperlink"/>
@@ -4426,7 +4426,7 @@
             <w:noProof/>
             <w:webHidden/>
           </w:rPr>
-          <w:instrText xml:space="preserve"> PAGEREF _Toc242028253 \h </w:instrText>
+          <w:instrText xml:space="preserve"> PAGEREF _Toc242030987 \h </w:instrText>
         </w:r>
         <w:r>
           <w:rPr>
@@ -4473,7 +4473,7 @@
           <w14:ligatures w14:val="standardContextual"/>
         </w:rPr>
       </w:pPr>
-      <w:hyperlink w:anchor="_Toc242028254" w:history="1">
+      <w:hyperlink w:anchor="_Toc242030988" w:history="1">
         <w:r>
           <w:rPr>
             <w:rStyle w:val="Hyperlink"/>
@@ -4500,7 +4500,7 @@
             <w:noProof/>
             <w:webHidden/>
           </w:rPr>
-          <w:instrText xml:space="preserve"> PAGEREF _Toc242028254 \h </w:instrText>
+          <w:instrText xml:space="preserve"> PAGEREF _Toc242030988 \h </w:instrText>
         </w:r>
         <w:r>
           <w:rPr>
@@ -4547,7 +4547,7 @@
           <w14:ligatures w14:val="standardContextual"/>
         </w:rPr>
       </w:pPr>
-      <w:hyperlink w:anchor="_Toc242028255" w:history="1">
+      <w:hyperlink w:anchor="_Toc242030989" w:history="1">
         <w:r>
           <w:rPr>
             <w:rStyle w:val="Hyperlink"/>
@@ -4574,7 +4574,7 @@
             <w:noProof/>
             <w:webHidden/>
           </w:rPr>
-          <w:instrText xml:space="preserve"> PAGEREF _Toc242028255 \h </w:instrText>
+          <w:instrText xml:space="preserve"> PAGEREF _Toc242030989 \h </w:instrText>
         </w:r>
         <w:r>
           <w:rPr>
@@ -4621,7 +4621,7 @@
           <w14:ligatures w14:val="standardContextual"/>
         </w:rPr>
       </w:pPr>
-      <w:hyperlink w:anchor="_Toc242028256" w:history="1">
+      <w:hyperlink w:anchor="_Toc242030990" w:history="1">
         <w:r>
           <w:rPr>
             <w:rStyle w:val="Hyperlink"/>
@@ -4648,7 +4648,7 @@
             <w:noProof/>
             <w:webHidden/>
           </w:rPr>
-          <w:instrText xml:space="preserve"> PAGEREF _Toc242028256 \h </w:instrText>
+          <w:instrText xml:space="preserve"> PAGEREF _Toc242030990 \h </w:instrText>
         </w:r>
         <w:r>
           <w:rPr>
@@ -4695,7 +4695,7 @@
           <w14:ligatures w14:val="standardContextual"/>
         </w:rPr>
       </w:pPr>
-      <w:hyperlink w:anchor="_Toc242028257" w:history="1">
+      <w:hyperlink w:anchor="_Toc242030991" w:history="1">
         <w:r>
           <w:rPr>
             <w:rStyle w:val="Hyperlink"/>
@@ -4722,7 +4722,7 @@
             <w:noProof/>
             <w:webHidden/>
           </w:rPr>
-          <w:instrText xml:space="preserve"> PAGEREF _Toc242028257 \h </w:instrText>
+          <w:instrText xml:space="preserve"> PAGEREF _Toc242030991 \h </w:instrText>
         </w:r>
         <w:r>
           <w:rPr>
@@ -4769,7 +4769,7 @@
           <w14:ligatures w14:val="standardContextual"/>
         </w:rPr>
       </w:pPr>
-      <w:hyperlink w:anchor="_Toc242028258" w:history="1">
+      <w:hyperlink w:anchor="_Toc242030992" w:history="1">
         <w:r>
           <w:rPr>
             <w:rStyle w:val="Hyperlink"/>
@@ -4796,7 +4796,7 @@
             <w:noProof/>
             <w:webHidden/>
           </w:rPr>
-          <w:instrText xml:space="preserve"> PAGEREF _Toc242028258 \h </w:instrText>
+          <w:instrText xml:space="preserve"> PAGEREF _Toc242030992 \h </w:instrText>
         </w:r>
         <w:r>
           <w:rPr>
@@ -4843,7 +4843,7 @@
           <w14:ligatures w14:val="standardContextual"/>
         </w:rPr>
       </w:pPr>
-      <w:hyperlink w:anchor="_Toc242028259" w:history="1">
+      <w:hyperlink w:anchor="_Toc242030993" w:history="1">
         <w:r>
           <w:rPr>
             <w:rStyle w:val="Hyperlink"/>
@@ -4870,7 +4870,7 @@
             <w:noProof/>
             <w:webHidden/>
           </w:rPr>
-          <w:instrText xml:space="preserve"> PAGEREF _Toc242028259 \h </w:instrText>
+          <w:instrText xml:space="preserve"> PAGEREF _Toc242030993 \h </w:instrText>
         </w:r>
         <w:r>
           <w:rPr>
@@ -4917,7 +4917,7 @@
           <w14:ligatures w14:val="standardContextual"/>
         </w:rPr>
       </w:pPr>
-      <w:hyperlink w:anchor="_Toc242028260" w:history="1">
+      <w:hyperlink w:anchor="_Toc242030994" w:history="1">
         <w:r>
           <w:rPr>
             <w:rStyle w:val="Hyperlink"/>
@@ -4944,7 +4944,7 @@
             <w:noProof/>
             <w:webHidden/>
           </w:rPr>
-          <w:instrText xml:space="preserve"> PAGEREF _Toc242028260 \h </w:instrText>
+          <w:instrText xml:space="preserve"> PAGEREF _Toc242030994 \h </w:instrText>
         </w:r>
         <w:r>
           <w:rPr>
@@ -4991,7 +4991,7 @@
           <w14:ligatures w14:val="standardContextual"/>
         </w:rPr>
       </w:pPr>
-      <w:hyperlink w:anchor="_Toc242028261" w:history="1">
+      <w:hyperlink w:anchor="_Toc242030995" w:history="1">
         <w:r>
           <w:rPr>
             <w:rStyle w:val="Hyperlink"/>
@@ -5018,7 +5018,7 @@
             <w:noProof/>
             <w:webHidden/>
           </w:rPr>
-          <w:instrText xml:space="preserve"> PAGEREF _Toc242028261 \h </w:instrText>
+          <w:instrText xml:space="preserve"> PAGEREF _Toc242030995 \h </w:instrText>
         </w:r>
         <w:r>
           <w:rPr>
@@ -5065,7 +5065,7 @@
           <w14:ligatures w14:val="standardContextual"/>
         </w:rPr>
       </w:pPr>
-      <w:hyperlink w:anchor="_Toc242028262" w:history="1">
+      <w:hyperlink w:anchor="_Toc242030996" w:history="1">
         <w:r>
           <w:rPr>
             <w:rStyle w:val="Hyperlink"/>
@@ -5092,7 +5092,7 @@
             <w:noProof/>
             <w:webHidden/>
           </w:rPr>
-          <w:instrText xml:space="preserve"> PAGEREF _Toc242028262 \h </w:instrText>
+          <w:instrText xml:space="preserve"> PAGEREF _Toc242030996 \h </w:instrText>
         </w:r>
         <w:r>
           <w:rPr>
@@ -5139,7 +5139,7 @@
           <w14:ligatures w14:val="standardContextual"/>
         </w:rPr>
       </w:pPr>
-      <w:hyperlink w:anchor="_Toc242028263" w:history="1">
+      <w:hyperlink w:anchor="_Toc242030997" w:history="1">
         <w:r>
           <w:rPr>
             <w:rStyle w:val="Hyperlink"/>
@@ -5166,7 +5166,7 @@
             <w:noProof/>
             <w:webHidden/>
           </w:rPr>
-          <w:instrText xml:space="preserve"> PAGEREF _Toc242028263 \h </w:instrText>
+          <w:instrText xml:space="preserve"> PAGEREF _Toc242030997 \h </w:instrText>
         </w:r>
         <w:r>
           <w:rPr>
@@ -5213,7 +5213,7 @@
           <w14:ligatures w14:val="standardContextual"/>
         </w:rPr>
       </w:pPr>
-      <w:hyperlink w:anchor="_Toc242028264" w:history="1">
+      <w:hyperlink w:anchor="_Toc242030998" w:history="1">
         <w:r>
           <w:rPr>
             <w:rStyle w:val="Hyperlink"/>
@@ -5240,7 +5240,7 @@
             <w:noProof/>
             <w:webHidden/>
           </w:rPr>
-          <w:instrText xml:space="preserve"> PAGEREF _Toc242028264 \h </w:instrText>
+          <w:instrText xml:space="preserve"> PAGEREF _Toc242030998 \h </w:instrText>
         </w:r>
         <w:r>
           <w:rPr>
@@ -5287,7 +5287,7 @@
           <w14:ligatures w14:val="standardContextual"/>
         </w:rPr>
       </w:pPr>
-      <w:hyperlink w:anchor="_Toc242028265" w:history="1">
+      <w:hyperlink w:anchor="_Toc242030999" w:history="1">
         <w:r>
           <w:rPr>
             <w:rStyle w:val="Hyperlink"/>
@@ -5314,7 +5314,7 @@
             <w:noProof/>
             <w:webHidden/>
           </w:rPr>
-          <w:instrText xml:space="preserve"> PAGEREF _Toc242028265 \h </w:instrText>
+          <w:instrText xml:space="preserve"> PAGEREF _Toc242030999 \h </w:instrText>
         </w:r>
         <w:r>
           <w:rPr>
@@ -5361,7 +5361,7 @@
           <w14:ligatures w14:val="standardContextual"/>
         </w:rPr>
       </w:pPr>
-      <w:hyperlink w:anchor="_Toc242028266" w:history="1">
+      <w:hyperlink w:anchor="_Toc242031000" w:history="1">
         <w:r>
           <w:rPr>
             <w:rStyle w:val="Hyperlink"/>
@@ -5388,7 +5388,7 @@
             <w:noProof/>
             <w:webHidden/>
           </w:rPr>
-          <w:instrText xml:space="preserve"> PAGEREF _Toc242028266 \h </w:instrText>
+          <w:instrText xml:space="preserve"> PAGEREF _Toc242031000 \h </w:instrText>
         </w:r>
         <w:r>
           <w:rPr>
@@ -5435,7 +5435,7 @@
           <w14:ligatures w14:val="standardContextual"/>
         </w:rPr>
       </w:pPr>
-      <w:hyperlink w:anchor="_Toc242028267" w:history="1">
+      <w:hyperlink w:anchor="_Toc242031001" w:history="1">
         <w:r>
           <w:rPr>
             <w:rStyle w:val="Hyperlink"/>
@@ -5462,7 +5462,7 @@
             <w:noProof/>
             <w:webHidden/>
           </w:rPr>
-          <w:instrText xml:space="preserve"> PAGEREF _Toc242028267 \h </w:instrText>
+          <w:instrText xml:space="preserve"> PAGEREF _Toc242031001 \h </w:instrText>
         </w:r>
         <w:r>
           <w:rPr>
@@ -5509,7 +5509,7 @@
           <w14:ligatures w14:val="standardContextual"/>
         </w:rPr>
       </w:pPr>
-      <w:hyperlink w:anchor="_Toc242028268" w:history="1">
+      <w:hyperlink w:anchor="_Toc242031002" w:history="1">
         <w:r>
           <w:rPr>
             <w:rStyle w:val="Hyperlink"/>
@@ -5536,7 +5536,7 @@
             <w:noProof/>
             <w:webHidden/>
           </w:rPr>
-          <w:instrText xml:space="preserve"> PAGEREF _Toc242028268 \h </w:instrText>
+          <w:instrText xml:space="preserve"> PAGEREF _Toc242031002 \h </w:instrText>
         </w:r>
         <w:r>
           <w:rPr>
@@ -5583,7 +5583,7 @@
           <w14:ligatures w14:val="standardContextual"/>
         </w:rPr>
       </w:pPr>
-      <w:hyperlink w:anchor="_Toc242028269" w:history="1">
+      <w:hyperlink w:anchor="_Toc242031003" w:history="1">
         <w:r>
           <w:rPr>
             <w:rStyle w:val="Hyperlink"/>
@@ -5610,7 +5610,7 @@
             <w:noProof/>
             <w:webHidden/>
           </w:rPr>
-          <w:instrText xml:space="preserve"> PAGEREF _Toc242028269 \h </w:instrText>
+          <w:instrText xml:space="preserve"> PAGEREF _Toc242031003 \h </w:instrText>
         </w:r>
         <w:r>
           <w:rPr>
@@ -5657,7 +5657,7 @@
           <w14:ligatures w14:val="standardContextual"/>
         </w:rPr>
       </w:pPr>
-      <w:hyperlink w:anchor="_Toc242028270" w:history="1">
+      <w:hyperlink w:anchor="_Toc242031004" w:history="1">
         <w:r>
           <w:rPr>
             <w:rStyle w:val="Hyperlink"/>
@@ -5684,7 +5684,7 @@
             <w:noProof/>
             <w:webHidden/>
           </w:rPr>
-          <w:instrText xml:space="preserve"> PAGEREF _Toc242028270 \h </w:instrText>
+          <w:instrText xml:space="preserve"> PAGEREF _Toc242031004 \h </w:instrText>
         </w:r>
         <w:r>
           <w:rPr>
@@ -5731,7 +5731,7 @@
           <w14:ligatures w14:val="standardContextual"/>
         </w:rPr>
       </w:pPr>
-      <w:hyperlink w:anchor="_Toc242028271" w:history="1">
+      <w:hyperlink w:anchor="_Toc242031005" w:history="1">
         <w:r>
           <w:rPr>
             <w:rStyle w:val="Hyperlink"/>
@@ -5758,7 +5758,7 @@
             <w:noProof/>
             <w:webHidden/>
           </w:rPr>
-          <w:instrText xml:space="preserve"> PAGEREF _Toc242028271 \h </w:instrText>
+          <w:instrText xml:space="preserve"> PAGEREF _Toc242031005 \h </w:instrText>
         </w:r>
         <w:r>
           <w:rPr>
@@ -5805,7 +5805,7 @@
           <w14:ligatures w14:val="standardContextual"/>
         </w:rPr>
       </w:pPr>
-      <w:hyperlink w:anchor="_Toc242028272" w:history="1">
+      <w:hyperlink w:anchor="_Toc242031006" w:history="1">
         <w:r>
           <w:rPr>
             <w:rStyle w:val="Hyperlink"/>
@@ -5832,7 +5832,7 @@
             <w:noProof/>
             <w:webHidden/>
           </w:rPr>
-          <w:instrText xml:space="preserve"> PAGEREF _Toc242028272 \h </w:instrText>
+          <w:instrText xml:space="preserve"> PAGEREF _Toc242031006 \h </w:instrText>
         </w:r>
         <w:r>
           <w:rPr>
@@ -5879,7 +5879,7 @@
           <w14:ligatures w14:val="standardContextual"/>
         </w:rPr>
       </w:pPr>
-      <w:hyperlink w:anchor="_Toc242028273" w:history="1">
+      <w:hyperlink w:anchor="_Toc242031007" w:history="1">
         <w:r>
           <w:rPr>
             <w:rStyle w:val="Hyperlink"/>
@@ -5906,7 +5906,7 @@
             <w:noProof/>
             <w:webHidden/>
           </w:rPr>
-          <w:instrText xml:space="preserve"> PAGEREF _Toc242028273 \h </w:instrText>
+          <w:instrText xml:space="preserve"> PAGEREF _Toc242031007 \h </w:instrText>
         </w:r>
         <w:r>
           <w:rPr>
@@ -5953,7 +5953,7 @@
           <w14:ligatures w14:val="standardContextual"/>
         </w:rPr>
       </w:pPr>
-      <w:hyperlink w:anchor="_Toc242028274" w:history="1">
+      <w:hyperlink w:anchor="_Toc242031008" w:history="1">
         <w:r>
           <w:rPr>
             <w:rStyle w:val="Hyperlink"/>
@@ -5980,7 +5980,7 @@
             <w:noProof/>
             <w:webHidden/>
           </w:rPr>
-          <w:instrText xml:space="preserve"> PAGEREF _Toc242028274 \h </w:instrText>
+          <w:instrText xml:space="preserve"> PAGEREF _Toc242031008 \h </w:instrText>
         </w:r>
         <w:r>
           <w:rPr>
@@ -6027,7 +6027,7 @@
           <w14:ligatures w14:val="standardContextual"/>
         </w:rPr>
       </w:pPr>
-      <w:hyperlink w:anchor="_Toc242028275" w:history="1">
+      <w:hyperlink w:anchor="_Toc242031009" w:history="1">
         <w:r>
           <w:rPr>
             <w:rStyle w:val="Hyperlink"/>
@@ -6054,7 +6054,7 @@
             <w:noProof/>
             <w:webHidden/>
           </w:rPr>
-          <w:instrText xml:space="preserve"> PAGEREF _Toc242028275 \h </w:instrText>
+          <w:instrText xml:space="preserve"> PAGEREF _Toc242031009 \h </w:instrText>
         </w:r>
         <w:r>
           <w:rPr>
@@ -6101,7 +6101,7 @@
           <w14:ligatures w14:val="standardContextual"/>
         </w:rPr>
       </w:pPr>
-      <w:hyperlink w:anchor="_Toc242028276" w:history="1">
+      <w:hyperlink w:anchor="_Toc242031010" w:history="1">
         <w:r>
           <w:rPr>
             <w:rStyle w:val="Hyperlink"/>
@@ -6128,7 +6128,7 @@
             <w:noProof/>
             <w:webHidden/>
           </w:rPr>
-          <w:instrText xml:space="preserve"> PAGEREF _Toc242028276 \h </w:instrText>
+          <w:instrText xml:space="preserve"> PAGEREF _Toc242031010 \h </w:instrText>
         </w:r>
         <w:r>
           <w:rPr>
@@ -6175,7 +6175,7 @@
           <w14:ligatures w14:val="standardContextual"/>
         </w:rPr>
       </w:pPr>
-      <w:hyperlink w:anchor="_Toc242028277" w:history="1">
+      <w:hyperlink w:anchor="_Toc242031011" w:history="1">
         <w:r>
           <w:rPr>
             <w:rStyle w:val="Hyperlink"/>
@@ -6202,7 +6202,7 @@
             <w:noProof/>
             <w:webHidden/>
           </w:rPr>
-          <w:instrText xml:space="preserve"> PAGEREF _Toc242028277 \h </w:instrText>
+          <w:instrText xml:space="preserve"> PAGEREF _Toc242031011 \h </w:instrText>
         </w:r>
         <w:r>
           <w:rPr>
@@ -6249,7 +6249,7 @@
           <w14:ligatures w14:val="standardContextual"/>
         </w:rPr>
       </w:pPr>
-      <w:hyperlink w:anchor="_Toc242028278" w:history="1">
+      <w:hyperlink w:anchor="_Toc242031012" w:history="1">
         <w:r>
           <w:rPr>
             <w:rStyle w:val="Hyperlink"/>
@@ -6276,7 +6276,7 @@
             <w:noProof/>
             <w:webHidden/>
           </w:rPr>
-          <w:instrText xml:space="preserve"> PAGEREF _Toc242028278 \h </w:instrText>
+          <w:instrText xml:space="preserve"> PAGEREF _Toc242031012 \h </w:instrText>
         </w:r>
         <w:r>
           <w:rPr>
@@ -6323,7 +6323,7 @@
           <w14:ligatures w14:val="standardContextual"/>
         </w:rPr>
       </w:pPr>
-      <w:hyperlink w:anchor="_Toc242028279" w:history="1">
+      <w:hyperlink w:anchor="_Toc242031013" w:history="1">
         <w:r>
           <w:rPr>
             <w:rStyle w:val="Hyperlink"/>
@@ -6350,7 +6350,7 @@
             <w:noProof/>
             <w:webHidden/>
           </w:rPr>
-          <w:instrText xml:space="preserve"> PAGEREF _Toc242028279 \h </w:instrText>
+          <w:instrText xml:space="preserve"> PAGEREF _Toc242031013 \h </w:instrText>
         </w:r>
         <w:r>
           <w:rPr>
@@ -6397,7 +6397,7 @@
           <w14:ligatures w14:val="standardContextual"/>
         </w:rPr>
       </w:pPr>
-      <w:hyperlink w:anchor="_Toc242028280" w:history="1">
+      <w:hyperlink w:anchor="_Toc242031014" w:history="1">
         <w:r>
           <w:rPr>
             <w:rStyle w:val="Hyperlink"/>
@@ -6424,7 +6424,7 @@
             <w:noProof/>
             <w:webHidden/>
           </w:rPr>
-          <w:instrText xml:space="preserve"> PAGEREF _Toc242028280 \h </w:instrText>
+          <w:instrText xml:space="preserve"> PAGEREF _Toc242031014 \h </w:instrText>
         </w:r>
         <w:r>
           <w:rPr>
@@ -6471,7 +6471,7 @@
           <w14:ligatures w14:val="standardContextual"/>
         </w:rPr>
       </w:pPr>
-      <w:hyperlink w:anchor="_Toc242028281" w:history="1">
+      <w:hyperlink w:anchor="_Toc242031015" w:history="1">
         <w:r>
           <w:rPr>
             <w:rStyle w:val="Hyperlink"/>
@@ -6498,7 +6498,7 @@
             <w:noProof/>
             <w:webHidden/>
           </w:rPr>
-          <w:instrText xml:space="preserve"> PAGEREF _Toc242028281 \h </w:instrText>
+          <w:instrText xml:space="preserve"> PAGEREF _Toc242031015 \h </w:instrText>
         </w:r>
         <w:r>
           <w:rPr>
@@ -6545,7 +6545,7 @@
           <w14:ligatures w14:val="standardContextual"/>
         </w:rPr>
       </w:pPr>
-      <w:hyperlink w:anchor="_Toc242028282" w:history="1">
+      <w:hyperlink w:anchor="_Toc242031016" w:history="1">
         <w:r>
           <w:rPr>
             <w:rStyle w:val="Hyperlink"/>
@@ -6572,7 +6572,7 @@
             <w:noProof/>
             <w:webHidden/>
           </w:rPr>
-          <w:instrText xml:space="preserve"> PAGEREF _Toc242028282 \h </w:instrText>
+          <w:instrText xml:space="preserve"> PAGEREF _Toc242031016 \h </w:instrText>
         </w:r>
         <w:r>
           <w:rPr>
@@ -6619,7 +6619,7 @@
           <w14:ligatures w14:val="standardContextual"/>
         </w:rPr>
       </w:pPr>
-      <w:hyperlink w:anchor="_Toc242028283" w:history="1">
+      <w:hyperlink w:anchor="_Toc242031017" w:history="1">
         <w:r>
           <w:rPr>
             <w:rStyle w:val="Hyperlink"/>
@@ -6646,7 +6646,7 @@
             <w:noProof/>
             <w:webHidden/>
           </w:rPr>
-          <w:instrText xml:space="preserve"> PAGEREF _Toc242028283 \h </w:instrText>
+          <w:instrText xml:space="preserve"> PAGEREF _Toc242031017 \h </w:instrText>
         </w:r>
         <w:r>
           <w:rPr>
@@ -6693,7 +6693,7 @@
           <w14:ligatures w14:val="standardContextual"/>
         </w:rPr>
       </w:pPr>
-      <w:hyperlink w:anchor="_Toc242028284" w:history="1">
+      <w:hyperlink w:anchor="_Toc242031018" w:history="1">
         <w:r>
           <w:rPr>
             <w:rStyle w:val="Hyperlink"/>
@@ -6720,7 +6720,7 @@
             <w:noProof/>
             <w:webHidden/>
           </w:rPr>
-          <w:instrText xml:space="preserve"> PAGEREF _Toc242028284 \h </w:instrText>
+          <w:instrText xml:space="preserve"> PAGEREF _Toc242031018 \h </w:instrText>
         </w:r>
         <w:r>
           <w:rPr>
@@ -6767,7 +6767,7 @@
           <w14:ligatures w14:val="standardContextual"/>
         </w:rPr>
       </w:pPr>
-      <w:hyperlink w:anchor="_Toc242028285" w:history="1">
+      <w:hyperlink w:anchor="_Toc242031019" w:history="1">
         <w:r>
           <w:rPr>
             <w:rStyle w:val="Hyperlink"/>
@@ -6794,7 +6794,7 @@
             <w:noProof/>
             <w:webHidden/>
           </w:rPr>
-          <w:instrText xml:space="preserve"> PAGEREF _Toc242028285 \h </w:instrText>
+          <w:instrText xml:space="preserve"> PAGEREF _Toc242031019 \h </w:instrText>
         </w:r>
         <w:r>
           <w:rPr>
@@ -6841,7 +6841,7 @@
           <w14:ligatures w14:val="standardContextual"/>
         </w:rPr>
       </w:pPr>
-      <w:hyperlink w:anchor="_Toc242028286" w:history="1">
+      <w:hyperlink w:anchor="_Toc242031020" w:history="1">
         <w:r>
           <w:rPr>
             <w:rStyle w:val="Hyperlink"/>
@@ -6868,7 +6868,7 @@
             <w:noProof/>
             <w:webHidden/>
           </w:rPr>
-          <w:instrText xml:space="preserve"> PAGEREF _Toc242028286 \h </w:instrText>
+          <w:instrText xml:space="preserve"> PAGEREF _Toc242031020 \h </w:instrText>
         </w:r>
         <w:r>
           <w:rPr>
@@ -6915,7 +6915,7 @@
           <w14:ligatures w14:val="standardContextual"/>
         </w:rPr>
       </w:pPr>
-      <w:hyperlink w:anchor="_Toc242028287" w:history="1">
+      <w:hyperlink w:anchor="_Toc242031021" w:history="1">
         <w:r>
           <w:rPr>
             <w:rStyle w:val="Hyperlink"/>
@@ -6942,7 +6942,7 @@
             <w:noProof/>
             <w:webHidden/>
           </w:rPr>
-          <w:instrText xml:space="preserve"> PAGEREF _Toc242028287 \h </w:instrText>
+          <w:instrText xml:space="preserve"> PAGEREF _Toc242031021 \h </w:instrText>
         </w:r>
         <w:r>
           <w:rPr>
@@ -6989,7 +6989,7 @@
           <w14:ligatures w14:val="standardContextual"/>
         </w:rPr>
       </w:pPr>
-      <w:hyperlink w:anchor="_Toc242028288" w:history="1">
+      <w:hyperlink w:anchor="_Toc242031022" w:history="1">
         <w:r>
           <w:rPr>
             <w:rStyle w:val="Hyperlink"/>
@@ -7016,7 +7016,7 @@
             <w:noProof/>
             <w:webHidden/>
           </w:rPr>
-          <w:instrText xml:space="preserve"> PAGEREF _Toc242028288 \h </w:instrText>
+          <w:instrText xml:space="preserve"> PAGEREF _Toc242031022 \h </w:instrText>
         </w:r>
         <w:r>
           <w:rPr>
@@ -7063,7 +7063,7 @@
           <w14:ligatures w14:val="standardContextual"/>
         </w:rPr>
       </w:pPr>
-      <w:hyperlink w:anchor="_Toc242028289" w:history="1">
+      <w:hyperlink w:anchor="_Toc242031023" w:history="1">
         <w:r>
           <w:rPr>
             <w:rStyle w:val="Hyperlink"/>
@@ -7090,7 +7090,7 @@
             <w:noProof/>
             <w:webHidden/>
           </w:rPr>
-          <w:instrText xml:space="preserve"> PAGEREF _Toc242028289 \h </w:instrText>
+          <w:instrText xml:space="preserve"> PAGEREF _Toc242031023 \h </w:instrText>
         </w:r>
         <w:r>
           <w:rPr>
@@ -7137,7 +7137,7 @@
           <w14:ligatures w14:val="standardContextual"/>
         </w:rPr>
       </w:pPr>
-      <w:hyperlink w:anchor="_Toc242028290" w:history="1">
+      <w:hyperlink w:anchor="_Toc242031024" w:history="1">
         <w:r>
           <w:rPr>
             <w:rStyle w:val="Hyperlink"/>
@@ -7164,7 +7164,7 @@
             <w:noProof/>
             <w:webHidden/>
           </w:rPr>
-          <w:instrText xml:space="preserve"> PAGEREF _Toc242028290 \h </w:instrText>
+          <w:instrText xml:space="preserve"> PAGEREF _Toc242031024 \h </w:instrText>
         </w:r>
         <w:r>
           <w:rPr>
@@ -7211,7 +7211,7 @@
           <w14:ligatures w14:val="standardContextual"/>
         </w:rPr>
       </w:pPr>
-      <w:hyperlink w:anchor="_Toc242028291" w:history="1">
+      <w:hyperlink w:anchor="_Toc242031025" w:history="1">
         <w:r>
           <w:rPr>
             <w:rStyle w:val="Hyperlink"/>
@@ -7238,7 +7238,7 @@
             <w:noProof/>
             <w:webHidden/>
           </w:rPr>
-          <w:instrText xml:space="preserve"> PAGEREF _Toc242028291 \h </w:instrText>
+          <w:instrText xml:space="preserve"> PAGEREF _Toc242031025 \h </w:instrText>
         </w:r>
         <w:r>
           <w:rPr>
@@ -7285,7 +7285,7 @@
           <w14:ligatures w14:val="standardContextual"/>
         </w:rPr>
       </w:pPr>
-      <w:hyperlink w:anchor="_Toc242028292" w:history="1">
+      <w:hyperlink w:anchor="_Toc242031026" w:history="1">
         <w:r>
           <w:rPr>
             <w:rStyle w:val="Hyperlink"/>
@@ -7312,7 +7312,7 @@
             <w:noProof/>
             <w:webHidden/>
           </w:rPr>
-          <w:instrText xml:space="preserve"> PAGEREF _Toc242028292 \h </w:instrText>
+          <w:instrText xml:space="preserve"> PAGEREF _Toc242031026 \h </w:instrText>
         </w:r>
         <w:r>
           <w:rPr>
@@ -7359,7 +7359,7 @@
           <w14:ligatures w14:val="standardContextual"/>
         </w:rPr>
       </w:pPr>
-      <w:hyperlink w:anchor="_Toc242028293" w:history="1">
+      <w:hyperlink w:anchor="_Toc242031027" w:history="1">
         <w:r>
           <w:rPr>
             <w:rStyle w:val="Hyperlink"/>
@@ -7386,7 +7386,7 @@
             <w:noProof/>
             <w:webHidden/>
           </w:rPr>
-          <w:instrText xml:space="preserve"> PAGEREF _Toc242028293 \h </w:instrText>
+          <w:instrText xml:space="preserve"> PAGEREF _Toc242031027 \h </w:instrText>
         </w:r>
         <w:r>
           <w:rPr>
@@ -7433,7 +7433,7 @@
           <w14:ligatures w14:val="standardContextual"/>
         </w:rPr>
       </w:pPr>
-      <w:hyperlink w:anchor="_Toc242028294" w:history="1">
+      <w:hyperlink w:anchor="_Toc242031028" w:history="1">
         <w:r>
           <w:rPr>
             <w:rStyle w:val="Hyperlink"/>
@@ -7460,7 +7460,7 @@
             <w:noProof/>
             <w:webHidden/>
           </w:rPr>
-          <w:instrText xml:space="preserve"> PAGEREF _Toc242028294 \h </w:instrText>
+          <w:instrText xml:space="preserve"> PAGEREF _Toc242031028 \h </w:instrText>
         </w:r>
         <w:r>
           <w:rPr>
@@ -7507,7 +7507,7 @@
           <w14:ligatures w14:val="standardContextual"/>
         </w:rPr>
       </w:pPr>
-      <w:hyperlink w:anchor="_Toc242028295" w:history="1">
+      <w:hyperlink w:anchor="_Toc242031029" w:history="1">
         <w:r>
           <w:rPr>
             <w:rStyle w:val="Hyperlink"/>
@@ -7534,7 +7534,7 @@
             <w:noProof/>
             <w:webHidden/>
           </w:rPr>
-          <w:instrText xml:space="preserve"> PAGEREF _Toc242028295 \h </w:instrText>
+          <w:instrText xml:space="preserve"> PAGEREF _Toc242031029 \h </w:instrText>
         </w:r>
         <w:r>
           <w:rPr>
@@ -7581,7 +7581,7 @@
           <w14:ligatures w14:val="standardContextual"/>
         </w:rPr>
       </w:pPr>
-      <w:hyperlink w:anchor="_Toc242028296" w:history="1">
+      <w:hyperlink w:anchor="_Toc242031030" w:history="1">
         <w:r>
           <w:rPr>
             <w:rStyle w:val="Hyperlink"/>
@@ -7608,7 +7608,7 @@
             <w:noProof/>
             <w:webHidden/>
           </w:rPr>
-          <w:instrText xml:space="preserve"> PAGEREF _Toc242028296 \h </w:instrText>
+          <w:instrText xml:space="preserve"> PAGEREF _Toc242031030 \h </w:instrText>
         </w:r>
         <w:r>
           <w:rPr>
@@ -7655,7 +7655,7 @@
           <w14:ligatures w14:val="standardContextual"/>
         </w:rPr>
       </w:pPr>
-      <w:hyperlink w:anchor="_Toc242028297" w:history="1">
+      <w:hyperlink w:anchor="_Toc242031031" w:history="1">
         <w:r>
           <w:rPr>
             <w:rStyle w:val="Hyperlink"/>
@@ -7682,7 +7682,7 @@
             <w:noProof/>
             <w:webHidden/>
           </w:rPr>
-          <w:instrText xml:space="preserve"> PAGEREF _Toc242028297 \h </w:instrText>
+          <w:instrText xml:space="preserve"> PAGEREF _Toc242031031 \h </w:instrText>
         </w:r>
         <w:r>
           <w:rPr>
@@ -7729,7 +7729,7 @@
           <w14:ligatures w14:val="standardContextual"/>
         </w:rPr>
       </w:pPr>
-      <w:hyperlink w:anchor="_Toc242028298" w:history="1">
+      <w:hyperlink w:anchor="_Toc242031032" w:history="1">
         <w:r>
           <w:rPr>
             <w:rStyle w:val="Hyperlink"/>
@@ -7756,7 +7756,7 @@
             <w:noProof/>
             <w:webHidden/>
           </w:rPr>
-          <w:instrText xml:space="preserve"> PAGEREF _Toc242028298 \h </w:instrText>
+          <w:instrText xml:space="preserve"> PAGEREF _Toc242031032 \h </w:instrText>
         </w:r>
         <w:r>
           <w:rPr>
@@ -7803,7 +7803,7 @@
           <w14:ligatures w14:val="standardContextual"/>
         </w:rPr>
       </w:pPr>
-      <w:hyperlink w:anchor="_Toc242028299" w:history="1">
+      <w:hyperlink w:anchor="_Toc242031033" w:history="1">
         <w:r>
           <w:rPr>
             <w:rStyle w:val="Hyperlink"/>
@@ -7830,7 +7830,7 @@
             <w:noProof/>
             <w:webHidden/>
           </w:rPr>
-          <w:instrText xml:space="preserve"> PAGEREF _Toc242028299 \h </w:instrText>
+          <w:instrText xml:space="preserve"> PAGEREF _Toc242031033 \h </w:instrText>
         </w:r>
         <w:r>
           <w:rPr>
@@ -7877,7 +7877,7 @@
           <w14:ligatures w14:val="standardContextual"/>
         </w:rPr>
       </w:pPr>
-      <w:hyperlink w:anchor="_Toc242028300" w:history="1">
+      <w:hyperlink w:anchor="_Toc242031034" w:history="1">
         <w:r>
           <w:rPr>
             <w:rStyle w:val="Hyperlink"/>
@@ -7904,7 +7904,7 @@
             <w:noProof/>
             <w:webHidden/>
           </w:rPr>
-          <w:instrText xml:space="preserve"> PAGEREF _Toc242028300 \h </w:instrText>
+          <w:instrText xml:space="preserve"> PAGEREF _Toc242031034 \h </w:instrText>
         </w:r>
         <w:r>
           <w:rPr>
@@ -7951,7 +7951,7 @@
           <w14:ligatures w14:val="standardContextual"/>
         </w:rPr>
       </w:pPr>
-      <w:hyperlink w:anchor="_Toc242028301" w:history="1">
+      <w:hyperlink w:anchor="_Toc242031035" w:history="1">
         <w:r>
           <w:rPr>
             <w:rStyle w:val="Hyperlink"/>
@@ -7978,7 +7978,7 @@
             <w:noProof/>
             <w:webHidden/>
           </w:rPr>
-          <w:instrText xml:space="preserve"> PAGEREF _Toc242028301 \h </w:instrText>
+          <w:instrText xml:space="preserve"> PAGEREF _Toc242031035 \h </w:instrText>
         </w:r>
         <w:r>
           <w:rPr>
@@ -8025,7 +8025,7 @@
           <w14:ligatures w14:val="standardContextual"/>
         </w:rPr>
       </w:pPr>
-      <w:hyperlink w:anchor="_Toc242028302" w:history="1">
+      <w:hyperlink w:anchor="_Toc242031036" w:history="1">
         <w:r>
           <w:rPr>
             <w:rStyle w:val="Hyperlink"/>
@@ -8052,7 +8052,7 @@
             <w:noProof/>
             <w:webHidden/>
           </w:rPr>
-          <w:instrText xml:space="preserve"> PAGEREF _Toc242028302 \h </w:instrText>
+          <w:instrText xml:space="preserve"> PAGEREF _Toc242031036 \h </w:instrText>
         </w:r>
         <w:r>
           <w:rPr>
@@ -8099,7 +8099,7 @@
           <w14:ligatures w14:val="standardContextual"/>
         </w:rPr>
       </w:pPr>
-      <w:hyperlink w:anchor="_Toc242028303" w:history="1">
+      <w:hyperlink w:anchor="_Toc242031037" w:history="1">
         <w:r>
           <w:rPr>
             <w:rStyle w:val="Hyperlink"/>
@@ -8126,7 +8126,7 @@
             <w:noProof/>
             <w:webHidden/>
           </w:rPr>
-          <w:instrText xml:space="preserve"> PAGEREF _Toc242028303 \h </w:instrText>
+          <w:instrText xml:space="preserve"> PAGEREF _Toc242031037 \h </w:instrText>
         </w:r>
         <w:r>
           <w:rPr>
@@ -8173,7 +8173,7 @@
           <w14:ligatures w14:val="standardContextual"/>
         </w:rPr>
       </w:pPr>
-      <w:hyperlink w:anchor="_Toc242028304" w:history="1">
+      <w:hyperlink w:anchor="_Toc242031038" w:history="1">
         <w:r>
           <w:rPr>
             <w:rStyle w:val="Hyperlink"/>
@@ -8200,7 +8200,7 @@
             <w:noProof/>
             <w:webHidden/>
           </w:rPr>
-          <w:instrText xml:space="preserve"> PAGEREF _Toc242028304 \h </w:instrText>
+          <w:instrText xml:space="preserve"> PAGEREF _Toc242031038 \h </w:instrText>
         </w:r>
         <w:r>
           <w:rPr>
@@ -8247,7 +8247,7 @@
           <w14:ligatures w14:val="standardContextual"/>
         </w:rPr>
       </w:pPr>
-      <w:hyperlink w:anchor="_Toc242028305" w:history="1">
+      <w:hyperlink w:anchor="_Toc242031039" w:history="1">
         <w:r>
           <w:rPr>
             <w:rStyle w:val="Hyperlink"/>
@@ -8274,7 +8274,7 @@
             <w:noProof/>
             <w:webHidden/>
           </w:rPr>
-          <w:instrText xml:space="preserve"> PAGEREF _Toc242028305 \h </w:instrText>
+          <w:instrText xml:space="preserve"> PAGEREF _Toc242031039 \h </w:instrText>
         </w:r>
         <w:r>
           <w:rPr>
@@ -8321,7 +8321,7 @@
           <w14:ligatures w14:val="standardContextual"/>
         </w:rPr>
       </w:pPr>
-      <w:hyperlink w:anchor="_Toc242028306" w:history="1">
+      <w:hyperlink w:anchor="_Toc242031040" w:history="1">
         <w:r>
           <w:rPr>
             <w:rStyle w:val="Hyperlink"/>
@@ -8348,7 +8348,7 @@
             <w:noProof/>
             <w:webHidden/>
           </w:rPr>
-          <w:instrText xml:space="preserve"> PAGEREF _Toc242028306 \h </w:instrText>
+          <w:instrText xml:space="preserve"> PAGEREF _Toc242031040 \h </w:instrText>
         </w:r>
         <w:r>
           <w:rPr>
@@ -8395,7 +8395,7 @@
           <w14:ligatures w14:val="standardContextual"/>
         </w:rPr>
       </w:pPr>
-      <w:hyperlink w:anchor="_Toc242028307" w:history="1">
+      <w:hyperlink w:anchor="_Toc242031041" w:history="1">
         <w:r>
           <w:rPr>
             <w:rStyle w:val="Hyperlink"/>
@@ -8422,7 +8422,7 @@
             <w:noProof/>
             <w:webHidden/>
           </w:rPr>
-          <w:instrText xml:space="preserve"> PAGEREF _Toc242028307 \h </w:instrText>
+          <w:instrText xml:space="preserve"> PAGEREF _Toc242031041 \h </w:instrText>
         </w:r>
         <w:r>
           <w:rPr>
@@ -8469,7 +8469,7 @@
           <w14:ligatures w14:val="standardContextual"/>
         </w:rPr>
       </w:pPr>
-      <w:hyperlink w:anchor="_Toc242028308" w:history="1">
+      <w:hyperlink w:anchor="_Toc242031042" w:history="1">
         <w:r>
           <w:rPr>
             <w:rStyle w:val="Hyperlink"/>
@@ -8496,7 +8496,7 @@
             <w:noProof/>
             <w:webHidden/>
           </w:rPr>
-          <w:instrText xml:space="preserve"> PAGEREF _Toc242028308 \h </w:instrText>
+          <w:instrText xml:space="preserve"> PAGEREF _Toc242031042 \h </w:instrText>
         </w:r>
         <w:r>
           <w:rPr>
@@ -8543,7 +8543,7 @@
           <w14:ligatures w14:val="standardContextual"/>
         </w:rPr>
       </w:pPr>
-      <w:hyperlink w:anchor="_Toc242028309" w:history="1">
+      <w:hyperlink w:anchor="_Toc242031043" w:history="1">
         <w:r>
           <w:rPr>
             <w:rStyle w:val="Hyperlink"/>
@@ -8570,7 +8570,7 @@
             <w:noProof/>
             <w:webHidden/>
           </w:rPr>
-          <w:instrText xml:space="preserve"> PAGEREF _Toc242028309 \h </w:instrText>
+          <w:instrText xml:space="preserve"> PAGEREF _Toc242031043 \h </w:instrText>
         </w:r>
         <w:r>
           <w:rPr>
@@ -8617,7 +8617,7 @@
           <w14:ligatures w14:val="standardContextual"/>
         </w:rPr>
       </w:pPr>
-      <w:hyperlink w:anchor="_Toc242028310" w:history="1">
+      <w:hyperlink w:anchor="_Toc242031044" w:history="1">
         <w:r>
           <w:rPr>
             <w:rStyle w:val="Hyperlink"/>
@@ -8644,7 +8644,7 @@
             <w:noProof/>
             <w:webHidden/>
           </w:rPr>
-          <w:instrText xml:space="preserve"> PAGEREF _Toc242028310 \h </w:instrText>
+          <w:instrText xml:space="preserve"> PAGEREF _Toc242031044 \h </w:instrText>
         </w:r>
         <w:r>
           <w:rPr>
@@ -8691,7 +8691,7 @@
           <w14:ligatures w14:val="standardContextual"/>
         </w:rPr>
       </w:pPr>
-      <w:hyperlink w:anchor="_Toc242028311" w:history="1">
+      <w:hyperlink w:anchor="_Toc242031045" w:history="1">
         <w:r>
           <w:rPr>
             <w:rStyle w:val="Hyperlink"/>
@@ -8718,7 +8718,7 @@
             <w:noProof/>
             <w:webHidden/>
           </w:rPr>
-          <w:instrText xml:space="preserve"> PAGEREF _Toc242028311 \h </w:instrText>
+          <w:instrText xml:space="preserve"> PAGEREF _Toc242031045 \h </w:instrText>
         </w:r>
         <w:r>
           <w:rPr>
@@ -8765,7 +8765,7 @@
           <w14:ligatures w14:val="standardContextual"/>
         </w:rPr>
       </w:pPr>
-      <w:hyperlink w:anchor="_Toc242028312" w:history="1">
+      <w:hyperlink w:anchor="_Toc242031046" w:history="1">
         <w:r>
           <w:rPr>
             <w:rStyle w:val="Hyperlink"/>
@@ -8792,7 +8792,7 @@
             <w:noProof/>
             <w:webHidden/>
           </w:rPr>
-          <w:instrText xml:space="preserve"> PAGEREF _Toc242028312 \h </w:instrText>
+          <w:instrText xml:space="preserve"> PAGEREF _Toc242031046 \h </w:instrText>
         </w:r>
         <w:r>
           <w:rPr>
@@ -8839,7 +8839,7 @@
           <w14:ligatures w14:val="standardContextual"/>
         </w:rPr>
       </w:pPr>
-      <w:hyperlink w:anchor="_Toc242028313" w:history="1">
+      <w:hyperlink w:anchor="_Toc242031047" w:history="1">
         <w:r>
           <w:rPr>
             <w:rStyle w:val="Hyperlink"/>
@@ -8866,7 +8866,7 @@
             <w:noProof/>
             <w:webHidden/>
           </w:rPr>
-          <w:instrText xml:space="preserve"> PAGEREF _Toc242028313 \h </w:instrText>
+          <w:instrText xml:space="preserve"> PAGEREF _Toc242031047 \h </w:instrText>
         </w:r>
         <w:r>
           <w:rPr>
@@ -8913,7 +8913,7 @@
           <w14:ligatures w14:val="standardContextual"/>
         </w:rPr>
       </w:pPr>
-      <w:hyperlink w:anchor="_Toc242028314" w:history="1">
+      <w:hyperlink w:anchor="_Toc242031048" w:history="1">
         <w:r>
           <w:rPr>
             <w:rStyle w:val="Hyperlink"/>
@@ -8940,7 +8940,7 @@
             <w:noProof/>
             <w:webHidden/>
           </w:rPr>
-          <w:instrText xml:space="preserve"> PAGEREF _Toc242028314 \h </w:instrText>
+          <w:instrText xml:space="preserve"> PAGEREF _Toc242031048 \h </w:instrText>
         </w:r>
         <w:r>
           <w:rPr>
@@ -8987,7 +8987,7 @@
           <w14:ligatures w14:val="standardContextual"/>
         </w:rPr>
       </w:pPr>
-      <w:hyperlink w:anchor="_Toc242028315" w:history="1">
+      <w:hyperlink w:anchor="_Toc242031049" w:history="1">
         <w:r>
           <w:rPr>
             <w:rStyle w:val="Hyperlink"/>
@@ -9014,7 +9014,7 @@
             <w:noProof/>
             <w:webHidden/>
           </w:rPr>
-          <w:instrText xml:space="preserve"> PAGEREF _Toc242028315 \h </w:instrText>
+          <w:instrText xml:space="preserve"> PAGEREF _Toc242031049 \h </w:instrText>
         </w:r>
         <w:r>
           <w:rPr>
@@ -9054,7 +9054,7 @@
       <w:pPr>
         <w:pStyle w:val="Heading1"/>
       </w:pPr>
-      <w:bookmarkStart w:id="3" w:name="_Toc242028214"/>
+      <w:bookmarkStart w:id="3" w:name="_Toc242030948"/>
       <w:r>
         <w:t>List of figures</w:t>
       </w:r>
@@ -9079,7 +9079,7 @@
       <w:r>
         <w:fldChar w:fldCharType="separate"/>
       </w:r>
-      <w:hyperlink w:anchor="_Toc242028067" w:history="1">
+      <w:hyperlink w:anchor="_Toc242030801" w:history="1">
         <w:r>
           <w:rPr>
             <w:rStyle w:val="Hyperlink"/>
@@ -9106,7 +9106,7 @@
             <w:noProof/>
             <w:webHidden/>
           </w:rPr>
-          <w:instrText xml:space="preserve"> PAGEREF _Toc242028067 \h </w:instrText>
+          <w:instrText xml:space="preserve"> PAGEREF _Toc242030801 \h </w:instrText>
         </w:r>
         <w:r>
           <w:rPr>
@@ -9147,7 +9147,7 @@
           <w:noProof/>
         </w:rPr>
       </w:pPr>
-      <w:hyperlink w:anchor="_Toc242028068" w:history="1">
+      <w:hyperlink w:anchor="_Toc242030802" w:history="1">
         <w:r>
           <w:rPr>
             <w:rStyle w:val="Hyperlink"/>
@@ -9174,7 +9174,7 @@
             <w:noProof/>
             <w:webHidden/>
           </w:rPr>
-          <w:instrText xml:space="preserve"> PAGEREF _Toc242028068 \h </w:instrText>
+          <w:instrText xml:space="preserve"> PAGEREF _Toc242030802 \h </w:instrText>
         </w:r>
         <w:r>
           <w:rPr>
@@ -9215,7 +9215,7 @@
           <w:noProof/>
         </w:rPr>
       </w:pPr>
-      <w:hyperlink w:anchor="_Toc242028069" w:history="1">
+      <w:hyperlink w:anchor="_Toc242030803" w:history="1">
         <w:r>
           <w:rPr>
             <w:rStyle w:val="Hyperlink"/>
@@ -9242,7 +9242,7 @@
             <w:noProof/>
             <w:webHidden/>
           </w:rPr>
-          <w:instrText xml:space="preserve"> PAGEREF _Toc242028069 \h </w:instrText>
+          <w:instrText xml:space="preserve"> PAGEREF _Toc242030803 \h </w:instrText>
         </w:r>
         <w:r>
           <w:rPr>
@@ -9283,7 +9283,7 @@
           <w:noProof/>
         </w:rPr>
       </w:pPr>
-      <w:hyperlink w:anchor="_Toc242028070" w:history="1">
+      <w:hyperlink w:anchor="_Toc242030804" w:history="1">
         <w:r>
           <w:rPr>
             <w:rStyle w:val="Hyperlink"/>
@@ -9310,7 +9310,7 @@
             <w:noProof/>
             <w:webHidden/>
           </w:rPr>
-          <w:instrText xml:space="preserve"> PAGEREF _Toc242028070 \h </w:instrText>
+          <w:instrText xml:space="preserve"> PAGEREF _Toc242030804 \h </w:instrText>
         </w:r>
         <w:r>
           <w:rPr>
@@ -9351,7 +9351,7 @@
           <w:noProof/>
         </w:rPr>
       </w:pPr>
-      <w:hyperlink w:anchor="_Toc242028071" w:history="1">
+      <w:hyperlink w:anchor="_Toc242030805" w:history="1">
         <w:r>
           <w:rPr>
             <w:rStyle w:val="Hyperlink"/>
@@ -9378,7 +9378,7 @@
             <w:noProof/>
             <w:webHidden/>
           </w:rPr>
-          <w:instrText xml:space="preserve"> PAGEREF _Toc242028071 \h </w:instrText>
+          <w:instrText xml:space="preserve"> PAGEREF _Toc242030805 \h </w:instrText>
         </w:r>
         <w:r>
           <w:rPr>
@@ -9419,7 +9419,7 @@
           <w:noProof/>
         </w:rPr>
       </w:pPr>
-      <w:hyperlink w:anchor="_Toc242028072" w:history="1">
+      <w:hyperlink w:anchor="_Toc242030806" w:history="1">
         <w:r>
           <w:rPr>
             <w:rStyle w:val="Hyperlink"/>
@@ -9446,7 +9446,7 @@
             <w:noProof/>
             <w:webHidden/>
           </w:rPr>
-          <w:instrText xml:space="preserve"> PAGEREF _Toc242028072 \h </w:instrText>
+          <w:instrText xml:space="preserve"> PAGEREF _Toc242030806 \h </w:instrText>
         </w:r>
         <w:r>
           <w:rPr>
@@ -9487,7 +9487,7 @@
           <w:noProof/>
         </w:rPr>
       </w:pPr>
-      <w:hyperlink w:anchor="_Toc242028073" w:history="1">
+      <w:hyperlink w:anchor="_Toc242030807" w:history="1">
         <w:r>
           <w:rPr>
             <w:rStyle w:val="Hyperlink"/>
@@ -9514,7 +9514,7 @@
             <w:noProof/>
             <w:webHidden/>
           </w:rPr>
-          <w:instrText xml:space="preserve"> PAGEREF _Toc242028073 \h </w:instrText>
+          <w:instrText xml:space="preserve"> PAGEREF _Toc242030807 \h </w:instrText>
         </w:r>
         <w:r>
           <w:rPr>
@@ -9555,7 +9555,7 @@
           <w:noProof/>
         </w:rPr>
       </w:pPr>
-      <w:hyperlink w:anchor="_Toc242028074" w:history="1">
+      <w:hyperlink w:anchor="_Toc242030808" w:history="1">
         <w:r>
           <w:rPr>
             <w:rStyle w:val="Hyperlink"/>
@@ -9582,7 +9582,7 @@
             <w:noProof/>
             <w:webHidden/>
           </w:rPr>
-          <w:instrText xml:space="preserve"> PAGEREF _Toc242028074 \h </w:instrText>
+          <w:instrText xml:space="preserve"> PAGEREF _Toc242030808 \h </w:instrText>
         </w:r>
         <w:r>
           <w:rPr>
@@ -9623,7 +9623,7 @@
           <w:noProof/>
         </w:rPr>
       </w:pPr>
-      <w:hyperlink w:anchor="_Toc242028075" w:history="1">
+      <w:hyperlink w:anchor="_Toc242030809" w:history="1">
         <w:r>
           <w:rPr>
             <w:rStyle w:val="Hyperlink"/>
@@ -9650,7 +9650,7 @@
             <w:noProof/>
             <w:webHidden/>
           </w:rPr>
-          <w:instrText xml:space="preserve"> PAGEREF _Toc242028075 \h </w:instrText>
+          <w:instrText xml:space="preserve"> PAGEREF _Toc242030809 \h </w:instrText>
         </w:r>
         <w:r>
           <w:rPr>
@@ -9691,7 +9691,7 @@
           <w:noProof/>
         </w:rPr>
       </w:pPr>
-      <w:hyperlink w:anchor="_Toc242028076" w:history="1">
+      <w:hyperlink w:anchor="_Toc242030810" w:history="1">
         <w:r>
           <w:rPr>
             <w:rStyle w:val="Hyperlink"/>
@@ -9718,7 +9718,7 @@
             <w:noProof/>
             <w:webHidden/>
           </w:rPr>
-          <w:instrText xml:space="preserve"> PAGEREF _Toc242028076 \h </w:instrText>
+          <w:instrText xml:space="preserve"> PAGEREF _Toc242030810 \h </w:instrText>
         </w:r>
         <w:r>
           <w:rPr>
@@ -9759,7 +9759,7 @@
           <w:noProof/>
         </w:rPr>
       </w:pPr>
-      <w:hyperlink w:anchor="_Toc242028077" w:history="1">
+      <w:hyperlink w:anchor="_Toc242030811" w:history="1">
         <w:r>
           <w:rPr>
             <w:rStyle w:val="Hyperlink"/>
@@ -9786,7 +9786,7 @@
             <w:noProof/>
             <w:webHidden/>
           </w:rPr>
-          <w:instrText xml:space="preserve"> PAGEREF _Toc242028077 \h </w:instrText>
+          <w:instrText xml:space="preserve"> PAGEREF _Toc242030811 \h </w:instrText>
         </w:r>
         <w:r>
           <w:rPr>
@@ -9827,7 +9827,7 @@
           <w:noProof/>
         </w:rPr>
       </w:pPr>
-      <w:hyperlink w:anchor="_Toc242028078" w:history="1">
+      <w:hyperlink w:anchor="_Toc242030812" w:history="1">
         <w:r>
           <w:rPr>
             <w:rStyle w:val="Hyperlink"/>
@@ -9854,7 +9854,7 @@
             <w:noProof/>
             <w:webHidden/>
           </w:rPr>
-          <w:instrText xml:space="preserve"> PAGEREF _Toc242028078 \h </w:instrText>
+          <w:instrText xml:space="preserve"> PAGEREF _Toc242030812 \h </w:instrText>
         </w:r>
         <w:r>
           <w:rPr>
@@ -9894,7 +9894,7 @@
       <w:pPr>
         <w:pStyle w:val="Heading1"/>
       </w:pPr>
-      <w:bookmarkStart w:id="4" w:name="_Toc242028215"/>
+      <w:bookmarkStart w:id="4" w:name="_Toc242030949"/>
       <w:r>
         <w:t>List of tables</w:t>
       </w:r>
@@ -9925,7 +9925,7 @@
       <w:r>
         <w:fldChar w:fldCharType="separate"/>
       </w:r>
-      <w:hyperlink w:anchor="_Toc242028079" w:history="1">
+      <w:hyperlink w:anchor="_Toc242030813" w:history="1">
         <w:r>
           <w:rPr>
             <w:rStyle w:val="Hyperlink"/>
@@ -9952,7 +9952,7 @@
             <w:noProof/>
             <w:webHidden/>
           </w:rPr>
-          <w:instrText xml:space="preserve"> PAGEREF _Toc242028079 \h </w:instrText>
+          <w:instrText xml:space="preserve"> PAGEREF _Toc242030813 \h </w:instrText>
         </w:r>
         <w:r>
           <w:rPr>
@@ -9999,7 +9999,7 @@
           <w14:ligatures w14:val="standardContextual"/>
         </w:rPr>
       </w:pPr>
-      <w:hyperlink w:anchor="_Toc242028080" w:history="1">
+      <w:hyperlink w:anchor="_Toc242030814" w:history="1">
         <w:r>
           <w:rPr>
             <w:rStyle w:val="Hyperlink"/>
@@ -10026,7 +10026,7 @@
             <w:noProof/>
             <w:webHidden/>
           </w:rPr>
-          <w:instrText xml:space="preserve"> PAGEREF _Toc242028080 \h </w:instrText>
+          <w:instrText xml:space="preserve"> PAGEREF _Toc242030814 \h </w:instrText>
         </w:r>
         <w:r>
           <w:rPr>
@@ -10073,7 +10073,7 @@
           <w14:ligatures w14:val="standardContextual"/>
         </w:rPr>
       </w:pPr>
-      <w:hyperlink w:anchor="_Toc242028081" w:history="1">
+      <w:hyperlink w:anchor="_Toc242030815" w:history="1">
         <w:r>
           <w:rPr>
             <w:rStyle w:val="Hyperlink"/>
@@ -10100,7 +10100,7 @@
             <w:noProof/>
             <w:webHidden/>
           </w:rPr>
-          <w:instrText xml:space="preserve"> PAGEREF _Toc242028081 \h </w:instrText>
+          <w:instrText xml:space="preserve"> PAGEREF _Toc242030815 \h </w:instrText>
         </w:r>
         <w:r>
           <w:rPr>
@@ -10147,7 +10147,7 @@
           <w14:ligatures w14:val="standardContextual"/>
         </w:rPr>
       </w:pPr>
-      <w:hyperlink w:anchor="_Toc242028082" w:history="1">
+      <w:hyperlink w:anchor="_Toc242030816" w:history="1">
         <w:r>
           <w:rPr>
             <w:rStyle w:val="Hyperlink"/>
@@ -10174,7 +10174,7 @@
             <w:noProof/>
             <w:webHidden/>
           </w:rPr>
-          <w:instrText xml:space="preserve"> PAGEREF _Toc242028082 \h </w:instrText>
+          <w:instrText xml:space="preserve"> PAGEREF _Toc242030816 \h </w:instrText>
         </w:r>
         <w:r>
           <w:rPr>
@@ -10221,7 +10221,7 @@
           <w14:ligatures w14:val="standardContextual"/>
         </w:rPr>
       </w:pPr>
-      <w:hyperlink w:anchor="_Toc242028083" w:history="1">
+      <w:hyperlink w:anchor="_Toc242030817" w:history="1">
         <w:r>
           <w:rPr>
             <w:rStyle w:val="Hyperlink"/>
@@ -10248,7 +10248,7 @@
             <w:noProof/>
             <w:webHidden/>
           </w:rPr>
-          <w:instrText xml:space="preserve"> PAGEREF _Toc242028083 \h </w:instrText>
+          <w:instrText xml:space="preserve"> PAGEREF _Toc242030817 \h </w:instrText>
         </w:r>
         <w:r>
           <w:rPr>
@@ -10295,7 +10295,7 @@
           <w14:ligatures w14:val="standardContextual"/>
         </w:rPr>
       </w:pPr>
-      <w:hyperlink w:anchor="_Toc242028084" w:history="1">
+      <w:hyperlink w:anchor="_Toc242030818" w:history="1">
         <w:r>
           <w:rPr>
             <w:rStyle w:val="Hyperlink"/>
@@ -10322,7 +10322,7 @@
             <w:noProof/>
             <w:webHidden/>
           </w:rPr>
-          <w:instrText xml:space="preserve"> PAGEREF _Toc242028084 \h </w:instrText>
+          <w:instrText xml:space="preserve"> PAGEREF _Toc242030818 \h </w:instrText>
         </w:r>
         <w:r>
           <w:rPr>
@@ -10369,7 +10369,7 @@
           <w14:ligatures w14:val="standardContextual"/>
         </w:rPr>
       </w:pPr>
-      <w:hyperlink w:anchor="_Toc242028085" w:history="1">
+      <w:hyperlink w:anchor="_Toc242030819" w:history="1">
         <w:r>
           <w:rPr>
             <w:rStyle w:val="Hyperlink"/>
@@ -10396,7 +10396,7 @@
             <w:noProof/>
             <w:webHidden/>
           </w:rPr>
-          <w:instrText xml:space="preserve"> PAGEREF _Toc242028085 \h </w:instrText>
+          <w:instrText xml:space="preserve"> PAGEREF _Toc242030819 \h </w:instrText>
         </w:r>
         <w:r>
           <w:rPr>
@@ -10443,7 +10443,7 @@
           <w14:ligatures w14:val="standardContextual"/>
         </w:rPr>
       </w:pPr>
-      <w:hyperlink w:anchor="_Toc242028086" w:history="1">
+      <w:hyperlink w:anchor="_Toc242030820" w:history="1">
         <w:r>
           <w:rPr>
             <w:rStyle w:val="Hyperlink"/>
@@ -10470,7 +10470,7 @@
             <w:noProof/>
             <w:webHidden/>
           </w:rPr>
-          <w:instrText xml:space="preserve"> PAGEREF _Toc242028086 \h </w:instrText>
+          <w:instrText xml:space="preserve"> PAGEREF _Toc242030820 \h </w:instrText>
         </w:r>
         <w:r>
           <w:rPr>
@@ -10517,7 +10517,7 @@
           <w14:ligatures w14:val="standardContextual"/>
         </w:rPr>
       </w:pPr>
-      <w:hyperlink w:anchor="_Toc242028087" w:history="1">
+      <w:hyperlink w:anchor="_Toc242030821" w:history="1">
         <w:r>
           <w:rPr>
             <w:rStyle w:val="Hyperlink"/>
@@ -10544,7 +10544,7 @@
             <w:noProof/>
             <w:webHidden/>
           </w:rPr>
-          <w:instrText xml:space="preserve"> PAGEREF _Toc242028087 \h </w:instrText>
+          <w:instrText xml:space="preserve"> PAGEREF _Toc242030821 \h </w:instrText>
         </w:r>
         <w:r>
           <w:rPr>
@@ -10591,7 +10591,7 @@
           <w14:ligatures w14:val="standardContextual"/>
         </w:rPr>
       </w:pPr>
-      <w:hyperlink w:anchor="_Toc242028088" w:history="1">
+      <w:hyperlink w:anchor="_Toc242030822" w:history="1">
         <w:r>
           <w:rPr>
             <w:rStyle w:val="Hyperlink"/>
@@ -10618,7 +10618,7 @@
             <w:noProof/>
             <w:webHidden/>
           </w:rPr>
-          <w:instrText xml:space="preserve"> PAGEREF _Toc242028088 \h </w:instrText>
+          <w:instrText xml:space="preserve"> PAGEREF _Toc242030822 \h </w:instrText>
         </w:r>
         <w:r>
           <w:rPr>
@@ -10665,7 +10665,7 @@
           <w14:ligatures w14:val="standardContextual"/>
         </w:rPr>
       </w:pPr>
-      <w:hyperlink w:anchor="_Toc242028089" w:history="1">
+      <w:hyperlink w:anchor="_Toc242030823" w:history="1">
         <w:r>
           <w:rPr>
             <w:rStyle w:val="Hyperlink"/>
@@ -10692,7 +10692,7 @@
             <w:noProof/>
             <w:webHidden/>
           </w:rPr>
-          <w:instrText xml:space="preserve"> PAGEREF _Toc242028089 \h </w:instrText>
+          <w:instrText xml:space="preserve"> PAGEREF _Toc242030823 \h </w:instrText>
         </w:r>
         <w:r>
           <w:rPr>
@@ -10739,7 +10739,7 @@
           <w14:ligatures w14:val="standardContextual"/>
         </w:rPr>
       </w:pPr>
-      <w:hyperlink w:anchor="_Toc242028090" w:history="1">
+      <w:hyperlink w:anchor="_Toc242030824" w:history="1">
         <w:r>
           <w:rPr>
             <w:rStyle w:val="Hyperlink"/>
@@ -10766,7 +10766,7 @@
             <w:noProof/>
             <w:webHidden/>
           </w:rPr>
-          <w:instrText xml:space="preserve"> PAGEREF _Toc242028090 \h </w:instrText>
+          <w:instrText xml:space="preserve"> PAGEREF _Toc242030824 \h </w:instrText>
         </w:r>
         <w:r>
           <w:rPr>
@@ -10813,7 +10813,7 @@
           <w14:ligatures w14:val="standardContextual"/>
         </w:rPr>
       </w:pPr>
-      <w:hyperlink w:anchor="_Toc242028091" w:history="1">
+      <w:hyperlink w:anchor="_Toc242030825" w:history="1">
         <w:r>
           <w:rPr>
             <w:rStyle w:val="Hyperlink"/>
@@ -10840,7 +10840,7 @@
             <w:noProof/>
             <w:webHidden/>
           </w:rPr>
-          <w:instrText xml:space="preserve"> PAGEREF _Toc242028091 \h </w:instrText>
+          <w:instrText xml:space="preserve"> PAGEREF _Toc242030825 \h </w:instrText>
         </w:r>
         <w:r>
           <w:rPr>
@@ -10887,7 +10887,7 @@
           <w14:ligatures w14:val="standardContextual"/>
         </w:rPr>
       </w:pPr>
-      <w:hyperlink w:anchor="_Toc242028092" w:history="1">
+      <w:hyperlink w:anchor="_Toc242030826" w:history="1">
         <w:r>
           <w:rPr>
             <w:rStyle w:val="Hyperlink"/>
@@ -10914,7 +10914,7 @@
             <w:noProof/>
             <w:webHidden/>
           </w:rPr>
-          <w:instrText xml:space="preserve"> PAGEREF _Toc242028092 \h </w:instrText>
+          <w:instrText xml:space="preserve"> PAGEREF _Toc242030826 \h </w:instrText>
         </w:r>
         <w:r>
           <w:rPr>
@@ -10961,7 +10961,7 @@
           <w14:ligatures w14:val="standardContextual"/>
         </w:rPr>
       </w:pPr>
-      <w:hyperlink w:anchor="_Toc242028093" w:history="1">
+      <w:hyperlink w:anchor="_Toc242030827" w:history="1">
         <w:r>
           <w:rPr>
             <w:rStyle w:val="Hyperlink"/>
@@ -10988,7 +10988,7 @@
             <w:noProof/>
             <w:webHidden/>
           </w:rPr>
-          <w:instrText xml:space="preserve"> PAGEREF _Toc242028093 \h </w:instrText>
+          <w:instrText xml:space="preserve"> PAGEREF _Toc242030827 \h </w:instrText>
         </w:r>
         <w:r>
           <w:rPr>
@@ -11035,7 +11035,7 @@
           <w14:ligatures w14:val="standardContextual"/>
         </w:rPr>
       </w:pPr>
-      <w:hyperlink w:anchor="_Toc242028094" w:history="1">
+      <w:hyperlink w:anchor="_Toc242030828" w:history="1">
         <w:r>
           <w:rPr>
             <w:rStyle w:val="Hyperlink"/>
@@ -11062,7 +11062,7 @@
             <w:noProof/>
             <w:webHidden/>
           </w:rPr>
-          <w:instrText xml:space="preserve"> PAGEREF _Toc242028094 \h </w:instrText>
+          <w:instrText xml:space="preserve"> PAGEREF _Toc242030828 \h </w:instrText>
         </w:r>
         <w:r>
           <w:rPr>
@@ -11109,7 +11109,7 @@
           <w14:ligatures w14:val="standardContextual"/>
         </w:rPr>
       </w:pPr>
-      <w:hyperlink w:anchor="_Toc242028095" w:history="1">
+      <w:hyperlink w:anchor="_Toc242030829" w:history="1">
         <w:r>
           <w:rPr>
             <w:rStyle w:val="Hyperlink"/>
@@ -11136,7 +11136,7 @@
             <w:noProof/>
             <w:webHidden/>
           </w:rPr>
-          <w:instrText xml:space="preserve"> PAGEREF _Toc242028095 \h </w:instrText>
+          <w:instrText xml:space="preserve"> PAGEREF _Toc242030829 \h </w:instrText>
         </w:r>
         <w:r>
           <w:rPr>
@@ -11183,7 +11183,7 @@
           <w14:ligatures w14:val="standardContextual"/>
         </w:rPr>
       </w:pPr>
-      <w:hyperlink w:anchor="_Toc242028096" w:history="1">
+      <w:hyperlink w:anchor="_Toc242030830" w:history="1">
         <w:r>
           <w:rPr>
             <w:rStyle w:val="Hyperlink"/>
@@ -11210,7 +11210,7 @@
             <w:noProof/>
             <w:webHidden/>
           </w:rPr>
-          <w:instrText xml:space="preserve"> PAGEREF _Toc242028096 \h </w:instrText>
+          <w:instrText xml:space="preserve"> PAGEREF _Toc242030830 \h </w:instrText>
         </w:r>
         <w:r>
           <w:rPr>
@@ -11257,7 +11257,7 @@
           <w14:ligatures w14:val="standardContextual"/>
         </w:rPr>
       </w:pPr>
-      <w:hyperlink w:anchor="_Toc242028097" w:history="1">
+      <w:hyperlink w:anchor="_Toc242030831" w:history="1">
         <w:r>
           <w:rPr>
             <w:rStyle w:val="Hyperlink"/>
@@ -11284,7 +11284,7 @@
             <w:noProof/>
             <w:webHidden/>
           </w:rPr>
-          <w:instrText xml:space="preserve"> PAGEREF _Toc242028097 \h </w:instrText>
+          <w:instrText xml:space="preserve"> PAGEREF _Toc242030831 \h </w:instrText>
         </w:r>
         <w:r>
           <w:rPr>
@@ -11331,7 +11331,7 @@
           <w14:ligatures w14:val="standardContextual"/>
         </w:rPr>
       </w:pPr>
-      <w:hyperlink w:anchor="_Toc242028098" w:history="1">
+      <w:hyperlink w:anchor="_Toc242030832" w:history="1">
         <w:r>
           <w:rPr>
             <w:rStyle w:val="Hyperlink"/>
@@ -11358,7 +11358,7 @@
             <w:noProof/>
             <w:webHidden/>
           </w:rPr>
-          <w:instrText xml:space="preserve"> PAGEREF _Toc242028098 \h </w:instrText>
+          <w:instrText xml:space="preserve"> PAGEREF _Toc242030832 \h </w:instrText>
         </w:r>
         <w:r>
           <w:rPr>
@@ -11405,7 +11405,7 @@
           <w14:ligatures w14:val="standardContextual"/>
         </w:rPr>
       </w:pPr>
-      <w:hyperlink w:anchor="_Toc242028099" w:history="1">
+      <w:hyperlink w:anchor="_Toc242030833" w:history="1">
         <w:r>
           <w:rPr>
             <w:rStyle w:val="Hyperlink"/>
@@ -11432,7 +11432,7 @@
             <w:noProof/>
             <w:webHidden/>
           </w:rPr>
-          <w:instrText xml:space="preserve"> PAGEREF _Toc242028099 \h </w:instrText>
+          <w:instrText xml:space="preserve"> PAGEREF _Toc242030833 \h </w:instrText>
         </w:r>
         <w:r>
           <w:rPr>
@@ -11479,7 +11479,7 @@
           <w14:ligatures w14:val="standardContextual"/>
         </w:rPr>
       </w:pPr>
-      <w:hyperlink w:anchor="_Toc242028100" w:history="1">
+      <w:hyperlink w:anchor="_Toc242030834" w:history="1">
         <w:r>
           <w:rPr>
             <w:rStyle w:val="Hyperlink"/>
@@ -11506,7 +11506,7 @@
             <w:noProof/>
             <w:webHidden/>
           </w:rPr>
-          <w:instrText xml:space="preserve"> PAGEREF _Toc242028100 \h </w:instrText>
+          <w:instrText xml:space="preserve"> PAGEREF _Toc242030834 \h </w:instrText>
         </w:r>
         <w:r>
           <w:rPr>
@@ -11553,7 +11553,7 @@
           <w14:ligatures w14:val="standardContextual"/>
         </w:rPr>
       </w:pPr>
-      <w:hyperlink w:anchor="_Toc242028101" w:history="1">
+      <w:hyperlink w:anchor="_Toc242030835" w:history="1">
         <w:r>
           <w:rPr>
             <w:rStyle w:val="Hyperlink"/>
@@ -11580,7 +11580,7 @@
             <w:noProof/>
             <w:webHidden/>
           </w:rPr>
-          <w:instrText xml:space="preserve"> PAGEREF _Toc242028101 \h </w:instrText>
+          <w:instrText xml:space="preserve"> PAGEREF _Toc242030835 \h </w:instrText>
         </w:r>
         <w:r>
           <w:rPr>
@@ -11627,7 +11627,7 @@
           <w14:ligatures w14:val="standardContextual"/>
         </w:rPr>
       </w:pPr>
-      <w:hyperlink w:anchor="_Toc242028102" w:history="1">
+      <w:hyperlink w:anchor="_Toc242030836" w:history="1">
         <w:r>
           <w:rPr>
             <w:rStyle w:val="Hyperlink"/>
@@ -11654,7 +11654,7 @@
             <w:noProof/>
             <w:webHidden/>
           </w:rPr>
-          <w:instrText xml:space="preserve"> PAGEREF _Toc242028102 \h </w:instrText>
+          <w:instrText xml:space="preserve"> PAGEREF _Toc242030836 \h </w:instrText>
         </w:r>
         <w:r>
           <w:rPr>
@@ -11701,7 +11701,7 @@
           <w14:ligatures w14:val="standardContextual"/>
         </w:rPr>
       </w:pPr>
-      <w:hyperlink w:anchor="_Toc242028103" w:history="1">
+      <w:hyperlink w:anchor="_Toc242030837" w:history="1">
         <w:r>
           <w:rPr>
             <w:rStyle w:val="Hyperlink"/>
@@ -11728,7 +11728,7 @@
             <w:noProof/>
             <w:webHidden/>
           </w:rPr>
-          <w:instrText xml:space="preserve"> PAGEREF _Toc242028103 \h </w:instrText>
+          <w:instrText xml:space="preserve"> PAGEREF _Toc242030837 \h </w:instrText>
         </w:r>
         <w:r>
           <w:rPr>
@@ -11775,7 +11775,7 @@
           <w14:ligatures w14:val="standardContextual"/>
         </w:rPr>
       </w:pPr>
-      <w:hyperlink w:anchor="_Toc242028104" w:history="1">
+      <w:hyperlink w:anchor="_Toc242030838" w:history="1">
         <w:r>
           <w:rPr>
             <w:rStyle w:val="Hyperlink"/>
@@ -11802,7 +11802,7 @@
             <w:noProof/>
             <w:webHidden/>
           </w:rPr>
-          <w:instrText xml:space="preserve"> PAGEREF _Toc242028104 \h </w:instrText>
+          <w:instrText xml:space="preserve"> PAGEREF _Toc242030838 \h </w:instrText>
         </w:r>
         <w:r>
           <w:rPr>
@@ -11849,7 +11849,7 @@
           <w14:ligatures w14:val="standardContextual"/>
         </w:rPr>
       </w:pPr>
-      <w:hyperlink w:anchor="_Toc242028105" w:history="1">
+      <w:hyperlink w:anchor="_Toc242030839" w:history="1">
         <w:r>
           <w:rPr>
             <w:rStyle w:val="Hyperlink"/>
@@ -11876,7 +11876,7 @@
             <w:noProof/>
             <w:webHidden/>
           </w:rPr>
-          <w:instrText xml:space="preserve"> PAGEREF _Toc242028105 \h </w:instrText>
+          <w:instrText xml:space="preserve"> PAGEREF _Toc242030839 \h </w:instrText>
         </w:r>
         <w:r>
           <w:rPr>
@@ -11933,7 +11933,7 @@
       <w:pPr>
         <w:pStyle w:val="Heading1"/>
       </w:pPr>
-      <w:bookmarkStart w:id="5" w:name="_Toc242028216"/>
+      <w:bookmarkStart w:id="5" w:name="_Toc242030950"/>
       <w:r>
         <w:lastRenderedPageBreak/>
         <w:t>Chapter 1: Introduction</w:t>
@@ -11949,7 +11949,7 @@
       <w:pPr>
         <w:pStyle w:val="Heading2"/>
       </w:pPr>
-      <w:bookmarkStart w:id="6" w:name="_Toc242028217"/>
+      <w:bookmarkStart w:id="6" w:name="_Toc242030951"/>
       <w:r>
         <w:t>1.1 Background</w:t>
       </w:r>
@@ -11964,7 +11964,7 @@
       <w:pPr>
         <w:pStyle w:val="Heading2"/>
       </w:pPr>
-      <w:bookmarkStart w:id="7" w:name="_Toc242028218"/>
+      <w:bookmarkStart w:id="7" w:name="_Toc242030952"/>
       <w:r>
         <w:t>1.2 Problem statement</w:t>
       </w:r>
@@ -11979,7 +11979,7 @@
       <w:pPr>
         <w:pStyle w:val="Heading2"/>
       </w:pPr>
-      <w:bookmarkStart w:id="8" w:name="_Toc242028219"/>
+      <w:bookmarkStart w:id="8" w:name="_Toc242030953"/>
       <w:r>
         <w:t>1.3 Motivation</w:t>
       </w:r>
@@ -11999,7 +11999,7 @@
       <w:pPr>
         <w:pStyle w:val="Heading2"/>
       </w:pPr>
-      <w:bookmarkStart w:id="9" w:name="_Toc242028220"/>
+      <w:bookmarkStart w:id="9" w:name="_Toc242030954"/>
       <w:r>
         <w:t>1.4 Domain requirements</w:t>
       </w:r>
@@ -12230,7 +12230,7 @@
       <w:pPr>
         <w:pStyle w:val="Heading2"/>
       </w:pPr>
-      <w:bookmarkStart w:id="10" w:name="_Toc242028221"/>
+      <w:bookmarkStart w:id="10" w:name="_Toc242030955"/>
       <w:r>
         <w:lastRenderedPageBreak/>
         <w:t>1.5 Project objectives</w:t>
@@ -12323,7 +12323,7 @@
       <w:pPr>
         <w:pStyle w:val="Heading2"/>
       </w:pPr>
-      <w:bookmarkStart w:id="11" w:name="_Toc242028222"/>
+      <w:bookmarkStart w:id="11" w:name="_Toc242030956"/>
       <w:r>
         <w:t>1.6 Scope</w:t>
       </w:r>
@@ -12338,7 +12338,7 @@
       <w:pPr>
         <w:pStyle w:val="Heading2"/>
       </w:pPr>
-      <w:bookmarkStart w:id="12" w:name="_Toc242028223"/>
+      <w:bookmarkStart w:id="12" w:name="_Toc242030957"/>
       <w:r>
         <w:t>1.7 Proposed solution</w:t>
       </w:r>
@@ -12356,7 +12356,7 @@
       <w:pPr>
         <w:pStyle w:val="Heading2"/>
       </w:pPr>
-      <w:bookmarkStart w:id="13" w:name="_Toc242028224"/>
+      <w:bookmarkStart w:id="13" w:name="_Toc242030958"/>
       <w:r>
         <w:t>1.8 Report organization</w:t>
       </w:r>
@@ -12371,7 +12371,7 @@
       <w:pPr>
         <w:pStyle w:val="Heading1"/>
       </w:pPr>
-      <w:bookmarkStart w:id="14" w:name="_Toc242028225"/>
+      <w:bookmarkStart w:id="14" w:name="_Toc242030959"/>
       <w:r>
         <w:t>Chapter 2: Domain analysis and knowledge acquisition</w:t>
       </w:r>
@@ -12386,7 +12386,7 @@
       <w:pPr>
         <w:pStyle w:val="Heading2"/>
       </w:pPr>
-      <w:bookmarkStart w:id="15" w:name="_Toc242028226"/>
+      <w:bookmarkStart w:id="15" w:name="_Toc242030960"/>
       <w:r>
         <w:t>2.1 Smart parking domain</w:t>
       </w:r>
@@ -12404,7 +12404,7 @@
       <w:pPr>
         <w:pStyle w:val="Heading2"/>
       </w:pPr>
-      <w:bookmarkStart w:id="16" w:name="_Toc242028227"/>
+      <w:bookmarkStart w:id="16" w:name="_Toc242030961"/>
       <w:r>
         <w:lastRenderedPageBreak/>
         <w:t>2.2 Domain entities</w:t>
@@ -12418,7 +12418,7 @@
         <w:spacing w:before="80"/>
         <w:jc w:val="center"/>
       </w:pPr>
-      <w:bookmarkStart w:id="17" w:name="_Toc242028079"/>
+      <w:bookmarkStart w:id="17" w:name="_Toc242030813"/>
       <w:r>
         <w:t xml:space="preserve">Table </w:t>
       </w:r>
@@ -13165,7 +13165,7 @@
       <w:pPr>
         <w:pStyle w:val="Heading2"/>
       </w:pPr>
-      <w:bookmarkStart w:id="18" w:name="_Toc242028228"/>
+      <w:bookmarkStart w:id="18" w:name="_Toc242030962"/>
       <w:r>
         <w:t>2.3 Domain relationships</w:t>
       </w:r>
@@ -13183,7 +13183,7 @@
       <w:pPr>
         <w:pStyle w:val="Heading2"/>
       </w:pPr>
-      <w:bookmarkStart w:id="19" w:name="_Toc242028229"/>
+      <w:bookmarkStart w:id="19" w:name="_Toc242030963"/>
       <w:r>
         <w:t>2.4 Knowledge acquisition</w:t>
       </w:r>
@@ -13208,7 +13208,7 @@
       <w:pPr>
         <w:pStyle w:val="Heading2"/>
       </w:pPr>
-      <w:bookmarkStart w:id="20" w:name="_Toc242028230"/>
+      <w:bookmarkStart w:id="20" w:name="_Toc242030964"/>
       <w:r>
         <w:t>2.5 Domain constraints</w:t>
       </w:r>
@@ -13223,7 +13223,7 @@
       <w:pPr>
         <w:pStyle w:val="Heading2"/>
       </w:pPr>
-      <w:bookmarkStart w:id="21" w:name="_Toc242028231"/>
+      <w:bookmarkStart w:id="21" w:name="_Toc242030965"/>
       <w:r>
         <w:t>2.6 Limitations of traditional database systems</w:t>
       </w:r>
@@ -13279,7 +13279,7 @@
       <w:pPr>
         <w:pStyle w:val="Heading1"/>
       </w:pPr>
-      <w:bookmarkStart w:id="22" w:name="_Toc242028232"/>
+      <w:bookmarkStart w:id="22" w:name="_Toc242030966"/>
       <w:r>
         <w:t>Chapter 3: Knowledge representation architecture</w:t>
       </w:r>
@@ -13294,7 +13294,7 @@
       <w:pPr>
         <w:pStyle w:val="Heading2"/>
       </w:pPr>
-      <w:bookmarkStart w:id="23" w:name="_Toc242028233"/>
+      <w:bookmarkStart w:id="23" w:name="_Toc242030967"/>
       <w:r>
         <w:t>3.1 Overall knowledge model</w:t>
       </w:r>
@@ -13311,7 +13311,7 @@
           <w:noProof/>
         </w:rPr>
         <w:drawing>
-          <wp:inline distT="0" distB="0" distL="0" distR="0" wp14:anchorId="399871F2" wp14:editId="28581ED7">
+          <wp:inline distT="0" distB="0" distL="0" distR="0" wp14:anchorId="0E4937BF" wp14:editId="29EC4A44">
             <wp:extent cx="5705867" cy="2916942"/>
             <wp:effectExtent l="0" t="0" r="0" b="0"/>
             <wp:docPr id="1" name="Picture 1"/>
@@ -13353,7 +13353,7 @@
         <w:spacing w:before="80" w:after="160"/>
         <w:jc w:val="center"/>
       </w:pPr>
-      <w:bookmarkStart w:id="24" w:name="_Toc242028067"/>
+      <w:bookmarkStart w:id="24" w:name="_Toc242030801"/>
       <w:r>
         <w:t xml:space="preserve">Figure </w:t>
       </w:r>
@@ -13389,7 +13389,7 @@
       <w:pPr>
         <w:pStyle w:val="Heading2"/>
       </w:pPr>
-      <w:bookmarkStart w:id="25" w:name="_Toc242028234"/>
+      <w:bookmarkStart w:id="25" w:name="_Toc242030968"/>
       <w:r>
         <w:t>3.2 Concept hierarchy</w:t>
       </w:r>
@@ -13407,7 +13407,7 @@
       <w:pPr>
         <w:pStyle w:val="Heading2"/>
       </w:pPr>
-      <w:bookmarkStart w:id="26" w:name="_Toc242028235"/>
+      <w:bookmarkStart w:id="26" w:name="_Toc242030969"/>
       <w:r>
         <w:lastRenderedPageBreak/>
         <w:t>3.3 Knowledge representation paradigms</w:t>
@@ -13421,7 +13421,7 @@
         <w:spacing w:before="80"/>
         <w:jc w:val="center"/>
       </w:pPr>
-      <w:bookmarkStart w:id="27" w:name="_Toc242028080"/>
+      <w:bookmarkStart w:id="27" w:name="_Toc242030814"/>
       <w:r>
         <w:t xml:space="preserve">Table </w:t>
       </w:r>
@@ -13893,7 +13893,7 @@
       <w:pPr>
         <w:pStyle w:val="Heading1"/>
       </w:pPr>
-      <w:bookmarkStart w:id="28" w:name="_Toc242028236"/>
+      <w:bookmarkStart w:id="28" w:name="_Toc242030970"/>
       <w:r>
         <w:t>Chapter 4: Frames and scripts</w:t>
       </w:r>
@@ -13908,7 +13908,7 @@
       <w:pPr>
         <w:pStyle w:val="Heading2"/>
       </w:pPr>
-      <w:bookmarkStart w:id="29" w:name="_Toc242028237"/>
+      <w:bookmarkStart w:id="29" w:name="_Toc242030971"/>
       <w:r>
         <w:t>4.1 Frame architecture</w:t>
       </w:r>
@@ -13939,7 +13939,7 @@
         </w:rPr>
         <w:lastRenderedPageBreak/>
         <w:drawing>
-          <wp:inline distT="0" distB="0" distL="0" distR="0" wp14:anchorId="57A3F459" wp14:editId="47E1D6CB">
+          <wp:inline distT="0" distB="0" distL="0" distR="0" wp14:anchorId="68E9EF2A" wp14:editId="7188FDA4">
             <wp:extent cx="5135890" cy="5660147"/>
             <wp:effectExtent l="0" t="0" r="0" b="0"/>
             <wp:docPr id="2" name="Picture 2"/>
@@ -13981,7 +13981,7 @@
         <w:spacing w:before="80" w:after="160"/>
         <w:jc w:val="center"/>
       </w:pPr>
-      <w:bookmarkStart w:id="30" w:name="_Toc242028068"/>
+      <w:bookmarkStart w:id="30" w:name="_Toc242030802"/>
       <w:r>
         <w:t xml:space="preserve">Figure </w:t>
       </w:r>
@@ -14012,7 +14012,7 @@
       <w:pPr>
         <w:pStyle w:val="Heading2"/>
       </w:pPr>
-      <w:bookmarkStart w:id="31" w:name="_Toc242028238"/>
+      <w:bookmarkStart w:id="31" w:name="_Toc242030972"/>
       <w:r>
         <w:t>4.2 Frame: Person</w:t>
       </w:r>
@@ -14030,7 +14030,7 @@
         <w:spacing w:before="80"/>
         <w:jc w:val="center"/>
       </w:pPr>
-      <w:bookmarkStart w:id="32" w:name="_Toc242028081"/>
+      <w:bookmarkStart w:id="32" w:name="_Toc242030815"/>
       <w:r>
         <w:t xml:space="preserve">Table </w:t>
       </w:r>
@@ -14628,7 +14628,7 @@
       <w:pPr>
         <w:pStyle w:val="Heading2"/>
       </w:pPr>
-      <w:bookmarkStart w:id="33" w:name="_Toc242028239"/>
+      <w:bookmarkStart w:id="33" w:name="_Toc242030973"/>
       <w:r>
         <w:t>4.3 Frame: Student</w:t>
       </w:r>
@@ -14646,7 +14646,7 @@
         <w:spacing w:before="80"/>
         <w:jc w:val="center"/>
       </w:pPr>
-      <w:bookmarkStart w:id="34" w:name="_Toc242028082"/>
+      <w:bookmarkStart w:id="34" w:name="_Toc242030816"/>
       <w:r>
         <w:lastRenderedPageBreak/>
         <w:t xml:space="preserve">Table </w:t>
@@ -15040,7 +15040,7 @@
       <w:pPr>
         <w:pStyle w:val="Heading2"/>
       </w:pPr>
-      <w:bookmarkStart w:id="35" w:name="_Toc242028240"/>
+      <w:bookmarkStart w:id="35" w:name="_Toc242030974"/>
       <w:r>
         <w:t>4.4 Frame: Faculty / Staff</w:t>
       </w:r>
@@ -15058,7 +15058,7 @@
         <w:spacing w:before="80"/>
         <w:jc w:val="center"/>
       </w:pPr>
-      <w:bookmarkStart w:id="36" w:name="_Toc242028083"/>
+      <w:bookmarkStart w:id="36" w:name="_Toc242030817"/>
       <w:r>
         <w:t xml:space="preserve">Table </w:t>
       </w:r>
@@ -15667,7 +15667,7 @@
       <w:pPr>
         <w:pStyle w:val="Heading2"/>
       </w:pPr>
-      <w:bookmarkStart w:id="37" w:name="_Toc242028241"/>
+      <w:bookmarkStart w:id="37" w:name="_Toc242030975"/>
       <w:r>
         <w:t>4.5 Frame: Visitor</w:t>
       </w:r>
@@ -15680,7 +15680,7 @@
         <w:spacing w:before="80"/>
         <w:jc w:val="center"/>
       </w:pPr>
-      <w:bookmarkStart w:id="38" w:name="_Toc242028084"/>
+      <w:bookmarkStart w:id="38" w:name="_Toc242030818"/>
       <w:r>
         <w:t xml:space="preserve">Table </w:t>
       </w:r>
@@ -16084,7 +16084,7 @@
       <w:pPr>
         <w:pStyle w:val="Heading2"/>
       </w:pPr>
-      <w:bookmarkStart w:id="39" w:name="_Toc242028242"/>
+      <w:bookmarkStart w:id="39" w:name="_Toc242030976"/>
       <w:r>
         <w:t>4.6 Frame: Vehicle</w:t>
       </w:r>
@@ -16097,7 +16097,7 @@
         <w:spacing w:before="80"/>
         <w:jc w:val="center"/>
       </w:pPr>
-      <w:bookmarkStart w:id="40" w:name="_Toc242028085"/>
+      <w:bookmarkStart w:id="40" w:name="_Toc242030819"/>
       <w:r>
         <w:t xml:space="preserve">Table </w:t>
       </w:r>
@@ -16501,7 +16501,7 @@
       <w:pPr>
         <w:pStyle w:val="Heading2"/>
       </w:pPr>
-      <w:bookmarkStart w:id="41" w:name="_Toc242028243"/>
+      <w:bookmarkStart w:id="41" w:name="_Toc242030977"/>
       <w:r>
         <w:t>4.7 Frame: Parking permit</w:t>
       </w:r>
@@ -16514,7 +16514,7 @@
         <w:spacing w:before="80"/>
         <w:jc w:val="center"/>
       </w:pPr>
-      <w:bookmarkStart w:id="42" w:name="_Toc242028086"/>
+      <w:bookmarkStart w:id="42" w:name="_Toc242030820"/>
       <w:r>
         <w:t xml:space="preserve">Table </w:t>
       </w:r>
@@ -17123,7 +17123,7 @@
       <w:pPr>
         <w:pStyle w:val="Heading2"/>
       </w:pPr>
-      <w:bookmarkStart w:id="43" w:name="_Toc242028244"/>
+      <w:bookmarkStart w:id="43" w:name="_Toc242030978"/>
       <w:r>
         <w:t>4.8 Frame: Parking space</w:t>
       </w:r>
@@ -17141,7 +17141,7 @@
         <w:spacing w:before="80"/>
         <w:jc w:val="center"/>
       </w:pPr>
-      <w:bookmarkStart w:id="44" w:name="_Toc242028087"/>
+      <w:bookmarkStart w:id="44" w:name="_Toc242030821"/>
       <w:r>
         <w:lastRenderedPageBreak/>
         <w:t xml:space="preserve">Table </w:t>
@@ -18312,7 +18312,7 @@
       <w:pPr>
         <w:pStyle w:val="Heading2"/>
       </w:pPr>
-      <w:bookmarkStart w:id="45" w:name="_Toc242028245"/>
+      <w:bookmarkStart w:id="45" w:name="_Toc242030979"/>
       <w:r>
         <w:t>4.9 Frame: Parking zone</w:t>
       </w:r>
@@ -18330,7 +18330,7 @@
         <w:spacing w:before="80"/>
         <w:jc w:val="center"/>
       </w:pPr>
-      <w:bookmarkStart w:id="46" w:name="_Toc242028088"/>
+      <w:bookmarkStart w:id="46" w:name="_Toc242030822"/>
       <w:r>
         <w:t xml:space="preserve">Table </w:t>
       </w:r>
@@ -19050,7 +19050,7 @@
       <w:pPr>
         <w:pStyle w:val="Heading2"/>
       </w:pPr>
-      <w:bookmarkStart w:id="47" w:name="_Toc242028246"/>
+      <w:bookmarkStart w:id="47" w:name="_Toc242030980"/>
       <w:r>
         <w:t>4.10 Frame: Reservation</w:t>
       </w:r>
@@ -19068,7 +19068,7 @@
         <w:spacing w:before="80"/>
         <w:jc w:val="center"/>
       </w:pPr>
-      <w:bookmarkStart w:id="48" w:name="_Toc242028089"/>
+      <w:bookmarkStart w:id="48" w:name="_Toc242030823"/>
       <w:r>
         <w:t xml:space="preserve">Table </w:t>
       </w:r>
@@ -19566,7 +19566,7 @@
       <w:pPr>
         <w:pStyle w:val="Heading2"/>
       </w:pPr>
-      <w:bookmarkStart w:id="49" w:name="_Toc242028247"/>
+      <w:bookmarkStart w:id="49" w:name="_Toc242030981"/>
       <w:r>
         <w:t>4.11 Script / event sequence</w:t>
       </w:r>
@@ -19592,7 +19592,7 @@
         </w:rPr>
         <w:lastRenderedPageBreak/>
         <w:drawing>
-          <wp:inline distT="0" distB="0" distL="0" distR="0" wp14:anchorId="3DFA0921" wp14:editId="3C3D1998">
+          <wp:inline distT="0" distB="0" distL="0" distR="0" wp14:anchorId="2F775F2F" wp14:editId="118B696A">
             <wp:extent cx="5617475" cy="2231140"/>
             <wp:effectExtent l="0" t="0" r="0" b="0"/>
             <wp:docPr id="3" name="Picture 3"/>
@@ -19634,7 +19634,7 @@
         <w:spacing w:before="80" w:after="160"/>
         <w:jc w:val="center"/>
       </w:pPr>
-      <w:bookmarkStart w:id="50" w:name="_Toc242028069"/>
+      <w:bookmarkStart w:id="50" w:name="_Toc242030803"/>
       <w:r>
         <w:t xml:space="preserve">Figure </w:t>
       </w:r>
@@ -19708,7 +19708,7 @@
       <w:pPr>
         <w:pStyle w:val="Heading1"/>
       </w:pPr>
-      <w:bookmarkStart w:id="51" w:name="_Toc242028248"/>
+      <w:bookmarkStart w:id="51" w:name="_Toc242030982"/>
       <w:r>
         <w:t>Chapter 5: Semantic network</w:t>
       </w:r>
@@ -19723,7 +19723,7 @@
       <w:pPr>
         <w:pStyle w:val="Heading2"/>
       </w:pPr>
-      <w:bookmarkStart w:id="52" w:name="_Toc242028249"/>
+      <w:bookmarkStart w:id="52" w:name="_Toc242030983"/>
       <w:r>
         <w:t>5.1 Semantic network design</w:t>
       </w:r>
@@ -19745,7 +19745,7 @@
           <w:noProof/>
         </w:rPr>
         <w:drawing>
-          <wp:inline distT="0" distB="0" distL="0" distR="0" wp14:anchorId="0F0BB78F" wp14:editId="4F8DAC89">
+          <wp:inline distT="0" distB="0" distL="0" distR="0" wp14:anchorId="2C57CB18" wp14:editId="3F172B6A">
             <wp:extent cx="5687579" cy="2590805"/>
             <wp:effectExtent l="0" t="0" r="0" b="0"/>
             <wp:docPr id="4" name="Picture 4"/>
@@ -19787,7 +19787,7 @@
         <w:spacing w:before="80" w:after="160"/>
         <w:jc w:val="center"/>
       </w:pPr>
-      <w:bookmarkStart w:id="53" w:name="_Toc242028070"/>
+      <w:bookmarkStart w:id="53" w:name="_Toc242030804"/>
       <w:r>
         <w:t xml:space="preserve">Figure </w:t>
       </w:r>
@@ -19826,7 +19826,7 @@
         </w:rPr>
         <w:lastRenderedPageBreak/>
         <w:drawing>
-          <wp:inline distT="0" distB="0" distL="0" distR="0" wp14:anchorId="0920D778" wp14:editId="4BF6C5F3">
+          <wp:inline distT="0" distB="0" distL="0" distR="0" wp14:anchorId="76E95739" wp14:editId="70C41E1D">
             <wp:extent cx="5617475" cy="2682245"/>
             <wp:effectExtent l="0" t="0" r="0" b="0"/>
             <wp:docPr id="5" name="Picture 5"/>
@@ -19868,7 +19868,7 @@
         <w:spacing w:before="80" w:after="160"/>
         <w:jc w:val="center"/>
       </w:pPr>
-      <w:bookmarkStart w:id="54" w:name="_Toc242028071"/>
+      <w:bookmarkStart w:id="54" w:name="_Toc242030805"/>
       <w:r>
         <w:t xml:space="preserve">Figure </w:t>
       </w:r>
@@ -19899,7 +19899,7 @@
       <w:pPr>
         <w:pStyle w:val="Heading2"/>
       </w:pPr>
-      <w:bookmarkStart w:id="55" w:name="_Toc242028250"/>
+      <w:bookmarkStart w:id="55" w:name="_Toc242030984"/>
       <w:r>
         <w:t>5.2 Relationship types</w:t>
       </w:r>
@@ -19912,7 +19912,7 @@
         <w:spacing w:before="80"/>
         <w:jc w:val="center"/>
       </w:pPr>
-      <w:bookmarkStart w:id="56" w:name="_Toc242028090"/>
+      <w:bookmarkStart w:id="56" w:name="_Toc242030824"/>
       <w:r>
         <w:t xml:space="preserve">Table </w:t>
       </w:r>
@@ -20659,7 +20659,7 @@
       <w:pPr>
         <w:pStyle w:val="Heading2"/>
       </w:pPr>
-      <w:bookmarkStart w:id="57" w:name="_Toc242028251"/>
+      <w:bookmarkStart w:id="57" w:name="_Toc242030985"/>
       <w:r>
         <w:t>5.3 Semantic network walkthrough</w:t>
       </w:r>
@@ -20767,7 +20767,7 @@
       <w:pPr>
         <w:pStyle w:val="Heading1"/>
       </w:pPr>
-      <w:bookmarkStart w:id="58" w:name="_Toc242028252"/>
+      <w:bookmarkStart w:id="58" w:name="_Toc242030986"/>
       <w:r>
         <w:lastRenderedPageBreak/>
         <w:t>Chapter 6: First-order logic (FOL)</w:t>
@@ -20783,7 +20783,7 @@
       <w:pPr>
         <w:pStyle w:val="Heading2"/>
       </w:pPr>
-      <w:bookmarkStart w:id="59" w:name="_Toc242028253"/>
+      <w:bookmarkStart w:id="59" w:name="_Toc242030987"/>
       <w:r>
         <w:t>6.1 FOL vocabulary</w:t>
       </w:r>
@@ -20849,7 +20849,7 @@
       <w:pPr>
         <w:pStyle w:val="Heading2"/>
       </w:pPr>
-      <w:bookmarkStart w:id="60" w:name="_Toc242028254"/>
+      <w:bookmarkStart w:id="60" w:name="_Toc242030988"/>
       <w:r>
         <w:t>6.2 Domain facts</w:t>
       </w:r>
@@ -20904,7 +20904,7 @@
       <w:pPr>
         <w:pStyle w:val="Heading2"/>
       </w:pPr>
-      <w:bookmarkStart w:id="61" w:name="_Toc242028255"/>
+      <w:bookmarkStart w:id="61" w:name="_Toc242030989"/>
       <w:r>
         <w:t>6.3 FOL rules</w:t>
       </w:r>
@@ -20922,7 +20922,7 @@
         <w:spacing w:before="80"/>
         <w:jc w:val="center"/>
       </w:pPr>
-      <w:bookmarkStart w:id="62" w:name="_Toc242028091"/>
+      <w:bookmarkStart w:id="62" w:name="_Toc242030825"/>
       <w:r>
         <w:t xml:space="preserve">Table </w:t>
       </w:r>
@@ -21940,7 +21940,7 @@
       <w:pPr>
         <w:pStyle w:val="Heading2"/>
       </w:pPr>
-      <w:bookmarkStart w:id="63" w:name="_Toc242028256"/>
+      <w:bookmarkStart w:id="63" w:name="_Toc242030990"/>
       <w:r>
         <w:t>6.4 Quantifier usage</w:t>
       </w:r>
@@ -21963,7 +21963,7 @@
         <w:spacing w:before="80"/>
         <w:jc w:val="center"/>
       </w:pPr>
-      <w:bookmarkStart w:id="64" w:name="_Toc242028092"/>
+      <w:bookmarkStart w:id="64" w:name="_Toc242030826"/>
       <w:r>
         <w:t xml:space="preserve">Table </w:t>
       </w:r>
@@ -23184,7 +23184,7 @@
       <w:pPr>
         <w:pStyle w:val="Heading2"/>
       </w:pPr>
-      <w:bookmarkStart w:id="65" w:name="_Toc242028257"/>
+      <w:bookmarkStart w:id="65" w:name="_Toc242030991"/>
       <w:r>
         <w:lastRenderedPageBreak/>
         <w:t>6.5 Consistency verification</w:t>
@@ -23203,7 +23203,7 @@
       <w:pPr>
         <w:pStyle w:val="Heading1"/>
       </w:pPr>
-      <w:bookmarkStart w:id="66" w:name="_Toc242028258"/>
+      <w:bookmarkStart w:id="66" w:name="_Toc242030992"/>
       <w:r>
         <w:t>Chapter 7: Description logic</w:t>
       </w:r>
@@ -23218,7 +23218,7 @@
       <w:pPr>
         <w:pStyle w:val="Heading2"/>
       </w:pPr>
-      <w:bookmarkStart w:id="67" w:name="_Toc242028259"/>
+      <w:bookmarkStart w:id="67" w:name="_Toc242030993"/>
       <w:r>
         <w:t>7.1 DL concepts</w:t>
       </w:r>
@@ -23233,7 +23233,7 @@
       <w:pPr>
         <w:pStyle w:val="Heading2"/>
       </w:pPr>
-      <w:bookmarkStart w:id="68" w:name="_Toc242028260"/>
+      <w:bookmarkStart w:id="68" w:name="_Toc242030994"/>
       <w:r>
         <w:t>7.2 DL roles</w:t>
       </w:r>
@@ -23251,7 +23251,7 @@
         <w:spacing w:before="80"/>
         <w:jc w:val="center"/>
       </w:pPr>
-      <w:bookmarkStart w:id="69" w:name="_Toc242028093"/>
+      <w:bookmarkStart w:id="69" w:name="_Toc242030827"/>
       <w:r>
         <w:t xml:space="preserve">Table </w:t>
       </w:r>
@@ -23860,7 +23860,7 @@
       <w:pPr>
         <w:pStyle w:val="Heading2"/>
       </w:pPr>
-      <w:bookmarkStart w:id="70" w:name="_Toc242028261"/>
+      <w:bookmarkStart w:id="70" w:name="_Toc242030995"/>
       <w:r>
         <w:t>7.3 Subsumption axioms</w:t>
       </w:r>
@@ -23878,7 +23878,7 @@
         <w:spacing w:before="80"/>
         <w:jc w:val="center"/>
       </w:pPr>
-      <w:bookmarkStart w:id="71" w:name="_Toc242028094"/>
+      <w:bookmarkStart w:id="71" w:name="_Toc242030828"/>
       <w:r>
         <w:t xml:space="preserve">Table </w:t>
       </w:r>
@@ -24412,7 +24412,7 @@
       <w:pPr>
         <w:pStyle w:val="Heading2"/>
       </w:pPr>
-      <w:bookmarkStart w:id="72" w:name="_Toc242028262"/>
+      <w:bookmarkStart w:id="72" w:name="_Toc242030996"/>
       <w:r>
         <w:t>7.4 Disjointness axioms</w:t>
       </w:r>
@@ -24430,7 +24430,7 @@
         <w:spacing w:before="80"/>
         <w:jc w:val="center"/>
       </w:pPr>
-      <w:bookmarkStart w:id="73" w:name="_Toc242028095"/>
+      <w:bookmarkStart w:id="73" w:name="_Toc242030829"/>
       <w:r>
         <w:lastRenderedPageBreak/>
         <w:t xml:space="preserve">Table </w:t>
@@ -24960,7 +24960,7 @@
       <w:pPr>
         <w:pStyle w:val="Heading2"/>
       </w:pPr>
-      <w:bookmarkStart w:id="74" w:name="_Toc242028263"/>
+      <w:bookmarkStart w:id="74" w:name="_Toc242030997"/>
       <w:r>
         <w:t>7.5 Membership assertions</w:t>
       </w:r>
@@ -24975,7 +24975,7 @@
       <w:pPr>
         <w:pStyle w:val="Heading2"/>
       </w:pPr>
-      <w:bookmarkStart w:id="75" w:name="_Toc242028264"/>
+      <w:bookmarkStart w:id="75" w:name="_Toc242030998"/>
       <w:r>
         <w:t>7.6 Existential and universal restrictions</w:t>
       </w:r>
@@ -24988,7 +24988,7 @@
         <w:spacing w:before="80"/>
         <w:jc w:val="center"/>
       </w:pPr>
-      <w:bookmarkStart w:id="76" w:name="_Toc242028096"/>
+      <w:bookmarkStart w:id="76" w:name="_Toc242030830"/>
       <w:r>
         <w:t xml:space="preserve">Table </w:t>
       </w:r>
@@ -25531,7 +25531,7 @@
         <w:spacing w:before="80"/>
         <w:jc w:val="center"/>
       </w:pPr>
-      <w:bookmarkStart w:id="77" w:name="_Toc242028097"/>
+      <w:bookmarkStart w:id="77" w:name="_Toc242030831"/>
       <w:r>
         <w:t xml:space="preserve">Table </w:t>
       </w:r>
@@ -26002,7 +26002,7 @@
       <w:pPr>
         <w:pStyle w:val="Heading2"/>
       </w:pPr>
-      <w:bookmarkStart w:id="78" w:name="_Toc242028265"/>
+      <w:bookmarkStart w:id="78" w:name="_Toc242030999"/>
       <w:r>
         <w:t>7.7 DL interpretation</w:t>
       </w:r>
@@ -26031,7 +26031,7 @@
       <w:pPr>
         <w:pStyle w:val="Heading1"/>
       </w:pPr>
-      <w:bookmarkStart w:id="79" w:name="_Toc242028266"/>
+      <w:bookmarkStart w:id="79" w:name="_Toc242031000"/>
       <w:r>
         <w:t>Chapter 8: Knowledge base and Horn clauses</w:t>
       </w:r>
@@ -26046,7 +26046,7 @@
       <w:pPr>
         <w:pStyle w:val="Heading2"/>
       </w:pPr>
-      <w:bookmarkStart w:id="80" w:name="_Toc242028267"/>
+      <w:bookmarkStart w:id="80" w:name="_Toc242031001"/>
       <w:r>
         <w:t>8.1 Knowledge base</w:t>
       </w:r>
@@ -26061,7 +26061,7 @@
       <w:pPr>
         <w:pStyle w:val="Heading2"/>
       </w:pPr>
-      <w:bookmarkStart w:id="81" w:name="_Toc242028268"/>
+      <w:bookmarkStart w:id="81" w:name="_Toc242031002"/>
       <w:r>
         <w:t>8.2 Facts</w:t>
       </w:r>
@@ -26147,7 +26147,7 @@
       <w:pPr>
         <w:pStyle w:val="Heading2"/>
       </w:pPr>
-      <w:bookmarkStart w:id="82" w:name="_Toc242028269"/>
+      <w:bookmarkStart w:id="82" w:name="_Toc242031003"/>
       <w:r>
         <w:t>8.3 Rules</w:t>
       </w:r>
@@ -26175,7 +26175,7 @@
         <w:spacing w:before="80"/>
         <w:jc w:val="center"/>
       </w:pPr>
-      <w:bookmarkStart w:id="83" w:name="_Toc242028098"/>
+      <w:bookmarkStart w:id="83" w:name="_Toc242030832"/>
       <w:r>
         <w:t xml:space="preserve">Table </w:t>
       </w:r>
@@ -28653,7 +28653,7 @@
       <w:pPr>
         <w:pStyle w:val="Heading2"/>
       </w:pPr>
-      <w:bookmarkStart w:id="84" w:name="_Toc242028270"/>
+      <w:bookmarkStart w:id="84" w:name="_Toc242031004"/>
       <w:r>
         <w:t>8.4 Horn clause conversion</w:t>
       </w:r>
@@ -28720,7 +28720,7 @@
       <w:pPr>
         <w:pStyle w:val="Heading1"/>
       </w:pPr>
-      <w:bookmarkStart w:id="85" w:name="_Toc242028271"/>
+      <w:bookmarkStart w:id="85" w:name="_Toc242031005"/>
       <w:r>
         <w:t>Chapter 9: Inference engine: forward and backward chaining</w:t>
       </w:r>
@@ -28735,7 +28735,7 @@
       <w:pPr>
         <w:pStyle w:val="Heading2"/>
       </w:pPr>
-      <w:bookmarkStart w:id="86" w:name="_Toc242028272"/>
+      <w:bookmarkStart w:id="86" w:name="_Toc242031006"/>
       <w:r>
         <w:t>9.1 Inference engine architecture</w:t>
       </w:r>
@@ -28752,7 +28752,7 @@
           <w:noProof/>
         </w:rPr>
         <w:drawing>
-          <wp:inline distT="0" distB="0" distL="0" distR="0" wp14:anchorId="5514CD53" wp14:editId="1A15BF06">
+          <wp:inline distT="0" distB="0" distL="0" distR="0" wp14:anchorId="2EC43AD8" wp14:editId="39123122">
             <wp:extent cx="5724155" cy="2045212"/>
             <wp:effectExtent l="0" t="0" r="0" b="0"/>
             <wp:docPr id="6" name="Picture 6"/>
@@ -28794,7 +28794,7 @@
         <w:spacing w:before="80" w:after="160"/>
         <w:jc w:val="center"/>
       </w:pPr>
-      <w:bookmarkStart w:id="87" w:name="_Toc242028072"/>
+      <w:bookmarkStart w:id="87" w:name="_Toc242030806"/>
       <w:r>
         <w:t xml:space="preserve">Figure </w:t>
       </w:r>
@@ -28830,7 +28830,7 @@
       <w:pPr>
         <w:pStyle w:val="Heading2"/>
       </w:pPr>
-      <w:bookmarkStart w:id="88" w:name="_Toc242028273"/>
+      <w:bookmarkStart w:id="88" w:name="_Toc242031007"/>
       <w:r>
         <w:t>9.2 Forward chaining algorithm</w:t>
       </w:r>
@@ -28957,7 +28957,7 @@
       <w:pPr>
         <w:pStyle w:val="Heading2"/>
       </w:pPr>
-      <w:bookmarkStart w:id="89" w:name="_Toc242028274"/>
+      <w:bookmarkStart w:id="89" w:name="_Toc242031008"/>
       <w:r>
         <w:t>9.3 Forward chaining trace</w:t>
       </w:r>
@@ -28975,7 +28975,7 @@
         <w:spacing w:before="80"/>
         <w:jc w:val="center"/>
       </w:pPr>
-      <w:bookmarkStart w:id="90" w:name="_Toc242028099"/>
+      <w:bookmarkStart w:id="90" w:name="_Toc242030833"/>
       <w:r>
         <w:t xml:space="preserve">Table </w:t>
       </w:r>
@@ -30265,7 +30265,7 @@
         <w:spacing w:before="80"/>
         <w:jc w:val="center"/>
       </w:pPr>
-      <w:bookmarkStart w:id="91" w:name="_Toc242028100"/>
+      <w:bookmarkStart w:id="91" w:name="_Toc242030834"/>
       <w:r>
         <w:t xml:space="preserve">Table </w:t>
       </w:r>
@@ -30478,7 +30478,7 @@
               <w:rPr>
                 <w:sz w:val="16"/>
               </w:rPr>
-              <w:t>12</w:t>
+              <w:t>10</w:t>
             </w:r>
           </w:p>
         </w:tc>
@@ -30735,7 +30735,7 @@
               <w:rPr>
                 <w:sz w:val="16"/>
               </w:rPr>
-              <w:t>20</w:t>
+              <w:t>21</w:t>
             </w:r>
           </w:p>
         </w:tc>
@@ -30861,7 +30861,7 @@
               <w:rPr>
                 <w:sz w:val="16"/>
               </w:rPr>
-              <w:t>24</w:t>
+              <w:t>23</w:t>
             </w:r>
           </w:p>
         </w:tc>
@@ -31113,7 +31113,7 @@
               <w:rPr>
                 <w:sz w:val="16"/>
               </w:rPr>
-              <w:t>53</w:t>
+              <w:t>55</w:t>
             </w:r>
           </w:p>
         </w:tc>
@@ -31239,7 +31239,7 @@
               <w:rPr>
                 <w:sz w:val="16"/>
               </w:rPr>
-              <w:t>72</w:t>
+              <w:t>67</w:t>
             </w:r>
           </w:p>
         </w:tc>
@@ -31365,7 +31365,7 @@
               <w:rPr>
                 <w:sz w:val="16"/>
               </w:rPr>
-              <w:t>77</w:t>
+              <w:t>86</w:t>
             </w:r>
           </w:p>
         </w:tc>
@@ -31491,7 +31491,7 @@
               <w:rPr>
                 <w:sz w:val="16"/>
               </w:rPr>
-              <w:t>92</w:t>
+              <w:t>95</w:t>
             </w:r>
           </w:p>
         </w:tc>
@@ -31744,7 +31744,7 @@
         <w:spacing w:before="80"/>
         <w:jc w:val="center"/>
       </w:pPr>
-      <w:bookmarkStart w:id="92" w:name="_Toc242028101"/>
+      <w:bookmarkStart w:id="92" w:name="_Toc242030835"/>
       <w:r>
         <w:t xml:space="preserve">Table </w:t>
       </w:r>
@@ -32613,7 +32613,7 @@
       <w:pPr>
         <w:pStyle w:val="Heading2"/>
       </w:pPr>
-      <w:bookmarkStart w:id="93" w:name="_Toc242028275"/>
+      <w:bookmarkStart w:id="93" w:name="_Toc242031009"/>
       <w:r>
         <w:t>9.4 Backward chaining algorithm</w:t>
       </w:r>
@@ -32720,7 +32720,7 @@
       <w:pPr>
         <w:pStyle w:val="Heading2"/>
       </w:pPr>
-      <w:bookmarkStart w:id="94" w:name="_Toc242028276"/>
+      <w:bookmarkStart w:id="94" w:name="_Toc242031010"/>
       <w:r>
         <w:t>9.5 Backward chaining trace</w:t>
       </w:r>
@@ -32748,7 +32748,7 @@
         <w:spacing w:before="80"/>
         <w:jc w:val="center"/>
       </w:pPr>
-      <w:bookmarkStart w:id="95" w:name="_Toc242028102"/>
+      <w:bookmarkStart w:id="95" w:name="_Toc242030836"/>
       <w:r>
         <w:t xml:space="preserve">Table </w:t>
       </w:r>
@@ -34238,7 +34238,7 @@
       <w:pPr>
         <w:pStyle w:val="Heading2"/>
       </w:pPr>
-      <w:bookmarkStart w:id="96" w:name="_Toc242028277"/>
+      <w:bookmarkStart w:id="96" w:name="_Toc242031011"/>
       <w:r>
         <w:t>9.6 Forward vs. backward chaining</w:t>
       </w:r>
@@ -34256,7 +34256,7 @@
       <w:pPr>
         <w:pStyle w:val="Heading1"/>
       </w:pPr>
-      <w:bookmarkStart w:id="97" w:name="_Toc242028278"/>
+      <w:bookmarkStart w:id="97" w:name="_Toc242031012"/>
       <w:r>
         <w:t>Chapter 10: System implementation</w:t>
       </w:r>
@@ -34271,7 +34271,7 @@
       <w:pPr>
         <w:pStyle w:val="Heading2"/>
       </w:pPr>
-      <w:bookmarkStart w:id="98" w:name="_Toc242028279"/>
+      <w:bookmarkStart w:id="98" w:name="_Toc242031013"/>
       <w:r>
         <w:t>10.1 Technology stack</w:t>
       </w:r>
@@ -34289,7 +34289,7 @@
       <w:pPr>
         <w:pStyle w:val="Heading2"/>
       </w:pPr>
-      <w:bookmarkStart w:id="99" w:name="_Toc242028280"/>
+      <w:bookmarkStart w:id="99" w:name="_Toc242031014"/>
       <w:r>
         <w:t>10.2 Project structure</w:t>
       </w:r>
@@ -34383,7 +34383,7 @@
       <w:pPr>
         <w:pStyle w:val="Heading2"/>
       </w:pPr>
-      <w:bookmarkStart w:id="100" w:name="_Toc242028281"/>
+      <w:bookmarkStart w:id="100" w:name="_Toc242031015"/>
       <w:r>
         <w:t>10.3 Knowledge base implementation</w:t>
       </w:r>
@@ -34398,7 +34398,7 @@
       <w:pPr>
         <w:pStyle w:val="Heading2"/>
       </w:pPr>
-      <w:bookmarkStart w:id="101" w:name="_Toc242028282"/>
+      <w:bookmarkStart w:id="101" w:name="_Toc242031016"/>
       <w:r>
         <w:t>10.4 Frame implementation</w:t>
       </w:r>
@@ -34413,7 +34413,7 @@
       <w:pPr>
         <w:pStyle w:val="Heading2"/>
       </w:pPr>
-      <w:bookmarkStart w:id="102" w:name="_Toc242028283"/>
+      <w:bookmarkStart w:id="102" w:name="_Toc242031017"/>
       <w:r>
         <w:t>10.5 Forward chaining implementation</w:t>
       </w:r>
@@ -34499,7 +34499,7 @@
       <w:pPr>
         <w:pStyle w:val="Heading2"/>
       </w:pPr>
-      <w:bookmarkStart w:id="103" w:name="_Toc242028284"/>
+      <w:bookmarkStart w:id="103" w:name="_Toc242031018"/>
       <w:r>
         <w:t>10.6 Backward chaining implementation</w:t>
       </w:r>
@@ -34578,7 +34578,7 @@
       <w:pPr>
         <w:pStyle w:val="Heading2"/>
       </w:pPr>
-      <w:bookmarkStart w:id="104" w:name="_Toc242028285"/>
+      <w:bookmarkStart w:id="104" w:name="_Toc242031019"/>
       <w:r>
         <w:t>10.7 User interaction / CLI</w:t>
       </w:r>
@@ -34617,7 +34617,7 @@
       <w:pPr>
         <w:pStyle w:val="Heading2"/>
       </w:pPr>
-      <w:bookmarkStart w:id="105" w:name="_Toc242028286"/>
+      <w:bookmarkStart w:id="105" w:name="_Toc242031020"/>
       <w:r>
         <w:t>10.8 Sample execution</w:t>
       </w:r>
@@ -34691,7 +34691,7 @@
       <w:pPr>
         <w:pStyle w:val="Heading2"/>
       </w:pPr>
-      <w:bookmarkStart w:id="106" w:name="_Toc242028287"/>
+      <w:bookmarkStart w:id="106" w:name="_Toc242031021"/>
       <w:r>
         <w:t>10.9 Project website</w:t>
       </w:r>
@@ -34737,7 +34737,7 @@
       <w:pPr>
         <w:pStyle w:val="Heading1"/>
       </w:pPr>
-      <w:bookmarkStart w:id="107" w:name="_Toc242028288"/>
+      <w:bookmarkStart w:id="107" w:name="_Toc242031022"/>
       <w:r>
         <w:t>Chapter 11: Testing and results</w:t>
       </w:r>
@@ -34752,7 +34752,7 @@
       <w:pPr>
         <w:pStyle w:val="Heading2"/>
       </w:pPr>
-      <w:bookmarkStart w:id="108" w:name="_Toc242028289"/>
+      <w:bookmarkStart w:id="108" w:name="_Toc242031023"/>
       <w:r>
         <w:t>11.1 Testing strategy</w:t>
       </w:r>
@@ -34767,7 +34767,7 @@
       <w:pPr>
         <w:pStyle w:val="Heading2"/>
       </w:pPr>
-      <w:bookmarkStart w:id="109" w:name="_Toc242028290"/>
+      <w:bookmarkStart w:id="109" w:name="_Toc242031024"/>
       <w:r>
         <w:t>11.2 Test cases</w:t>
       </w:r>
@@ -34780,7 +34780,7 @@
         <w:spacing w:before="80"/>
         <w:jc w:val="center"/>
       </w:pPr>
-      <w:bookmarkStart w:id="110" w:name="_Toc242028103"/>
+      <w:bookmarkStart w:id="110" w:name="_Toc242030837"/>
       <w:r>
         <w:t xml:space="preserve">Table </w:t>
       </w:r>
@@ -36500,7 +36500,7 @@
       <w:pPr>
         <w:pStyle w:val="Heading2"/>
       </w:pPr>
-      <w:bookmarkStart w:id="111" w:name="_Toc242028291"/>
+      <w:bookmarkStart w:id="111" w:name="_Toc242031025"/>
       <w:r>
         <w:t>11.3 Results analysis</w:t>
       </w:r>
@@ -36518,7 +36518,7 @@
       <w:pPr>
         <w:pStyle w:val="Heading2"/>
       </w:pPr>
-      <w:bookmarkStart w:id="112" w:name="_Toc242028292"/>
+      <w:bookmarkStart w:id="112" w:name="_Toc242031026"/>
       <w:r>
         <w:t>11.4 Inference accuracy / consistency</w:t>
       </w:r>
@@ -36591,7 +36591,7 @@
       <w:pPr>
         <w:pStyle w:val="Heading1"/>
       </w:pPr>
-      <w:bookmarkStart w:id="113" w:name="_Toc242028293"/>
+      <w:bookmarkStart w:id="113" w:name="_Toc242031027"/>
       <w:r>
         <w:t>Chapter 12: Expressivity, tractability and design analysis</w:t>
       </w:r>
@@ -36606,7 +36606,7 @@
       <w:pPr>
         <w:pStyle w:val="Heading2"/>
       </w:pPr>
-      <w:bookmarkStart w:id="114" w:name="_Toc242028294"/>
+      <w:bookmarkStart w:id="114" w:name="_Toc242031028"/>
       <w:r>
         <w:t>12.1 Propositional logic limitations</w:t>
       </w:r>
@@ -36625,7 +36625,7 @@
       <w:pPr>
         <w:pStyle w:val="Heading2"/>
       </w:pPr>
-      <w:bookmarkStart w:id="115" w:name="_Toc242028295"/>
+      <w:bookmarkStart w:id="115" w:name="_Toc242031029"/>
       <w:r>
         <w:t>12.2 FOL expressivity</w:t>
       </w:r>
@@ -36640,7 +36640,7 @@
       <w:pPr>
         <w:pStyle w:val="Heading2"/>
       </w:pPr>
-      <w:bookmarkStart w:id="116" w:name="_Toc242028296"/>
+      <w:bookmarkStart w:id="116" w:name="_Toc242031030"/>
       <w:r>
         <w:t>12.3 FOL computational limitations</w:t>
       </w:r>
@@ -36655,7 +36655,7 @@
       <w:pPr>
         <w:pStyle w:val="Heading2"/>
       </w:pPr>
-      <w:bookmarkStart w:id="117" w:name="_Toc242028297"/>
+      <w:bookmarkStart w:id="117" w:name="_Toc242031031"/>
       <w:r>
         <w:t>12.4 Description logic trade-offs</w:t>
       </w:r>
@@ -36673,7 +36673,7 @@
       <w:pPr>
         <w:pStyle w:val="Heading2"/>
       </w:pPr>
-      <w:bookmarkStart w:id="118" w:name="_Toc242028298"/>
+      <w:bookmarkStart w:id="118" w:name="_Toc242031032"/>
       <w:r>
         <w:t>12.5 Horn clauses and tractable inference</w:t>
       </w:r>
@@ -36691,7 +36691,7 @@
       <w:pPr>
         <w:pStyle w:val="Heading2"/>
       </w:pPr>
-      <w:bookmarkStart w:id="119" w:name="_Toc242028299"/>
+      <w:bookmarkStart w:id="119" w:name="_Toc242031033"/>
       <w:r>
         <w:t>12.6 Why multi-paradigm KRR?</w:t>
       </w:r>
@@ -36709,7 +36709,7 @@
       <w:pPr>
         <w:pStyle w:val="Heading1"/>
       </w:pPr>
-      <w:bookmarkStart w:id="120" w:name="_Toc242028300"/>
+      <w:bookmarkStart w:id="120" w:name="_Toc242031034"/>
       <w:r>
         <w:t>Chapter 13: Limitations and future work</w:t>
       </w:r>
@@ -36724,7 +36724,7 @@
       <w:pPr>
         <w:pStyle w:val="Heading2"/>
       </w:pPr>
-      <w:bookmarkStart w:id="121" w:name="_Toc242028301"/>
+      <w:bookmarkStart w:id="121" w:name="_Toc242031035"/>
       <w:r>
         <w:t>13.1 Current limitations</w:t>
       </w:r>
@@ -36782,7 +36782,7 @@
       <w:pPr>
         <w:pStyle w:val="Heading2"/>
       </w:pPr>
-      <w:bookmarkStart w:id="122" w:name="_Toc242028302"/>
+      <w:bookmarkStart w:id="122" w:name="_Toc242031036"/>
       <w:r>
         <w:lastRenderedPageBreak/>
         <w:t>13.2 Future improvements</w:t>
@@ -36893,7 +36893,7 @@
       <w:pPr>
         <w:pStyle w:val="Heading1"/>
       </w:pPr>
-      <w:bookmarkStart w:id="123" w:name="_Toc242028303"/>
+      <w:bookmarkStart w:id="123" w:name="_Toc242031037"/>
       <w:r>
         <w:t>Chapter 14: Conclusion</w:t>
       </w:r>
@@ -36908,7 +36908,7 @@
       <w:pPr>
         <w:pStyle w:val="Heading2"/>
       </w:pPr>
-      <w:bookmarkStart w:id="124" w:name="_Toc242028304"/>
+      <w:bookmarkStart w:id="124" w:name="_Toc242031038"/>
       <w:r>
         <w:t>14.1 Summary</w:t>
       </w:r>
@@ -36923,7 +36923,7 @@
       <w:pPr>
         <w:pStyle w:val="Heading2"/>
       </w:pPr>
-      <w:bookmarkStart w:id="125" w:name="_Toc242028305"/>
+      <w:bookmarkStart w:id="125" w:name="_Toc242031039"/>
       <w:r>
         <w:t>14.2 Achievements</w:t>
       </w:r>
@@ -36938,7 +36938,7 @@
       <w:pPr>
         <w:pStyle w:val="Heading2"/>
       </w:pPr>
-      <w:bookmarkStart w:id="126" w:name="_Toc242028306"/>
+      <w:bookmarkStart w:id="126" w:name="_Toc242031040"/>
       <w:r>
         <w:t>14.3 Final evaluation</w:t>
       </w:r>
@@ -36953,7 +36953,7 @@
       <w:pPr>
         <w:pStyle w:val="Heading1"/>
       </w:pPr>
-      <w:bookmarkStart w:id="127" w:name="_Toc242028307"/>
+      <w:bookmarkStart w:id="127" w:name="_Toc242031041"/>
       <w:r>
         <w:t>References</w:t>
       </w:r>
@@ -37180,7 +37180,7 @@
       <w:pPr>
         <w:pStyle w:val="Heading1"/>
       </w:pPr>
-      <w:bookmarkStart w:id="128" w:name="_Toc242028308"/>
+      <w:bookmarkStart w:id="128" w:name="_Toc242031042"/>
       <w:r>
         <w:t>Appendix A: Complete knowledge base</w:t>
       </w:r>
@@ -37375,7 +37375,7 @@
       <w:pPr>
         <w:pStyle w:val="Heading1"/>
       </w:pPr>
-      <w:bookmarkStart w:id="129" w:name="_Toc242028309"/>
+      <w:bookmarkStart w:id="129" w:name="_Toc242031043"/>
       <w:r>
         <w:t>Appendix B: Complete Horn clauses</w:t>
       </w:r>
@@ -37530,7 +37530,7 @@
       <w:pPr>
         <w:pStyle w:val="Heading1"/>
       </w:pPr>
-      <w:bookmarkStart w:id="130" w:name="_Toc242028310"/>
+      <w:bookmarkStart w:id="130" w:name="_Toc242031044"/>
       <w:r>
         <w:t>Appendix C: Forward chaining traces</w:t>
       </w:r>
@@ -37547,33 +37547,33 @@
         <w:shd w:val="clear" w:color="auto" w:fill="F3F4F6"/>
       </w:pPr>
       <w:r>
-        <w:t xml:space="preserve">  1 C1 R01 person(ali)                             54 C3 R13 zone_access(ali, zone_a)</w:t>
+        <w:t xml:space="preserve">  1 C1 R01 person(sara)                            54 C3 R13 zone_access(zara, zone_a)</w:t>
       </w:r>
       <w:r>
         <w:br/>
-        <w:t xml:space="preserve">  2 C1 R01 person(usman)                           55 C3 R13 zone_access(zara, zone_a)</w:t>
+        <w:t xml:space="preserve">  2 C1 R01 person(zara)                            55 C3 R13 zone_access(sara, zone_a)</w:t>
       </w:r>
       <w:r>
         <w:br/>
-        <w:t xml:space="preserve">  3 C1 R01 person(zara)                            56 C3 R13 zone_access(bilal, zone_v)</w:t>
+        <w:t xml:space="preserve">  3 C1 R01 person(usman)                           56 C3 R13 zone_access(ali, zone_a)</w:t>
       </w:r>
       <w:r>
         <w:br/>
       </w:r>
       <w:r>
-        <w:t xml:space="preserve">  4 C1 R01 person(sara)                            57 C4 R11 authorized_driver(ahmed)</w:t>
+        <w:t xml:space="preserve">  4 C1 R01 person(ali)                             57 C4 R11 authorized_driver(fatima)</w:t>
       </w:r>
       <w:r>
         <w:br/>
-        <w:t xml:space="preserve">  5 C1 R03 person(hina)                            58 C4 R11 authorized_driver(fatima)</w:t>
+        <w:t xml:space="preserve">  5 C1 R03 person(bilal)                           58 C4 R11 authorized_driver(ahmed)</w:t>
       </w:r>
       <w:r>
         <w:br/>
-        <w:t xml:space="preserve">  6 C1 R03 person(bilal)                           59 C4 R13 zone_access(ahmed, zone_e)</w:t>
+        <w:t xml:space="preserve">  6 C1 R03 person(hina)                            59 C4 R13 zone_access(fatima, zone_e)</w:t>
       </w:r>
       <w:r>
         <w:br/>
-        <w:t xml:space="preserve">  7 C1 R04 employee(ahmed)                         60 C4 R13 zone_access(fatima, zone_e)</w:t>
+        <w:t xml:space="preserve">  7 C1 R04 employee(ahmed)                         60 C4 R13 zone_access(ahmed, zone_e)</w:t>
       </w:r>
       <w:r>
         <w:br/>
@@ -37583,77 +37583,77 @@
         <w:br/>
       </w:r>
       <w:r>
-        <w:t xml:space="preserve">  9 C1 R06 permit_valid(p_zara)                    62 C4 R14 suitable_space(zara, s_a3)</w:t>
+        <w:t xml:space="preserve">  9 C1 R06 permit_valid(p_zara)                    62 C4 R14 suitable_space(zara, s_a2)</w:t>
       </w:r>
       <w:r>
         <w:br/>
-        <w:t xml:space="preserve"> 10 C1 R06 permit_valid(vp_bilal)                  63 C4 R14 suitable_space(zara, s_a1)</w:t>
+        <w:t xml:space="preserve"> 10 C1 R06 permit_valid(p_sara)                    63 C4 R14 suitable_space(zara, s_a1)</w:t>
       </w:r>
       <w:r>
         <w:br/>
-        <w:t xml:space="preserve"> 11 C1 R06 permit_valid(p_ahmed)                   64 C4 R14 suitable_space(zara, s_a2)</w:t>
+        <w:t xml:space="preserve"> 11 C1 R06 permit_valid(p_ahmed)                   64 C4 R14 suitable_space(zara, s_a3)</w:t>
       </w:r>
       <w:r>
         <w:br/>
-        <w:t xml:space="preserve"> 12 C1 R06 permit_valid(p_sara)                    65 C4 R14 suitable_space(ali, s_a5)</w:t>
+        <w:t xml:space="preserve"> 12 C1 R06 permit_valid(p_fatima)                  65 C4 R14 suitable_space(sara, s_a5)</w:t>
       </w:r>
       <w:r>
         <w:br/>
-        <w:t xml:space="preserve"> 13 C1 R06 permit_valid(p_ali)                     66 C4 R14 suitable_space(ali, s_a3)</w:t>
+        <w:t xml:space="preserve"> 13 C1 R06 permit_valid(p_ali)                     66 C4 R14 suitable_space(sara, s_a2)</w:t>
       </w:r>
       <w:r>
         <w:br/>
       </w:r>
       <w:r>
-        <w:t xml:space="preserve"> 14 C1 R06 permit_valid(p_fatima)                  67 C4 R14 suitable_space(ali, s_a1)</w:t>
+        <w:t xml:space="preserve"> 14 C1 R06 permit_valid(vp_bilal)                  67 C4 R14 suitable_space(sara, s_a1)</w:t>
       </w:r>
       <w:r>
         <w:br/>
-        <w:t xml:space="preserve"> 15 C1 R07 permit_matches_role(zara, p_zara)       68 C4 R14 suitable_space(ali, s_a2)</w:t>
+        <w:t xml:space="preserve"> 15 C1 R07 permit_matches_role(usman, p_usman)     68 C4 R14 suitable_space(sara, s_a3)</w:t>
       </w:r>
       <w:r>
         <w:br/>
-        <w:t xml:space="preserve"> 16 C1 R07 permit_matches_role(usman, p_usman)     69 C4 R14 suitable_space(bilal, s_v1)</w:t>
+        <w:t xml:space="preserve"> 16 C1 R07 permit_matches_role(ali, p_ali)         69 C4 R14 suitable_space(ali, s_a5)</w:t>
       </w:r>
       <w:r>
         <w:br/>
-        <w:t xml:space="preserve"> 17 C1 R07 permit_matches_role(sara, p_sara)       70 C4 R14 suitable_space(sara, s_a5)</w:t>
+        <w:t xml:space="preserve"> 17 C1 R07 permit_matches_role(sara, p_sara)       70 C4 R14 suitable_space(ali, s_a2)</w:t>
       </w:r>
       <w:r>
         <w:br/>
-        <w:t xml:space="preserve"> 18 C1 R07 permit_matches_role(ali, p_ali)         71 C4 R14 suitable_space(sara, s_a3)</w:t>
+        <w:t xml:space="preserve"> 18 C1 R07 permit_matches_role(zara, p_zara)       71 C4 R14 suitable_space(ali, s_a1)</w:t>
       </w:r>
       <w:r>
         <w:br/>
       </w:r>
       <w:r>
-        <w:t xml:space="preserve"> 19 C1 R09 permit_matches_role(bilal, vp_bilal)    72 C4 R14 suitable_space(sara, s_a1)</w:t>
+        <w:t xml:space="preserve"> 19 C1 R09 permit_matches_role(bilal, vp_bilal)    72 C4 R14 suitable_space(ali, s_a3)</w:t>
       </w:r>
       <w:r>
         <w:br/>
-        <w:t xml:space="preserve"> 20 C1 R12 zone_open(zone_a)                       73 C4 R14 suitable_space(sara, s_a2)</w:t>
+        <w:t xml:space="preserve"> 20 C1 R12 zone_open(zone_e)                       73 C4 R14 suitable_space(bilal, s_v1)</w:t>
       </w:r>
       <w:r>
         <w:br/>
-        <w:t xml:space="preserve"> 21 C1 R12 zone_open(zone_e)                       74 C5 R14 suitable_space(ahmed, s_e2)</w:t>
+        <w:t xml:space="preserve"> 21 C1 R12 zone_open(zone_a)                       74 C5 R14 suitable_space(ahmed, s_e1)</w:t>
       </w:r>
       <w:r>
         <w:br/>
-        <w:t xml:space="preserve"> 22 C1 R12 zone_open(zone_v)                       75 C5 R14 suitable_space(ahmed, s_e3)</w:t>
+        <w:t xml:space="preserve"> 22 C1 R12 zone_open(zone_v)                       75 C5 R14 suitable_space(ahmed, s_e2)</w:t>
       </w:r>
       <w:r>
         <w:br/>
-        <w:t xml:space="preserve"> 23 C1 R17 space_free(s_a4)                        76 C5 R14 suitable_space(ahmed, s_e1)</w:t>
+        <w:t xml:space="preserve"> 23 C1 R17 space_free(s_a1)                        76 C5 R14 suitable_space(ahmed, s_e3)</w:t>
       </w:r>
       <w:r>
         <w:br/>
       </w:r>
       <w:r>
-        <w:t xml:space="preserve"> 24 C1 R17 space_free(s_a1)                        77 C5 R15 eligible_for_space(sara, s_a1)</w:t>
+        <w:t xml:space="preserve"> 24 C1 R17 space_free(s_a3)                        77 C5 R15 eligible_for_space(ali, s_a5)</w:t>
       </w:r>
       <w:r>
         <w:br/>
-        <w:t xml:space="preserve"> 25 C1 R17 space_free(s_e1)                        78 C5 R15 eligible_for_space(ali, s_a1)</w:t>
+        <w:t xml:space="preserve"> 25 C1 R17 space_free(s_a4)                        78 C5 R15 eligible_for_space(sara, s_a5)</w:t>
       </w:r>
       <w:r>
         <w:br/>
@@ -37661,65 +37661,65 @@
       </w:r>
       <w:r>
         <w:br/>
-        <w:t xml:space="preserve"> 27 C1 R17 space_free(s_a3)                        80 C5 R15 eligible_for_space(sara, s_a5)</w:t>
+        <w:t xml:space="preserve"> 27 C1 R17 space_free(s_v1)                        80 C5 R15 eligible_for_space(ali, s_a1)</w:t>
       </w:r>
       <w:r>
         <w:br/>
-        <w:t xml:space="preserve"> 28 C1 R17 space_free(s_v1)                        81 C5 R15 eligible_for_space(sara, s_a2)</w:t>
+        <w:t xml:space="preserve"> 28 C1 R17 space_free(s_e1)                        81 C5 R15 eligible_for_space(ali, s_a2)</w:t>
       </w:r>
       <w:r>
         <w:br/>
       </w:r>
       <w:r>
-        <w:t xml:space="preserve"> 29 C1 R18 holds_reservation(ahmed, s_e3)          82 C5 R15 eligible_for_space(zara, s_a5)</w:t>
+        <w:t xml:space="preserve"> 29 C1 R18 holds_reservation(zara, s_a5)           82 C5 R15 eligible_for_space(sara, s_a2)</w:t>
       </w:r>
       <w:r>
         <w:br/>
-        <w:t xml:space="preserve"> 30 C1 R18 holds_reservation(zara, s_a5)           83 C5 R15 eligible_for_space(ali, s_a5)</w:t>
+        <w:t xml:space="preserve"> 30 C1 R18 holds_reservation(ahmed, s_e3)          83 C5 R15 eligible_for_space(bilal, s_v1)</w:t>
       </w:r>
       <w:r>
         <w:br/>
-        <w:t xml:space="preserve"> 31 C1 R23 priority(ali, 1)                        84 C5 R15 eligible_for_space(ali, s_a2)</w:t>
+        <w:t xml:space="preserve"> 31 C1 R23 priority(zara, 1)                       84 C5 R15 eligible_for_space(zara, s_a1)</w:t>
       </w:r>
       <w:r>
         <w:br/>
-        <w:t xml:space="preserve"> 32 C1 R23 priority(usman, 1)                      85 C5 R15 eligible_for_space(bilal, s_v1)</w:t>
+        <w:t xml:space="preserve"> 32 C1 R23 priority(usman, 1)                      85 C5 R15 eligible_for_space(zara, s_a5)</w:t>
       </w:r>
       <w:r>
         <w:br/>
-        <w:t xml:space="preserve"> 33 C1 R23 priority(zara, 1)                       86 C5 R15 eligible_for_space(zara, s_a1)</w:t>
+        <w:t xml:space="preserve"> 33 C1 R23 priority(ali, 1)                        86 C5 R15 eligible_for_space(sara, s_a1)</w:t>
       </w:r>
       <w:r>
         <w:br/>
       </w:r>
       <w:r>
-        <w:t xml:space="preserve"> 34 C1 R24 priority(hina, 1)                       87 C5 R16 eligible_for_space(sara, s_a3)</w:t>
+        <w:t xml:space="preserve"> 34 C1 R24 priority(bilal, 1)                      87 C5 R16 eligible_for_space(sara, s_a3)</w:t>
       </w:r>
       <w:r>
         <w:br/>
-        <w:t xml:space="preserve"> 35 C1 R24 priority(bilal, 1)                      88 C6 R15 eligible_for_space(ahmed, s_e3)</w:t>
+        <w:t xml:space="preserve"> 35 C1 R24 priority(hina, 1)                       88 C6 R15 eligible_for_space(ahmed, s_e1)</w:t>
       </w:r>
       <w:r>
         <w:br/>
-        <w:t xml:space="preserve"> 36 C2 R02 person(ahmed)                           89 C6 R15 eligible_for_space(ahmed, s_e1)</w:t>
+        <w:t xml:space="preserve"> 36 C2 R02 person(ahmed)                           89 C6 R15 eligible_for_space(ahmed, s_e2)</w:t>
       </w:r>
       <w:r>
         <w:br/>
-        <w:t xml:space="preserve"> 37 C2 R02 person(fatima)                          90 C6 R15 eligible_for_space(ahmed, s_e2)</w:t>
+        <w:t xml:space="preserve"> 37 C2 R02 person(fatima)                          90 C6 R15 eligible_for_space(ahmed, s_e3)</w:t>
       </w:r>
       <w:r>
         <w:br/>
-        <w:t xml:space="preserve"> 38 C2 R08 permit_matches_role(ahmed, p_ahmed)     91 C6 R19 can_allocate(sara, s_a3)</w:t>
+        <w:t xml:space="preserve"> 38 C2 R08 permit_matches_role(fatima, p_fatima)   91 C6 R19 can_allocate(bilal, s_v1)</w:t>
       </w:r>
       <w:r>
         <w:br/>
       </w:r>
       <w:r>
-        <w:t xml:space="preserve"> 39 C2 R08 permit_matches_role(fatima, p_fatima)   92 C6 R19 can_allocate(sara, s_a1)</w:t>
+        <w:t xml:space="preserve"> 39 C2 R08 permit_matches_role(ahmed, p_ahmed)     92 C6 R19 can_allocate(ali, s_a1)</w:t>
       </w:r>
       <w:r>
         <w:br/>
-        <w:t xml:space="preserve"> 40 C2 R10 authorized(sara, p_sara)                93 C6 R19 can_allocate(bilal, s_v1)</w:t>
+        <w:t xml:space="preserve"> 40 C2 R10 authorized(sara, p_sara)                93 C6 R19 can_allocate(sara, s_a3)</w:t>
       </w:r>
       <w:r>
         <w:br/>
@@ -37727,11 +37727,11 @@
       </w:r>
       <w:r>
         <w:br/>
-        <w:t xml:space="preserve"> 42 C2 R10 authorized(zara, p_zara)                95 C6 R19 can_allocate(ali, s_a1)</w:t>
+        <w:t xml:space="preserve"> 42 C2 R10 authorized(bilal, vp_bilal)             95 C6 R19 can_allocate(sara, s_a1)</w:t>
       </w:r>
       <w:r>
         <w:br/>
-        <w:t xml:space="preserve"> 43 C2 R10 authorized(bilal, vp_bilal)             96 C6 R20 can_allocate(zara, s_a5)</w:t>
+        <w:t xml:space="preserve"> 43 C2 R10 authorized(zara, p_zara)                96 C6 R20 can_allocate(zara, s_a5)</w:t>
       </w:r>
       <w:r>
         <w:br/>
@@ -37749,43 +37749,43 @@
       </w:r>
       <w:r>
         <w:br/>
-        <w:t xml:space="preserve"> 47 C3 R10 authorized(fatima, p_fatima)           100 C7 R25 loses(zara, s_a1)</w:t>
+        <w:t xml:space="preserve"> 47 C3 R10 authorized(fatima, p_fatima)           100 C7 R25 loses(usman, s_a1)</w:t>
       </w:r>
       <w:r>
         <w:br/>
-        <w:t xml:space="preserve"> 48 C3 R10 authorized(ahmed, p_ahmed)             101 C7 R25 loses(ali, s_a1)</w:t>
+        <w:t xml:space="preserve"> 48 C3 R10 authorized(ahmed, p_ahmed)             101 C7 R25 loses(zara, s_a1)</w:t>
       </w:r>
       <w:r>
         <w:br/>
       </w:r>
       <w:r>
         <w:lastRenderedPageBreak/>
-        <w:t xml:space="preserve"> 49 C3 R11 authorized_driver(sara)                102 C7 R25 loses(usman, s_a1)</w:t>
+        <w:t xml:space="preserve"> 49 C3 R11 authorized_driver(bilal)               102 C7 R25 loses(ali, s_a1)</w:t>
       </w:r>
       <w:r>
         <w:br/>
       </w:r>
       <w:r>
-        <w:t xml:space="preserve"> 50 C3 R11 authorized_driver(ali)                 103 C9 R28 allocate(bilal, s_v1)</w:t>
+        <w:t xml:space="preserve"> 50 C3 R11 authorized_driver(zara)                103 C9 R28 allocate(ahmed, s_e3)</w:t>
       </w:r>
       <w:r>
         <w:br/>
-        <w:t xml:space="preserve"> 51 C3 R11 authorized_driver(zara)                104 C9 R28 allocate(sara, s_a1)</w:t>
+        <w:t xml:space="preserve"> 51 C3 R11 authorized_driver(sara)                104 C9 R28 allocate(sara, s_a1)</w:t>
       </w:r>
       <w:r>
         <w:br/>
-        <w:t xml:space="preserve"> 52 C3 R11 authorized_driver(bilal)               105 C9 R28 allocate(ahmed, s_e3)</w:t>
+        <w:t xml:space="preserve"> 52 C3 R11 authorized_driver(ali)                 105 C9 R28 allocate(bilal, s_v1)</w:t>
       </w:r>
       <w:r>
         <w:br/>
-        <w:t xml:space="preserve"> 53 C3 R13 zone_access(sara, zone_a)</w:t>
+        <w:t xml:space="preserve"> 53 C3 R13 zone_access(bilal, zone_v)</w:t>
       </w:r>
     </w:p>
     <w:p>
       <w:pPr>
         <w:pStyle w:val="Heading1"/>
       </w:pPr>
-      <w:bookmarkStart w:id="131" w:name="_Toc242028311"/>
+      <w:bookmarkStart w:id="131" w:name="_Toc242031045"/>
       <w:r>
         <w:t>Appendix D: Backward chaining traces</w:t>
       </w:r>
@@ -38038,7 +38038,7 @@
       <w:pPr>
         <w:pStyle w:val="Heading1"/>
       </w:pPr>
-      <w:bookmarkStart w:id="132" w:name="_Toc242028312"/>
+      <w:bookmarkStart w:id="132" w:name="_Toc242031046"/>
       <w:r>
         <w:t>Appendix E: Important source code</w:t>
       </w:r>
@@ -38132,7 +38132,7 @@
       <w:pPr>
         <w:pStyle w:val="Heading1"/>
       </w:pPr>
-      <w:bookmarkStart w:id="133" w:name="_Toc242028313"/>
+      <w:bookmarkStart w:id="133" w:name="_Toc242031047"/>
       <w:r>
         <w:t>Appendix F: Execution screenshots</w:t>
       </w:r>
@@ -38154,7 +38154,7 @@
           <w:noProof/>
         </w:rPr>
         <w:drawing>
-          <wp:inline distT="0" distB="0" distL="0" distR="0" wp14:anchorId="4F4E02CD" wp14:editId="7ECE4018">
+          <wp:inline distT="0" distB="0" distL="0" distR="0" wp14:anchorId="09F3B5D4" wp14:editId="65933CA3">
             <wp:extent cx="5579902" cy="2504262"/>
             <wp:effectExtent l="0" t="0" r="0" b="0"/>
             <wp:docPr id="7" name="Picture 7"/>
@@ -38196,7 +38196,7 @@
         <w:spacing w:before="80" w:after="160"/>
         <w:jc w:val="center"/>
       </w:pPr>
-      <w:bookmarkStart w:id="134" w:name="_Toc242028073"/>
+      <w:bookmarkStart w:id="134" w:name="_Toc242030807"/>
       <w:r>
         <w:t xml:space="preserve">Figure </w:t>
       </w:r>
@@ -38234,7 +38234,7 @@
           <w:noProof/>
         </w:rPr>
         <w:drawing>
-          <wp:inline distT="0" distB="0" distL="0" distR="0" wp14:anchorId="497DDFD0" wp14:editId="7D001B94">
+          <wp:inline distT="0" distB="0" distL="0" distR="0" wp14:anchorId="5C8A2303" wp14:editId="3A6E1636">
             <wp:extent cx="5579902" cy="2948304"/>
             <wp:effectExtent l="0" t="0" r="0" b="0"/>
             <wp:docPr id="8" name="Picture 8"/>
@@ -38276,7 +38276,7 @@
         <w:spacing w:before="80" w:after="160"/>
         <w:jc w:val="center"/>
       </w:pPr>
-      <w:bookmarkStart w:id="135" w:name="_Toc242028074"/>
+      <w:bookmarkStart w:id="135" w:name="_Toc242030808"/>
       <w:r>
         <w:t xml:space="preserve">Figure </w:t>
       </w:r>
@@ -38315,7 +38315,7 @@
         </w:rPr>
         <w:lastRenderedPageBreak/>
         <w:drawing>
-          <wp:inline distT="0" distB="0" distL="0" distR="0" wp14:anchorId="082F07FC" wp14:editId="0F5214E8">
+          <wp:inline distT="0" distB="0" distL="0" distR="0" wp14:anchorId="2C56F394" wp14:editId="1ECB4611">
             <wp:extent cx="5579902" cy="2736078"/>
             <wp:effectExtent l="0" t="0" r="0" b="0"/>
             <wp:docPr id="9" name="Picture 9"/>
@@ -38357,7 +38357,7 @@
         <w:spacing w:before="80" w:after="160"/>
         <w:jc w:val="center"/>
       </w:pPr>
-      <w:bookmarkStart w:id="136" w:name="_Toc242028075"/>
+      <w:bookmarkStart w:id="136" w:name="_Toc242030809"/>
       <w:r>
         <w:t xml:space="preserve">Figure </w:t>
       </w:r>
@@ -38395,7 +38395,7 @@
           <w:noProof/>
         </w:rPr>
         <w:drawing>
-          <wp:inline distT="0" distB="0" distL="0" distR="0" wp14:anchorId="5AF8D143" wp14:editId="1680CE09">
+          <wp:inline distT="0" distB="0" distL="0" distR="0" wp14:anchorId="774BB0B8" wp14:editId="2DC78C0A">
             <wp:extent cx="5579902" cy="2971159"/>
             <wp:effectExtent l="0" t="0" r="0" b="0"/>
             <wp:docPr id="10" name="Picture 10"/>
@@ -38437,7 +38437,7 @@
         <w:spacing w:before="80" w:after="160"/>
         <w:jc w:val="center"/>
       </w:pPr>
-      <w:bookmarkStart w:id="137" w:name="_Toc242028076"/>
+      <w:bookmarkStart w:id="137" w:name="_Toc242030810"/>
       <w:r>
         <w:t xml:space="preserve">Figure </w:t>
       </w:r>
@@ -38476,7 +38476,7 @@
         </w:rPr>
         <w:lastRenderedPageBreak/>
         <w:drawing>
-          <wp:inline distT="0" distB="0" distL="0" distR="0" wp14:anchorId="666CE8D0" wp14:editId="7B2C6094">
+          <wp:inline distT="0" distB="0" distL="0" distR="0" wp14:anchorId="5B542596" wp14:editId="4632D00C">
             <wp:extent cx="5580097" cy="2399442"/>
             <wp:effectExtent l="0" t="0" r="0" b="0"/>
             <wp:docPr id="11" name="Picture 11"/>
@@ -38518,7 +38518,7 @@
         <w:spacing w:before="80" w:after="160"/>
         <w:jc w:val="center"/>
       </w:pPr>
-      <w:bookmarkStart w:id="138" w:name="_Toc242028077"/>
+      <w:bookmarkStart w:id="138" w:name="_Toc242030811"/>
       <w:r>
         <w:t xml:space="preserve">Figure </w:t>
       </w:r>
@@ -38556,7 +38556,7 @@
           <w:noProof/>
         </w:rPr>
         <w:drawing>
-          <wp:inline distT="0" distB="0" distL="0" distR="0" wp14:anchorId="708218FB" wp14:editId="4A0541E7">
+          <wp:inline distT="0" distB="0" distL="0" distR="0" wp14:anchorId="26642D0F" wp14:editId="6C2163F9">
             <wp:extent cx="5580097" cy="3470821"/>
             <wp:effectExtent l="0" t="0" r="0" b="0"/>
             <wp:docPr id="12" name="Picture 12"/>
@@ -38598,7 +38598,7 @@
         <w:spacing w:before="80" w:after="160"/>
         <w:jc w:val="center"/>
       </w:pPr>
-      <w:bookmarkStart w:id="139" w:name="_Toc242028078"/>
+      <w:bookmarkStart w:id="139" w:name="_Toc242030812"/>
       <w:r>
         <w:t xml:space="preserve">Figure </w:t>
       </w:r>
@@ -38629,7 +38629,7 @@
       <w:pPr>
         <w:pStyle w:val="Heading1"/>
       </w:pPr>
-      <w:bookmarkStart w:id="140" w:name="_Toc242028314"/>
+      <w:bookmarkStart w:id="140" w:name="_Toc242031048"/>
       <w:r>
         <w:t>Appendix G: Team participation evidence</w:t>
       </w:r>
@@ -38647,7 +38647,7 @@
         <w:spacing w:before="80"/>
         <w:jc w:val="center"/>
       </w:pPr>
-      <w:bookmarkStart w:id="141" w:name="_Toc242028104"/>
+      <w:bookmarkStart w:id="141" w:name="_Toc242030838"/>
       <w:r>
         <w:lastRenderedPageBreak/>
         <w:t xml:space="preserve">Table </w:t>
@@ -39154,7 +39154,7 @@
       <w:pPr>
         <w:pStyle w:val="Heading1"/>
       </w:pPr>
-      <w:bookmarkStart w:id="142" w:name="_Toc242028315"/>
+      <w:bookmarkStart w:id="142" w:name="_Toc242031049"/>
       <w:r>
         <w:t>CT-351 CCP final compliance checklist</w:t>
       </w:r>
@@ -39167,7 +39167,7 @@
         <w:spacing w:before="80"/>
         <w:jc w:val="center"/>
       </w:pPr>
-      <w:bookmarkStart w:id="143" w:name="_Toc242028105"/>
+      <w:bookmarkStart w:id="143" w:name="_Toc242030839"/>
       <w:r>
         <w:t xml:space="preserve">Table </w:t>
       </w:r>
@@ -40989,31 +40989,31 @@
       </w:rPr>
     </w:lvl>
   </w:abstractNum>
-  <w:num w:numId="1" w16cid:durableId="1645936968">
+  <w:num w:numId="1" w16cid:durableId="1046490894">
     <w:abstractNumId w:val="8"/>
   </w:num>
-  <w:num w:numId="2" w16cid:durableId="2076656514">
+  <w:num w:numId="2" w16cid:durableId="1478183353">
     <w:abstractNumId w:val="6"/>
   </w:num>
-  <w:num w:numId="3" w16cid:durableId="828599741">
+  <w:num w:numId="3" w16cid:durableId="1024206836">
     <w:abstractNumId w:val="5"/>
   </w:num>
-  <w:num w:numId="4" w16cid:durableId="1522629152">
+  <w:num w:numId="4" w16cid:durableId="681512354">
     <w:abstractNumId w:val="4"/>
   </w:num>
-  <w:num w:numId="5" w16cid:durableId="1197238227">
+  <w:num w:numId="5" w16cid:durableId="284164622">
     <w:abstractNumId w:val="7"/>
   </w:num>
-  <w:num w:numId="6" w16cid:durableId="390664592">
+  <w:num w:numId="6" w16cid:durableId="754283049">
     <w:abstractNumId w:val="3"/>
   </w:num>
-  <w:num w:numId="7" w16cid:durableId="1456488092">
+  <w:num w:numId="7" w16cid:durableId="1688096330">
     <w:abstractNumId w:val="2"/>
   </w:num>
-  <w:num w:numId="8" w16cid:durableId="1127351754">
+  <w:num w:numId="8" w16cid:durableId="788161118">
     <w:abstractNumId w:val="1"/>
   </w:num>
-  <w:num w:numId="9" w16cid:durableId="934558675">
+  <w:num w:numId="9" w16cid:durableId="1133986600">
     <w:abstractNumId w:val="0"/>
   </w:num>
 </w:numbering>
@@ -52435,7 +52435,7 @@
     <w:autoRedefine/>
     <w:uiPriority w:val="39"/>
     <w:unhideWhenUsed/>
-    <w:rsid w:val="002076A3"/>
+    <w:rsid w:val="009944DC"/>
     <w:pPr>
       <w:spacing w:after="0" w:line="240" w:lineRule="auto"/>
     </w:pPr>
@@ -52451,7 +52451,7 @@
     <w:autoRedefine/>
     <w:uiPriority w:val="39"/>
     <w:unhideWhenUsed/>
-    <w:rsid w:val="002076A3"/>
+    <w:rsid w:val="009944DC"/>
     <w:pPr>
       <w:spacing w:after="0" w:line="240" w:lineRule="auto"/>
       <w:ind w:left="210"/>
@@ -52468,7 +52468,7 @@
     <w:autoRedefine/>
     <w:uiPriority w:val="39"/>
     <w:unhideWhenUsed/>
-    <w:rsid w:val="002076A3"/>
+    <w:rsid w:val="009944DC"/>
     <w:pPr>
       <w:spacing w:after="100" w:line="278" w:lineRule="auto"/>
       <w:ind w:left="480"/>
@@ -52489,7 +52489,7 @@
     <w:autoRedefine/>
     <w:uiPriority w:val="39"/>
     <w:unhideWhenUsed/>
-    <w:rsid w:val="002076A3"/>
+    <w:rsid w:val="009944DC"/>
     <w:pPr>
       <w:spacing w:after="100" w:line="278" w:lineRule="auto"/>
       <w:ind w:left="720"/>
@@ -52510,7 +52510,7 @@
     <w:autoRedefine/>
     <w:uiPriority w:val="39"/>
     <w:unhideWhenUsed/>
-    <w:rsid w:val="002076A3"/>
+    <w:rsid w:val="009944DC"/>
     <w:pPr>
       <w:spacing w:after="100" w:line="278" w:lineRule="auto"/>
       <w:ind w:left="960"/>
@@ -52531,7 +52531,7 @@
     <w:autoRedefine/>
     <w:uiPriority w:val="39"/>
     <w:unhideWhenUsed/>
-    <w:rsid w:val="002076A3"/>
+    <w:rsid w:val="009944DC"/>
     <w:pPr>
       <w:spacing w:after="100" w:line="278" w:lineRule="auto"/>
       <w:ind w:left="1200"/>
@@ -52552,7 +52552,7 @@
     <w:autoRedefine/>
     <w:uiPriority w:val="39"/>
     <w:unhideWhenUsed/>
-    <w:rsid w:val="002076A3"/>
+    <w:rsid w:val="009944DC"/>
     <w:pPr>
       <w:spacing w:after="100" w:line="278" w:lineRule="auto"/>
       <w:ind w:left="1440"/>
@@ -52573,7 +52573,7 @@
     <w:autoRedefine/>
     <w:uiPriority w:val="39"/>
     <w:unhideWhenUsed/>
-    <w:rsid w:val="002076A3"/>
+    <w:rsid w:val="009944DC"/>
     <w:pPr>
       <w:spacing w:after="100" w:line="278" w:lineRule="auto"/>
       <w:ind w:left="1680"/>
@@ -52594,7 +52594,7 @@
     <w:autoRedefine/>
     <w:uiPriority w:val="39"/>
     <w:unhideWhenUsed/>
-    <w:rsid w:val="002076A3"/>
+    <w:rsid w:val="009944DC"/>
     <w:pPr>
       <w:spacing w:after="100" w:line="278" w:lineRule="auto"/>
       <w:ind w:left="1920"/>
@@ -52613,7 +52613,7 @@
     <w:basedOn w:val="DefaultParagraphFont"/>
     <w:uiPriority w:val="99"/>
     <w:unhideWhenUsed/>
-    <w:rsid w:val="002076A3"/>
+    <w:rsid w:val="009944DC"/>
     <w:rPr>
       <w:color w:val="0000FF" w:themeColor="hyperlink"/>
       <w:u w:val="single"/>
@@ -52625,7 +52625,7 @@
     <w:uiPriority w:val="99"/>
     <w:semiHidden/>
     <w:unhideWhenUsed/>
-    <w:rsid w:val="002076A3"/>
+    <w:rsid w:val="009944DC"/>
     <w:rPr>
       <w:color w:val="605E5C"/>
       <w:shd w:val="clear" w:color="auto" w:fill="E1DFDD"/>
@@ -52637,7 +52637,7 @@
     <w:next w:val="Normal"/>
     <w:uiPriority w:val="99"/>
     <w:unhideWhenUsed/>
-    <w:rsid w:val="002076A3"/>
+    <w:rsid w:val="009944DC"/>
     <w:pPr>
       <w:spacing w:after="0" w:line="240" w:lineRule="auto"/>
     </w:pPr>

</xml_diff>